<commit_message>
Add the external SMS evaluation to the manuscript
</commit_message>
<xml_diff>
--- a/paper/SMS_Spam_Detection_Paper.docx
+++ b/paper/SMS_Spam_Detection_Paper.docx
@@ -7,7 +7,7 @@
         <w:pStyle w:val="Title"/>
       </w:pPr>
       <w:r>
-        <w:t>SMS Spam Detection with Grouped Evaluation and Character Obfuscation</w:t>
+        <w:t>SMS Spam Detection with Grouped and External Evaluation</w:t>
       </w:r>
     </w:p>
     <w:p>
@@ -27,12 +27,12 @@
     </w:p>
     <w:p>
       <w:r>
-        <w:t>This study evaluates eleven sparse text classifiers on the historical English SMS Spam Collection, with explicit separation of model search, threshold selection and final testing. Exact deduplication leaves 5,171 messages. Case and whitespace groups are kept together in train, validation and test partitions and in five training cross-validation folds. The selected word TF-IDF LinearSVC achieves spam F1 0.9531, with four false positives and eight false negatives among 1,034 test messages. Its conditional 95% group-bootstrap F1 interval is 0.9249 to 0.9769. At obfuscation intensity 0.3, mean spam recall falls from 0.9385 to 0.6035 for separator insertion. Character features preserve more recall in these tests but can incur more false positives. An exploratory split using URL and digit templates selects a different model and exposes a worse tradeoff after threshold tuning. These results support a reproducible historical benchmark and a controlled sensitivity study; they do not establish performance on current SMS, new languages or adaptive attacks.</w:t>
+        <w:t>This study evaluates eleven sparse text classifiers on the historical English SMS Spam Collection, separating training search, validation threshold selection and final testing. Deduplication leaves 5,171 messages, with normalized groups kept together in holdouts and training folds. The selected word TF-IDF LinearSVC achieves spam F1 0.9531, with four false positives and eight false negatives among 1,034 test messages. Its conditional 95% group-bootstrap F1 interval is 0.9249 to 0.9769. Separator insertion at intensity 0.3 lowers mean recall from 0.9385 to 0.6035. Character features retain more recall at operating points that can increase false positives. An exploratory template split qualifies the historical comparison. We then evaluate the unchanged artifact on independent published SMS reports under a protocol fixed before prediction. Among 372 distinct English texts with explicit 2023–2024 years, it detects 176 and misses 196: recall 47.31%, with a conditional 95% interval of 42.32% to 52.28%. The pseudonymized positive-only sample cannot estimate modern false-positive rate or F1. High historical quality therefore does not establish reliable transfer to reported smishing.</w:t>
       </w:r>
     </w:p>
     <w:p>
       <w:r>
-        <w:t>Keywords: SMS spam, TF-IDF, grouped evaluation, threshold selection, character obfuscation.</w:t>
+        <w:t>Keywords: SMS spam, TF-IDF, grouped evaluation, external evaluation, character obfuscation.</w:t>
       </w:r>
     </w:p>
     <w:p>
@@ -50,7 +50,7 @@
     </w:p>
     <w:p>
       <w:r>
-        <w:t>The contribution is an auditable comparison of representations and decision rules. All candidates share training folds and attack realizations. Model choice is frozen before test scoring, and a separate validation set chooses the operating threshold. A second grouping rule examines residual template overlap. Neither test set is used to repair a threshold or to replace the selected model after viewing its errors.</w:t>
+        <w:t>The contribution is an auditable comparison of representations and decision rules. Candidates share training folds and attack realizations. Model choice is frozen before test scoring, and validation chooses the threshold. A second grouping rule examines residual template overlap. An independent collection of reported SMS then tests transfer with the original model and threshold; these outcomes do not select or retrain the model.</w:t>
       </w:r>
     </w:p>
     <w:p>
@@ -63,7 +63,7 @@
     </w:p>
     <w:p>
       <w:r>
-        <w:t>The SMS Spam Collection accompanies Almeida, Hidalgo and Yamakami's benchmark research [1, 2]. Its mixed historical sources make it useful for reproducible experiments, while limiting claims about deployment today. Uddin et al. study transformer-based detection and explainability in ExplainableDetector [3]. Li et al.'s SpamDam addresses newer SMS collection, federated learning and adversarial evaluation [4]. COPS studies a compact on-device smishing and URL pipeline [5]. These works motivate broader data and deployment studies; their published metrics are not directly comparable to our deduplicated splits. We do not reproduce those systems or claim to outperform them.</w:t>
+        <w:t>The SMS Spam Collection accompanies Almeida, Hidalgo and Yamakami's benchmark research [1, 2]. Its historical sources limit deployment claims. ExplainableDetector studies transformer detection and explainability [3]; SpamDam investigates newer SMS, federated learning and adversaries [4]; COPS studies an on-device smishing and URL pipeline [5]. Their metrics are not directly comparable to our splits. Agarwal et al. release public smishing reports collected during 2017–2024 [9]. We use that independent artifact for a separate frozen-model evaluation, without claiming to reproduce or outperform those systems.</w:t>
       </w:r>
     </w:p>
     <w:p>
@@ -4552,17 +4552,17 @@
         <w:pStyle w:val="Heading1"/>
       </w:pPr>
       <w:r>
-        <w:t>9 Limitations and next evaluation</w:t>
+        <w:t>9 Scope of the historical experiments</w:t>
       </w:r>
     </w:p>
     <w:p>
       <w:r>
-        <w:t>Both protocols use one historical English corpus. Row order is not a timestamp, and the available text labels do not establish independent senders or campaigns [1]. Related messages may remain after either grouping rule. Performance on modern scams, Russian or Kazakh text, code-switching, email and URLs as separate objects remains unmeasured. A ham prediction does not establish that a link or sender is safe.</w:t>
+        <w:t>Both training protocols use one historical English corpus. Row order is not a timestamp, and the available labels do not establish independent senders or campaigns [1]. Related messages may remain after either grouping rule. Section 10 therefore tests the original model on a separate reported-SMS collection. Russian or Kazakh text, code-switching, email and URLs as separate objects remain unmeasured. A ham prediction does not establish that a link or sender is safe.</w:t>
       </w:r>
     </w:p>
     <w:p>
       <w:r>
-        <w:t>A stronger generalization study should first obtain independently labeled, licensed modern ham and spam, freeze the current model, and report errors by source, time and language before considering retraining. A new final holdout is needed for testing defenses designed after these attacks. Deployment also requires measurements of latency, memory, privacy behavior and the cost of false positives; sparse features alone do not establish on-device suitability.</w:t>
+        <w:t>The external sample has no legitimate messages, so independent modern ham and a new spam holdout are still needed to assess the full error tradeoff. Source/date annotations and representative sampling also matter. Any defense developed after inspecting the reported failures needs new final evaluation data. Deployment additionally requires measurements of latency, memory, privacy behavior and false-positive cost; sparse features alone do not establish on-device suitability.</w:t>
       </w:r>
     </w:p>
     <w:p>
@@ -4575,7 +4575,1071 @@
         <w:pStyle w:val="Heading1"/>
       </w:pPr>
       <w:r>
-        <w:t>10 Reproducibility and conclusion</w:t>
+        <w:t>10 External evaluation on reported SMS</w:t>
+      </w:r>
+    </w:p>
+    <w:p>
+      <w:r>
+        <w:t>We use the CC BY 4.0 author artifact from Fishing for Smishing [9], pinned at commit a6175560b57387199871e51fbef6bc523d2516b4. It contains 33,869 pseudonymized reports with publisher-supplied text and annotations, partly extracted using language models. We use original English text only. A 2025 release does not imply 2025 message dates. Requiring one explicit 2023 or 2024 year yields 488 rows, mostly 2023; normalized deduplication leaves 372 texts in 371 template groups. The supplementary cohort contains 15,531 distinct English texts across all/unknown years. Neither cohort matches the entire historical corpus under exact, normalized or template keys; paraphrase and campaign independence are not established.</w:t>
+      </w:r>
+    </w:p>
+    <w:p>
+      <w:r>
+        <w:t>Source, membership, artifact hash and decision rules were fixed before external prediction (repository PR #8). No fitting or threshold selection occurs. All inputs, including OOV messages, remain in the denominator. Table 5 uses the published pseudonymized text; the two overlapping cohorts are not independent replications.</w:t>
+      </w:r>
+    </w:p>
+    <w:p>
+      <w:pPr>
+        <w:pStyle w:val="Caption"/>
+        <w:keepNext/>
+      </w:pPr>
+      <w:r>
+        <w:t>Table 5. Frozen model on positive reports. No external F1, precision, accuracy or FPR estimate.</w:t>
+      </w:r>
+    </w:p>
+    <w:tbl>
+      <w:tblPr>
+        <w:tblW w:type="auto" w:w="0"/>
+        <w:jc w:val="center"/>
+        <w:tblLayout w:type="fixed"/>
+        <w:tblLook w:firstColumn="1" w:firstRow="1" w:lastColumn="0" w:lastRow="0" w:noHBand="0" w:noVBand="1" w:val="04A0"/>
+      </w:tblPr>
+      <w:tblGrid>
+        <w:gridCol w:w="1440"/>
+        <w:gridCol w:w="1296"/>
+        <w:gridCol w:w="2088"/>
+        <w:gridCol w:w="1008"/>
+        <w:gridCol w:w="1152"/>
+        <w:gridCol w:w="3096"/>
+      </w:tblGrid>
+      <w:tr>
+        <w:trPr>
+          <w:tblHeader/>
+          <w:cantSplit/>
+        </w:trPr>
+        <w:tc>
+          <w:tcPr>
+            <w:tcW w:type="dxa" w:w="1440"/>
+            <w:vAlign w:val="center"/>
+            <w:tcBorders>
+              <w:top w:val="single" w:sz="4" w:color="D9D9D9"/>
+              <w:left w:val="single" w:sz="4" w:color="D9D9D9"/>
+              <w:bottom w:val="single" w:sz="4" w:color="D9D9D9"/>
+              <w:right w:val="single" w:sz="4" w:color="D9D9D9"/>
+            </w:tcBorders>
+            <w:tcMar>
+              <w:top w:w="65" w:type="dxa"/>
+              <w:bottom w:w="65" w:type="dxa"/>
+              <w:left w:w="80" w:type="dxa"/>
+              <w:right w:w="80" w:type="dxa"/>
+            </w:tcMar>
+            <w:shd w:fill="EAEAEA"/>
+          </w:tcPr>
+          <w:p>
+            <w:pPr>
+              <w:spacing w:after="0" w:line="252" w:lineRule="auto"/>
+              <w:jc w:val="left"/>
+            </w:pPr>
+            <w:r>
+              <w:rPr>
+                <w:b/>
+                <w:sz w:val="19"/>
+              </w:rPr>
+              <w:t>Cohort</w:t>
+            </w:r>
+          </w:p>
+        </w:tc>
+        <w:tc>
+          <w:tcPr>
+            <w:tcW w:type="dxa" w:w="1296"/>
+            <w:vAlign w:val="center"/>
+            <w:tcBorders>
+              <w:top w:val="single" w:sz="4" w:color="D9D9D9"/>
+              <w:left w:val="single" w:sz="4" w:color="D9D9D9"/>
+              <w:bottom w:val="single" w:sz="4" w:color="D9D9D9"/>
+              <w:right w:val="single" w:sz="4" w:color="D9D9D9"/>
+            </w:tcBorders>
+            <w:tcMar>
+              <w:top w:w="65" w:type="dxa"/>
+              <w:bottom w:w="65" w:type="dxa"/>
+              <w:left w:w="80" w:type="dxa"/>
+              <w:right w:w="80" w:type="dxa"/>
+            </w:tcMar>
+            <w:shd w:fill="EAEAEA"/>
+          </w:tcPr>
+          <w:p>
+            <w:pPr>
+              <w:spacing w:after="0" w:line="252" w:lineRule="auto"/>
+              <w:jc w:val="center"/>
+            </w:pPr>
+            <w:r>
+              <w:rPr>
+                <w:b/>
+                <w:sz w:val="19"/>
+              </w:rPr>
+              <w:t>Decision</w:t>
+            </w:r>
+          </w:p>
+        </w:tc>
+        <w:tc>
+          <w:tcPr>
+            <w:tcW w:type="dxa" w:w="2088"/>
+            <w:vAlign w:val="center"/>
+            <w:tcBorders>
+              <w:top w:val="single" w:sz="4" w:color="D9D9D9"/>
+              <w:left w:val="single" w:sz="4" w:color="D9D9D9"/>
+              <w:bottom w:val="single" w:sz="4" w:color="D9D9D9"/>
+              <w:right w:val="single" w:sz="4" w:color="D9D9D9"/>
+            </w:tcBorders>
+            <w:tcMar>
+              <w:top w:w="65" w:type="dxa"/>
+              <w:bottom w:w="65" w:type="dxa"/>
+              <w:left w:w="80" w:type="dxa"/>
+              <w:right w:w="80" w:type="dxa"/>
+            </w:tcMar>
+            <w:shd w:fill="EAEAEA"/>
+          </w:tcPr>
+          <w:p>
+            <w:pPr>
+              <w:spacing w:after="0" w:line="252" w:lineRule="auto"/>
+              <w:jc w:val="center"/>
+            </w:pPr>
+            <w:r>
+              <w:rPr>
+                <w:b/>
+                <w:sz w:val="19"/>
+              </w:rPr>
+              <w:t>Detected / total</w:t>
+            </w:r>
+          </w:p>
+        </w:tc>
+        <w:tc>
+          <w:tcPr>
+            <w:tcW w:type="dxa" w:w="1008"/>
+            <w:vAlign w:val="center"/>
+            <w:tcBorders>
+              <w:top w:val="single" w:sz="4" w:color="D9D9D9"/>
+              <w:left w:val="single" w:sz="4" w:color="D9D9D9"/>
+              <w:bottom w:val="single" w:sz="4" w:color="D9D9D9"/>
+              <w:right w:val="single" w:sz="4" w:color="D9D9D9"/>
+            </w:tcBorders>
+            <w:tcMar>
+              <w:top w:w="65" w:type="dxa"/>
+              <w:bottom w:w="65" w:type="dxa"/>
+              <w:left w:w="80" w:type="dxa"/>
+              <w:right w:w="80" w:type="dxa"/>
+            </w:tcMar>
+            <w:shd w:fill="EAEAEA"/>
+          </w:tcPr>
+          <w:p>
+            <w:pPr>
+              <w:spacing w:after="0" w:line="252" w:lineRule="auto"/>
+              <w:jc w:val="center"/>
+            </w:pPr>
+            <w:r>
+              <w:rPr>
+                <w:b/>
+                <w:sz w:val="19"/>
+              </w:rPr>
+              <w:t>Missed</w:t>
+            </w:r>
+          </w:p>
+        </w:tc>
+        <w:tc>
+          <w:tcPr>
+            <w:tcW w:type="dxa" w:w="1152"/>
+            <w:vAlign w:val="center"/>
+            <w:tcBorders>
+              <w:top w:val="single" w:sz="4" w:color="D9D9D9"/>
+              <w:left w:val="single" w:sz="4" w:color="D9D9D9"/>
+              <w:bottom w:val="single" w:sz="4" w:color="D9D9D9"/>
+              <w:right w:val="single" w:sz="4" w:color="D9D9D9"/>
+            </w:tcBorders>
+            <w:tcMar>
+              <w:top w:w="65" w:type="dxa"/>
+              <w:bottom w:w="65" w:type="dxa"/>
+              <w:left w:w="80" w:type="dxa"/>
+              <w:right w:w="80" w:type="dxa"/>
+            </w:tcMar>
+            <w:shd w:fill="EAEAEA"/>
+          </w:tcPr>
+          <w:p>
+            <w:pPr>
+              <w:spacing w:after="0" w:line="252" w:lineRule="auto"/>
+              <w:jc w:val="center"/>
+            </w:pPr>
+            <w:r>
+              <w:rPr>
+                <w:b/>
+                <w:sz w:val="19"/>
+              </w:rPr>
+              <w:t>Recall</w:t>
+            </w:r>
+          </w:p>
+        </w:tc>
+        <w:tc>
+          <w:tcPr>
+            <w:tcW w:type="dxa" w:w="3096"/>
+            <w:vAlign w:val="center"/>
+            <w:tcBorders>
+              <w:top w:val="single" w:sz="4" w:color="D9D9D9"/>
+              <w:left w:val="single" w:sz="4" w:color="D9D9D9"/>
+              <w:bottom w:val="single" w:sz="4" w:color="D9D9D9"/>
+              <w:right w:val="single" w:sz="4" w:color="D9D9D9"/>
+            </w:tcBorders>
+            <w:tcMar>
+              <w:top w:w="65" w:type="dxa"/>
+              <w:bottom w:w="65" w:type="dxa"/>
+              <w:left w:w="80" w:type="dxa"/>
+              <w:right w:w="80" w:type="dxa"/>
+            </w:tcMar>
+            <w:shd w:fill="EAEAEA"/>
+          </w:tcPr>
+          <w:p>
+            <w:pPr>
+              <w:spacing w:after="0" w:line="252" w:lineRule="auto"/>
+              <w:jc w:val="center"/>
+            </w:pPr>
+            <w:r>
+              <w:rPr>
+                <w:b/>
+                <w:sz w:val="19"/>
+              </w:rPr>
+              <w:t>95% interval</w:t>
+            </w:r>
+          </w:p>
+        </w:tc>
+      </w:tr>
+      <w:tr>
+        <w:trPr>
+          <w:cantSplit/>
+        </w:trPr>
+        <w:tc>
+          <w:tcPr>
+            <w:tcW w:type="dxa" w:w="1440"/>
+            <w:vAlign w:val="center"/>
+            <w:tcBorders>
+              <w:top w:val="single" w:sz="4" w:color="D9D9D9"/>
+              <w:left w:val="single" w:sz="4" w:color="D9D9D9"/>
+              <w:bottom w:val="single" w:sz="4" w:color="D9D9D9"/>
+              <w:right w:val="single" w:sz="4" w:color="D9D9D9"/>
+            </w:tcBorders>
+            <w:tcMar>
+              <w:top w:w="65" w:type="dxa"/>
+              <w:bottom w:w="65" w:type="dxa"/>
+              <w:left w:w="80" w:type="dxa"/>
+              <w:right w:w="80" w:type="dxa"/>
+            </w:tcMar>
+          </w:tcPr>
+          <w:p>
+            <w:pPr>
+              <w:spacing w:after="0" w:line="252" w:lineRule="auto"/>
+              <w:jc w:val="left"/>
+            </w:pPr>
+            <w:r>
+              <w:rPr>
+                <w:b w:val="0"/>
+                <w:sz w:val="19"/>
+              </w:rPr>
+              <w:t>2023–2024</w:t>
+            </w:r>
+          </w:p>
+        </w:tc>
+        <w:tc>
+          <w:tcPr>
+            <w:tcW w:type="dxa" w:w="1296"/>
+            <w:vAlign w:val="center"/>
+            <w:tcBorders>
+              <w:top w:val="single" w:sz="4" w:color="D9D9D9"/>
+              <w:left w:val="single" w:sz="4" w:color="D9D9D9"/>
+              <w:bottom w:val="single" w:sz="4" w:color="D9D9D9"/>
+              <w:right w:val="single" w:sz="4" w:color="D9D9D9"/>
+            </w:tcBorders>
+            <w:tcMar>
+              <w:top w:w="65" w:type="dxa"/>
+              <w:bottom w:w="65" w:type="dxa"/>
+              <w:left w:w="80" w:type="dxa"/>
+              <w:right w:w="80" w:type="dxa"/>
+            </w:tcMar>
+          </w:tcPr>
+          <w:p>
+            <w:pPr>
+              <w:spacing w:after="0" w:line="252" w:lineRule="auto"/>
+              <w:jc w:val="center"/>
+            </w:pPr>
+            <w:r>
+              <w:rPr>
+                <w:b w:val="0"/>
+                <w:sz w:val="19"/>
+              </w:rPr>
+              <w:t>Validation</w:t>
+            </w:r>
+          </w:p>
+        </w:tc>
+        <w:tc>
+          <w:tcPr>
+            <w:tcW w:type="dxa" w:w="2088"/>
+            <w:vAlign w:val="center"/>
+            <w:tcBorders>
+              <w:top w:val="single" w:sz="4" w:color="D9D9D9"/>
+              <w:left w:val="single" w:sz="4" w:color="D9D9D9"/>
+              <w:bottom w:val="single" w:sz="4" w:color="D9D9D9"/>
+              <w:right w:val="single" w:sz="4" w:color="D9D9D9"/>
+            </w:tcBorders>
+            <w:tcMar>
+              <w:top w:w="65" w:type="dxa"/>
+              <w:bottom w:w="65" w:type="dxa"/>
+              <w:left w:w="80" w:type="dxa"/>
+              <w:right w:w="80" w:type="dxa"/>
+            </w:tcMar>
+          </w:tcPr>
+          <w:p>
+            <w:pPr>
+              <w:spacing w:after="0" w:line="252" w:lineRule="auto"/>
+              <w:jc w:val="center"/>
+            </w:pPr>
+            <w:r>
+              <w:rPr>
+                <w:b w:val="0"/>
+                <w:sz w:val="19"/>
+              </w:rPr>
+              <w:t>176 / 372</w:t>
+            </w:r>
+          </w:p>
+        </w:tc>
+        <w:tc>
+          <w:tcPr>
+            <w:tcW w:type="dxa" w:w="1008"/>
+            <w:vAlign w:val="center"/>
+            <w:tcBorders>
+              <w:top w:val="single" w:sz="4" w:color="D9D9D9"/>
+              <w:left w:val="single" w:sz="4" w:color="D9D9D9"/>
+              <w:bottom w:val="single" w:sz="4" w:color="D9D9D9"/>
+              <w:right w:val="single" w:sz="4" w:color="D9D9D9"/>
+            </w:tcBorders>
+            <w:tcMar>
+              <w:top w:w="65" w:type="dxa"/>
+              <w:bottom w:w="65" w:type="dxa"/>
+              <w:left w:w="80" w:type="dxa"/>
+              <w:right w:w="80" w:type="dxa"/>
+            </w:tcMar>
+          </w:tcPr>
+          <w:p>
+            <w:pPr>
+              <w:spacing w:after="0" w:line="252" w:lineRule="auto"/>
+              <w:jc w:val="center"/>
+            </w:pPr>
+            <w:r>
+              <w:rPr>
+                <w:b w:val="0"/>
+                <w:sz w:val="19"/>
+              </w:rPr>
+              <w:t>196</w:t>
+            </w:r>
+          </w:p>
+        </w:tc>
+        <w:tc>
+          <w:tcPr>
+            <w:tcW w:type="dxa" w:w="1152"/>
+            <w:vAlign w:val="center"/>
+            <w:tcBorders>
+              <w:top w:val="single" w:sz="4" w:color="D9D9D9"/>
+              <w:left w:val="single" w:sz="4" w:color="D9D9D9"/>
+              <w:bottom w:val="single" w:sz="4" w:color="D9D9D9"/>
+              <w:right w:val="single" w:sz="4" w:color="D9D9D9"/>
+            </w:tcBorders>
+            <w:tcMar>
+              <w:top w:w="65" w:type="dxa"/>
+              <w:bottom w:w="65" w:type="dxa"/>
+              <w:left w:w="80" w:type="dxa"/>
+              <w:right w:w="80" w:type="dxa"/>
+            </w:tcMar>
+          </w:tcPr>
+          <w:p>
+            <w:pPr>
+              <w:spacing w:after="0" w:line="252" w:lineRule="auto"/>
+              <w:jc w:val="center"/>
+            </w:pPr>
+            <w:r>
+              <w:rPr>
+                <w:b w:val="0"/>
+                <w:sz w:val="19"/>
+              </w:rPr>
+              <w:t>47.31%</w:t>
+            </w:r>
+          </w:p>
+        </w:tc>
+        <w:tc>
+          <w:tcPr>
+            <w:tcW w:type="dxa" w:w="3096"/>
+            <w:vAlign w:val="center"/>
+            <w:tcBorders>
+              <w:top w:val="single" w:sz="4" w:color="D9D9D9"/>
+              <w:left w:val="single" w:sz="4" w:color="D9D9D9"/>
+              <w:bottom w:val="single" w:sz="4" w:color="D9D9D9"/>
+              <w:right w:val="single" w:sz="4" w:color="D9D9D9"/>
+            </w:tcBorders>
+            <w:tcMar>
+              <w:top w:w="65" w:type="dxa"/>
+              <w:bottom w:w="65" w:type="dxa"/>
+              <w:left w:w="80" w:type="dxa"/>
+              <w:right w:w="80" w:type="dxa"/>
+            </w:tcMar>
+          </w:tcPr>
+          <w:p>
+            <w:pPr>
+              <w:spacing w:after="0" w:line="252" w:lineRule="auto"/>
+              <w:jc w:val="center"/>
+            </w:pPr>
+            <w:r>
+              <w:rPr>
+                <w:b w:val="0"/>
+                <w:sz w:val="19"/>
+              </w:rPr>
+              <w:t>42.32–52.28%</w:t>
+            </w:r>
+          </w:p>
+        </w:tc>
+      </w:tr>
+      <w:tr>
+        <w:trPr>
+          <w:cantSplit/>
+        </w:trPr>
+        <w:tc>
+          <w:tcPr>
+            <w:tcW w:type="dxa" w:w="1440"/>
+            <w:vAlign w:val="center"/>
+            <w:tcBorders>
+              <w:top w:val="single" w:sz="4" w:color="D9D9D9"/>
+              <w:left w:val="single" w:sz="4" w:color="D9D9D9"/>
+              <w:bottom w:val="single" w:sz="4" w:color="D9D9D9"/>
+              <w:right w:val="single" w:sz="4" w:color="D9D9D9"/>
+            </w:tcBorders>
+            <w:tcMar>
+              <w:top w:w="65" w:type="dxa"/>
+              <w:bottom w:w="65" w:type="dxa"/>
+              <w:left w:w="80" w:type="dxa"/>
+              <w:right w:w="80" w:type="dxa"/>
+            </w:tcMar>
+          </w:tcPr>
+          <w:p>
+            <w:pPr>
+              <w:spacing w:after="0" w:line="252" w:lineRule="auto"/>
+              <w:jc w:val="left"/>
+            </w:pPr>
+            <w:r>
+              <w:rPr>
+                <w:b w:val="0"/>
+                <w:sz w:val="19"/>
+              </w:rPr>
+              <w:t>2023–2024</w:t>
+            </w:r>
+          </w:p>
+        </w:tc>
+        <w:tc>
+          <w:tcPr>
+            <w:tcW w:type="dxa" w:w="1296"/>
+            <w:vAlign w:val="center"/>
+            <w:tcBorders>
+              <w:top w:val="single" w:sz="4" w:color="D9D9D9"/>
+              <w:left w:val="single" w:sz="4" w:color="D9D9D9"/>
+              <w:bottom w:val="single" w:sz="4" w:color="D9D9D9"/>
+              <w:right w:val="single" w:sz="4" w:color="D9D9D9"/>
+            </w:tcBorders>
+            <w:tcMar>
+              <w:top w:w="65" w:type="dxa"/>
+              <w:bottom w:w="65" w:type="dxa"/>
+              <w:left w:w="80" w:type="dxa"/>
+              <w:right w:w="80" w:type="dxa"/>
+            </w:tcMar>
+          </w:tcPr>
+          <w:p>
+            <w:pPr>
+              <w:spacing w:after="0" w:line="252" w:lineRule="auto"/>
+              <w:jc w:val="center"/>
+            </w:pPr>
+            <w:r>
+              <w:rPr>
+                <w:b w:val="0"/>
+                <w:sz w:val="19"/>
+              </w:rPr>
+              <w:t>Native</w:t>
+            </w:r>
+          </w:p>
+        </w:tc>
+        <w:tc>
+          <w:tcPr>
+            <w:tcW w:type="dxa" w:w="2088"/>
+            <w:vAlign w:val="center"/>
+            <w:tcBorders>
+              <w:top w:val="single" w:sz="4" w:color="D9D9D9"/>
+              <w:left w:val="single" w:sz="4" w:color="D9D9D9"/>
+              <w:bottom w:val="single" w:sz="4" w:color="D9D9D9"/>
+              <w:right w:val="single" w:sz="4" w:color="D9D9D9"/>
+            </w:tcBorders>
+            <w:tcMar>
+              <w:top w:w="65" w:type="dxa"/>
+              <w:bottom w:w="65" w:type="dxa"/>
+              <w:left w:w="80" w:type="dxa"/>
+              <w:right w:w="80" w:type="dxa"/>
+            </w:tcMar>
+          </w:tcPr>
+          <w:p>
+            <w:pPr>
+              <w:spacing w:after="0" w:line="252" w:lineRule="auto"/>
+              <w:jc w:val="center"/>
+            </w:pPr>
+            <w:r>
+              <w:rPr>
+                <w:b w:val="0"/>
+                <w:sz w:val="19"/>
+              </w:rPr>
+              <w:t>145 / 372</w:t>
+            </w:r>
+          </w:p>
+        </w:tc>
+        <w:tc>
+          <w:tcPr>
+            <w:tcW w:type="dxa" w:w="1008"/>
+            <w:vAlign w:val="center"/>
+            <w:tcBorders>
+              <w:top w:val="single" w:sz="4" w:color="D9D9D9"/>
+              <w:left w:val="single" w:sz="4" w:color="D9D9D9"/>
+              <w:bottom w:val="single" w:sz="4" w:color="D9D9D9"/>
+              <w:right w:val="single" w:sz="4" w:color="D9D9D9"/>
+            </w:tcBorders>
+            <w:tcMar>
+              <w:top w:w="65" w:type="dxa"/>
+              <w:bottom w:w="65" w:type="dxa"/>
+              <w:left w:w="80" w:type="dxa"/>
+              <w:right w:w="80" w:type="dxa"/>
+            </w:tcMar>
+          </w:tcPr>
+          <w:p>
+            <w:pPr>
+              <w:spacing w:after="0" w:line="252" w:lineRule="auto"/>
+              <w:jc w:val="center"/>
+            </w:pPr>
+            <w:r>
+              <w:rPr>
+                <w:b w:val="0"/>
+                <w:sz w:val="19"/>
+              </w:rPr>
+              <w:t>227</w:t>
+            </w:r>
+          </w:p>
+        </w:tc>
+        <w:tc>
+          <w:tcPr>
+            <w:tcW w:type="dxa" w:w="1152"/>
+            <w:vAlign w:val="center"/>
+            <w:tcBorders>
+              <w:top w:val="single" w:sz="4" w:color="D9D9D9"/>
+              <w:left w:val="single" w:sz="4" w:color="D9D9D9"/>
+              <w:bottom w:val="single" w:sz="4" w:color="D9D9D9"/>
+              <w:right w:val="single" w:sz="4" w:color="D9D9D9"/>
+            </w:tcBorders>
+            <w:tcMar>
+              <w:top w:w="65" w:type="dxa"/>
+              <w:bottom w:w="65" w:type="dxa"/>
+              <w:left w:w="80" w:type="dxa"/>
+              <w:right w:w="80" w:type="dxa"/>
+            </w:tcMar>
+          </w:tcPr>
+          <w:p>
+            <w:pPr>
+              <w:spacing w:after="0" w:line="252" w:lineRule="auto"/>
+              <w:jc w:val="center"/>
+            </w:pPr>
+            <w:r>
+              <w:rPr>
+                <w:b w:val="0"/>
+                <w:sz w:val="19"/>
+              </w:rPr>
+              <w:t>38.98%</w:t>
+            </w:r>
+          </w:p>
+        </w:tc>
+        <w:tc>
+          <w:tcPr>
+            <w:tcW w:type="dxa" w:w="3096"/>
+            <w:vAlign w:val="center"/>
+            <w:tcBorders>
+              <w:top w:val="single" w:sz="4" w:color="D9D9D9"/>
+              <w:left w:val="single" w:sz="4" w:color="D9D9D9"/>
+              <w:bottom w:val="single" w:sz="4" w:color="D9D9D9"/>
+              <w:right w:val="single" w:sz="4" w:color="D9D9D9"/>
+            </w:tcBorders>
+            <w:tcMar>
+              <w:top w:w="65" w:type="dxa"/>
+              <w:bottom w:w="65" w:type="dxa"/>
+              <w:left w:w="80" w:type="dxa"/>
+              <w:right w:w="80" w:type="dxa"/>
+            </w:tcMar>
+          </w:tcPr>
+          <w:p>
+            <w:pPr>
+              <w:spacing w:after="0" w:line="252" w:lineRule="auto"/>
+              <w:jc w:val="center"/>
+            </w:pPr>
+            <w:r>
+              <w:rPr>
+                <w:b w:val="0"/>
+                <w:sz w:val="19"/>
+              </w:rPr>
+              <w:t>33.96–43.97%</w:t>
+            </w:r>
+          </w:p>
+        </w:tc>
+      </w:tr>
+      <w:tr>
+        <w:trPr>
+          <w:cantSplit/>
+        </w:trPr>
+        <w:tc>
+          <w:tcPr>
+            <w:tcW w:type="dxa" w:w="1440"/>
+            <w:vAlign w:val="center"/>
+            <w:tcBorders>
+              <w:top w:val="single" w:sz="4" w:color="D9D9D9"/>
+              <w:left w:val="single" w:sz="4" w:color="D9D9D9"/>
+              <w:bottom w:val="single" w:sz="4" w:color="D9D9D9"/>
+              <w:right w:val="single" w:sz="4" w:color="D9D9D9"/>
+            </w:tcBorders>
+            <w:tcMar>
+              <w:top w:w="65" w:type="dxa"/>
+              <w:bottom w:w="65" w:type="dxa"/>
+              <w:left w:w="80" w:type="dxa"/>
+              <w:right w:w="80" w:type="dxa"/>
+            </w:tcMar>
+          </w:tcPr>
+          <w:p>
+            <w:pPr>
+              <w:spacing w:after="0" w:line="252" w:lineRule="auto"/>
+              <w:jc w:val="left"/>
+            </w:pPr>
+            <w:r>
+              <w:rPr>
+                <w:b w:val="0"/>
+                <w:sz w:val="19"/>
+              </w:rPr>
+              <w:t>All English</w:t>
+            </w:r>
+          </w:p>
+        </w:tc>
+        <w:tc>
+          <w:tcPr>
+            <w:tcW w:type="dxa" w:w="1296"/>
+            <w:vAlign w:val="center"/>
+            <w:tcBorders>
+              <w:top w:val="single" w:sz="4" w:color="D9D9D9"/>
+              <w:left w:val="single" w:sz="4" w:color="D9D9D9"/>
+              <w:bottom w:val="single" w:sz="4" w:color="D9D9D9"/>
+              <w:right w:val="single" w:sz="4" w:color="D9D9D9"/>
+            </w:tcBorders>
+            <w:tcMar>
+              <w:top w:w="65" w:type="dxa"/>
+              <w:bottom w:w="65" w:type="dxa"/>
+              <w:left w:w="80" w:type="dxa"/>
+              <w:right w:w="80" w:type="dxa"/>
+            </w:tcMar>
+          </w:tcPr>
+          <w:p>
+            <w:pPr>
+              <w:spacing w:after="0" w:line="252" w:lineRule="auto"/>
+              <w:jc w:val="center"/>
+            </w:pPr>
+            <w:r>
+              <w:rPr>
+                <w:b w:val="0"/>
+                <w:sz w:val="19"/>
+              </w:rPr>
+              <w:t>Validation</w:t>
+            </w:r>
+          </w:p>
+        </w:tc>
+        <w:tc>
+          <w:tcPr>
+            <w:tcW w:type="dxa" w:w="2088"/>
+            <w:vAlign w:val="center"/>
+            <w:tcBorders>
+              <w:top w:val="single" w:sz="4" w:color="D9D9D9"/>
+              <w:left w:val="single" w:sz="4" w:color="D9D9D9"/>
+              <w:bottom w:val="single" w:sz="4" w:color="D9D9D9"/>
+              <w:right w:val="single" w:sz="4" w:color="D9D9D9"/>
+            </w:tcBorders>
+            <w:tcMar>
+              <w:top w:w="65" w:type="dxa"/>
+              <w:bottom w:w="65" w:type="dxa"/>
+              <w:left w:w="80" w:type="dxa"/>
+              <w:right w:w="80" w:type="dxa"/>
+            </w:tcMar>
+          </w:tcPr>
+          <w:p>
+            <w:pPr>
+              <w:spacing w:after="0" w:line="252" w:lineRule="auto"/>
+              <w:jc w:val="center"/>
+            </w:pPr>
+            <w:r>
+              <w:rPr>
+                <w:b w:val="0"/>
+                <w:sz w:val="19"/>
+              </w:rPr>
+              <w:t>7,491 / 15,531</w:t>
+            </w:r>
+          </w:p>
+        </w:tc>
+        <w:tc>
+          <w:tcPr>
+            <w:tcW w:type="dxa" w:w="1008"/>
+            <w:vAlign w:val="center"/>
+            <w:tcBorders>
+              <w:top w:val="single" w:sz="4" w:color="D9D9D9"/>
+              <w:left w:val="single" w:sz="4" w:color="D9D9D9"/>
+              <w:bottom w:val="single" w:sz="4" w:color="D9D9D9"/>
+              <w:right w:val="single" w:sz="4" w:color="D9D9D9"/>
+            </w:tcBorders>
+            <w:tcMar>
+              <w:top w:w="65" w:type="dxa"/>
+              <w:bottom w:w="65" w:type="dxa"/>
+              <w:left w:w="80" w:type="dxa"/>
+              <w:right w:w="80" w:type="dxa"/>
+            </w:tcMar>
+          </w:tcPr>
+          <w:p>
+            <w:pPr>
+              <w:spacing w:after="0" w:line="252" w:lineRule="auto"/>
+              <w:jc w:val="center"/>
+            </w:pPr>
+            <w:r>
+              <w:rPr>
+                <w:b w:val="0"/>
+                <w:sz w:val="19"/>
+              </w:rPr>
+              <w:t>8,040</w:t>
+            </w:r>
+          </w:p>
+        </w:tc>
+        <w:tc>
+          <w:tcPr>
+            <w:tcW w:type="dxa" w:w="1152"/>
+            <w:vAlign w:val="center"/>
+            <w:tcBorders>
+              <w:top w:val="single" w:sz="4" w:color="D9D9D9"/>
+              <w:left w:val="single" w:sz="4" w:color="D9D9D9"/>
+              <w:bottom w:val="single" w:sz="4" w:color="D9D9D9"/>
+              <w:right w:val="single" w:sz="4" w:color="D9D9D9"/>
+            </w:tcBorders>
+            <w:tcMar>
+              <w:top w:w="65" w:type="dxa"/>
+              <w:bottom w:w="65" w:type="dxa"/>
+              <w:left w:w="80" w:type="dxa"/>
+              <w:right w:w="80" w:type="dxa"/>
+            </w:tcMar>
+          </w:tcPr>
+          <w:p>
+            <w:pPr>
+              <w:spacing w:after="0" w:line="252" w:lineRule="auto"/>
+              <w:jc w:val="center"/>
+            </w:pPr>
+            <w:r>
+              <w:rPr>
+                <w:b w:val="0"/>
+                <w:sz w:val="19"/>
+              </w:rPr>
+              <w:t>48.23%</w:t>
+            </w:r>
+          </w:p>
+        </w:tc>
+        <w:tc>
+          <w:tcPr>
+            <w:tcW w:type="dxa" w:w="3096"/>
+            <w:vAlign w:val="center"/>
+            <w:tcBorders>
+              <w:top w:val="single" w:sz="4" w:color="D9D9D9"/>
+              <w:left w:val="single" w:sz="4" w:color="D9D9D9"/>
+              <w:bottom w:val="single" w:sz="4" w:color="D9D9D9"/>
+              <w:right w:val="single" w:sz="4" w:color="D9D9D9"/>
+            </w:tcBorders>
+            <w:tcMar>
+              <w:top w:w="65" w:type="dxa"/>
+              <w:bottom w:w="65" w:type="dxa"/>
+              <w:left w:w="80" w:type="dxa"/>
+              <w:right w:w="80" w:type="dxa"/>
+            </w:tcMar>
+          </w:tcPr>
+          <w:p>
+            <w:pPr>
+              <w:spacing w:after="0" w:line="252" w:lineRule="auto"/>
+              <w:jc w:val="center"/>
+            </w:pPr>
+            <w:r>
+              <w:rPr>
+                <w:b w:val="0"/>
+                <w:sz w:val="19"/>
+              </w:rPr>
+              <w:t>47.45–49.02%</w:t>
+            </w:r>
+          </w:p>
+        </w:tc>
+      </w:tr>
+      <w:tr>
+        <w:trPr>
+          <w:cantSplit/>
+        </w:trPr>
+        <w:tc>
+          <w:tcPr>
+            <w:tcW w:type="dxa" w:w="1440"/>
+            <w:vAlign w:val="center"/>
+            <w:tcBorders>
+              <w:top w:val="single" w:sz="4" w:color="D9D9D9"/>
+              <w:left w:val="single" w:sz="4" w:color="D9D9D9"/>
+              <w:bottom w:val="single" w:sz="4" w:color="D9D9D9"/>
+              <w:right w:val="single" w:sz="4" w:color="D9D9D9"/>
+            </w:tcBorders>
+            <w:tcMar>
+              <w:top w:w="65" w:type="dxa"/>
+              <w:bottom w:w="65" w:type="dxa"/>
+              <w:left w:w="80" w:type="dxa"/>
+              <w:right w:w="80" w:type="dxa"/>
+            </w:tcMar>
+          </w:tcPr>
+          <w:p>
+            <w:pPr>
+              <w:spacing w:after="0" w:line="252" w:lineRule="auto"/>
+              <w:jc w:val="left"/>
+            </w:pPr>
+            <w:r>
+              <w:rPr>
+                <w:b w:val="0"/>
+                <w:sz w:val="19"/>
+              </w:rPr>
+              <w:t>All English</w:t>
+            </w:r>
+          </w:p>
+        </w:tc>
+        <w:tc>
+          <w:tcPr>
+            <w:tcW w:type="dxa" w:w="1296"/>
+            <w:vAlign w:val="center"/>
+            <w:tcBorders>
+              <w:top w:val="single" w:sz="4" w:color="D9D9D9"/>
+              <w:left w:val="single" w:sz="4" w:color="D9D9D9"/>
+              <w:bottom w:val="single" w:sz="4" w:color="D9D9D9"/>
+              <w:right w:val="single" w:sz="4" w:color="D9D9D9"/>
+            </w:tcBorders>
+            <w:tcMar>
+              <w:top w:w="65" w:type="dxa"/>
+              <w:bottom w:w="65" w:type="dxa"/>
+              <w:left w:w="80" w:type="dxa"/>
+              <w:right w:w="80" w:type="dxa"/>
+            </w:tcMar>
+          </w:tcPr>
+          <w:p>
+            <w:pPr>
+              <w:spacing w:after="0" w:line="252" w:lineRule="auto"/>
+              <w:jc w:val="center"/>
+            </w:pPr>
+            <w:r>
+              <w:rPr>
+                <w:b w:val="0"/>
+                <w:sz w:val="19"/>
+              </w:rPr>
+              <w:t>Native</w:t>
+            </w:r>
+          </w:p>
+        </w:tc>
+        <w:tc>
+          <w:tcPr>
+            <w:tcW w:type="dxa" w:w="2088"/>
+            <w:vAlign w:val="center"/>
+            <w:tcBorders>
+              <w:top w:val="single" w:sz="4" w:color="D9D9D9"/>
+              <w:left w:val="single" w:sz="4" w:color="D9D9D9"/>
+              <w:bottom w:val="single" w:sz="4" w:color="D9D9D9"/>
+              <w:right w:val="single" w:sz="4" w:color="D9D9D9"/>
+            </w:tcBorders>
+            <w:tcMar>
+              <w:top w:w="65" w:type="dxa"/>
+              <w:bottom w:w="65" w:type="dxa"/>
+              <w:left w:w="80" w:type="dxa"/>
+              <w:right w:w="80" w:type="dxa"/>
+            </w:tcMar>
+          </w:tcPr>
+          <w:p>
+            <w:pPr>
+              <w:spacing w:after="0" w:line="252" w:lineRule="auto"/>
+              <w:jc w:val="center"/>
+            </w:pPr>
+            <w:r>
+              <w:rPr>
+                <w:b w:val="0"/>
+                <w:sz w:val="19"/>
+              </w:rPr>
+              <w:t>6,109 / 15,531</w:t>
+            </w:r>
+          </w:p>
+        </w:tc>
+        <w:tc>
+          <w:tcPr>
+            <w:tcW w:type="dxa" w:w="1008"/>
+            <w:vAlign w:val="center"/>
+            <w:tcBorders>
+              <w:top w:val="single" w:sz="4" w:color="D9D9D9"/>
+              <w:left w:val="single" w:sz="4" w:color="D9D9D9"/>
+              <w:bottom w:val="single" w:sz="4" w:color="D9D9D9"/>
+              <w:right w:val="single" w:sz="4" w:color="D9D9D9"/>
+            </w:tcBorders>
+            <w:tcMar>
+              <w:top w:w="65" w:type="dxa"/>
+              <w:bottom w:w="65" w:type="dxa"/>
+              <w:left w:w="80" w:type="dxa"/>
+              <w:right w:w="80" w:type="dxa"/>
+            </w:tcMar>
+          </w:tcPr>
+          <w:p>
+            <w:pPr>
+              <w:spacing w:after="0" w:line="252" w:lineRule="auto"/>
+              <w:jc w:val="center"/>
+            </w:pPr>
+            <w:r>
+              <w:rPr>
+                <w:b w:val="0"/>
+                <w:sz w:val="19"/>
+              </w:rPr>
+              <w:t>9,422</w:t>
+            </w:r>
+          </w:p>
+        </w:tc>
+        <w:tc>
+          <w:tcPr>
+            <w:tcW w:type="dxa" w:w="1152"/>
+            <w:vAlign w:val="center"/>
+            <w:tcBorders>
+              <w:top w:val="single" w:sz="4" w:color="D9D9D9"/>
+              <w:left w:val="single" w:sz="4" w:color="D9D9D9"/>
+              <w:bottom w:val="single" w:sz="4" w:color="D9D9D9"/>
+              <w:right w:val="single" w:sz="4" w:color="D9D9D9"/>
+            </w:tcBorders>
+            <w:tcMar>
+              <w:top w:w="65" w:type="dxa"/>
+              <w:bottom w:w="65" w:type="dxa"/>
+              <w:left w:w="80" w:type="dxa"/>
+              <w:right w:w="80" w:type="dxa"/>
+            </w:tcMar>
+          </w:tcPr>
+          <w:p>
+            <w:pPr>
+              <w:spacing w:after="0" w:line="252" w:lineRule="auto"/>
+              <w:jc w:val="center"/>
+            </w:pPr>
+            <w:r>
+              <w:rPr>
+                <w:b w:val="0"/>
+                <w:sz w:val="19"/>
+              </w:rPr>
+              <w:t>39.33%</w:t>
+            </w:r>
+          </w:p>
+        </w:tc>
+        <w:tc>
+          <w:tcPr>
+            <w:tcW w:type="dxa" w:w="3096"/>
+            <w:vAlign w:val="center"/>
+            <w:tcBorders>
+              <w:top w:val="single" w:sz="4" w:color="D9D9D9"/>
+              <w:left w:val="single" w:sz="4" w:color="D9D9D9"/>
+              <w:bottom w:val="single" w:sz="4" w:color="D9D9D9"/>
+              <w:right w:val="single" w:sz="4" w:color="D9D9D9"/>
+            </w:tcBorders>
+            <w:tcMar>
+              <w:top w:w="65" w:type="dxa"/>
+              <w:bottom w:w="65" w:type="dxa"/>
+              <w:left w:w="80" w:type="dxa"/>
+              <w:right w:w="80" w:type="dxa"/>
+            </w:tcMar>
+          </w:tcPr>
+          <w:p>
+            <w:pPr>
+              <w:spacing w:after="0" w:line="252" w:lineRule="auto"/>
+              <w:jc w:val="center"/>
+            </w:pPr>
+            <w:r>
+              <w:rPr>
+                <w:b w:val="0"/>
+                <w:sz w:val="19"/>
+              </w:rPr>
+              <w:t>38.56–40.09%</w:t>
+            </w:r>
+          </w:p>
+        </w:tc>
+      </w:tr>
+    </w:tbl>
+    <w:p>
+      <w:pPr>
+        <w:spacing w:after="0"/>
+      </w:pPr>
+    </w:p>
+    <w:p>
+      <w:r>
+        <w:drawing>
+          <wp:inline xmlns:a="http://schemas.openxmlformats.org/drawingml/2006/main" xmlns:pic="http://schemas.openxmlformats.org/drawingml/2006/picture">
+            <wp:extent cx="6400800" cy="2702560"/>
+            <wp:docPr id="2" name="Picture 2"/>
+            <wp:cNvGraphicFramePr>
+              <a:graphicFrameLocks noChangeAspect="1"/>
+            </wp:cNvGraphicFramePr>
+            <a:graphic>
+              <a:graphicData uri="http://schemas.openxmlformats.org/drawingml/2006/picture">
+                <pic:pic>
+                  <pic:nvPicPr>
+                    <pic:cNvPr id="0" name="recall.png"/>
+                    <pic:cNvPicPr/>
+                  </pic:nvPicPr>
+                  <pic:blipFill>
+                    <a:blip r:embed="rId11"/>
+                    <a:stretch>
+                      <a:fillRect/>
+                    </a:stretch>
+                  </pic:blipFill>
+                  <pic:spPr>
+                    <a:xfrm>
+                      <a:off x="0" y="0"/>
+                      <a:ext cx="6400800" cy="2702560"/>
+                    </a:xfrm>
+                    <a:prstGeom prst="rect"/>
+                  </pic:spPr>
+                </pic:pic>
+              </a:graphicData>
+            </a:graphic>
+          </wp:inline>
+        </w:drawing>
+      </w:r>
+    </w:p>
+    <w:p>
+      <w:pPr>
+        <w:pStyle w:val="Caption"/>
+      </w:pPr>
+      <w:r>
+        <w:t>Figure 2. Same model and validation threshold. Intervals condition on observed groups; external cohorts overlap. Source, sampling, message type and pseudonymization differ, so the contrast is not a causal estimate of temporal degradation.</w:t>
+      </w:r>
+    </w:p>
+    <w:p>
+      <w:r>
+        <w:t>The primary result is 47.31% recall, with 196 misses. Removing the fixed publisher placeholder tokens gives 47.04% (175 detected), a 0.27 percentage-point change; it cannot recover unredacted originals. Intervals use 5,000 whole-template resamples, seed 42, and exclude training, annotation and sampling uncertainty. Category counts are descriptive. This positive-report convenience sample exposes limited transfer but cannot measure the cost of blocking legitimate SMS.</w:t>
+      </w:r>
+    </w:p>
+    <w:p>
+      <w:r>
+        <w:br w:type="page"/>
+      </w:r>
+    </w:p>
+    <w:p>
+      <w:pPr>
+        <w:pStyle w:val="Heading1"/>
+      </w:pPr>
+      <w:r>
+        <w:t>11 Reproducibility and conclusion</w:t>
       </w:r>
     </w:p>
     <w:p>
@@ -4585,12 +5649,12 @@
     </w:p>
     <w:p>
       <w:r>
-        <w:t>The full run uses python -m spam_detector.train --mode full. Adding --grouping template selects the sensitivity protocol. Independent recomputation uses scripts/verify_results.py with --all-attacks; uncertainty uses python -m spam_detector.uncertainty. Output directories must be unused for training, preventing accidental replacement of a completed run. The README provides the complete commands. Saved model files must come from a trusted run and are regenerated locally rather than committed as binary release artifacts.</w:t>
+        <w:t>The README documents training and historical verification; docs/EXTERNAL_EVALUATION.md records the pinned external source, cohort construction and scoring commands. scripts/verify_external.py reconstructs all 31,806 score rows, 63,612 binary decisions, eight summaries, 72 category rows and intervals directly from the fitted pipeline. External verification requires the original hash-matched local artifact; binaries are not committed. Output directories must be unused, and retraining cannot silently replace the frozen model.</w:t>
       </w:r>
     </w:p>
     <w:p>
       <w:r>
-        <w:t>This study finds high clean-test quality for a CV-selected word model alongside substantial sensitivity to separator edits. Character features improve recall under the tested edits at operating points that can also increase false positives. Template grouping and conditional uncertainty qualify the result without changing it into a deployment guarantee. The next substantive evidence gain would come from independent modern data, rather than another classifier selected on the same test set.</w:t>
+        <w:t>The word model combines high historical F1 with sensitivity to separator edits and low recall on independent reported SMS. Character features retain more recall under the synthetic edits, at operating points that can increase false positives. The external result leaves modern false-positive cost unresolved. Future development needs representative modern ham and new spam, with an untouched final holdout reserved before using these inspected failures to improve the model.</w:t>
       </w:r>
     </w:p>
     <w:p>
@@ -4692,6 +5756,17 @@
           <w:sz w:val="19"/>
         </w:rPr>
         <w:t>[8] SciPy developers. scipy.stats.bootstrap. Reference documentation, accessed 9 October 2026. https://docs.scipy.org/doc/scipy/reference/generated/scipy.stats.bootstrap.html</w:t>
+      </w:r>
+    </w:p>
+    <w:p>
+      <w:pPr>
+        <w:spacing w:after="140"/>
+      </w:pPr>
+      <w:r>
+        <w:rPr>
+          <w:sz w:val="19"/>
+        </w:rPr>
+        <w:t>[9] S. Agarwal, A. Papasavva, G. Suarez-Tangil and M. Vasek. Fishing for Smishing: Understanding SMS Phishing Infrastructure and Strategies by Mining Public User Reports. ACM IMC, 2025. DOI: 10.1145/3730567.3764431. Dataset: https://github.com/reportsmishing/Smishing-Dataset-IMC25</w:t>
       </w:r>
     </w:p>
     <w:sectPr>

</xml_diff>

<commit_message>
Report independent SMS evaluation in the manuscript (#10)
Update the existing manuscript and builder with the frozen external protocol, verified recall results, source citation, figure and positive-only limitations. Inspect all seven rendered pages and check the external Word table against saved metrics.
</commit_message>
<xml_diff>
--- a/paper/SMS_Spam_Detection_Paper.docx
+++ b/paper/SMS_Spam_Detection_Paper.docx
@@ -7,7 +7,7 @@
         <w:pStyle w:val="Title"/>
       </w:pPr>
       <w:r>
-        <w:t>SMS Spam Detection with Grouped Evaluation and Character Obfuscation</w:t>
+        <w:t>SMS Spam Detection with Grouped and External Evaluation</w:t>
       </w:r>
     </w:p>
     <w:p>
@@ -27,12 +27,12 @@
     </w:p>
     <w:p>
       <w:r>
-        <w:t>This study evaluates eleven sparse text classifiers on the historical English SMS Spam Collection, with explicit separation of model search, threshold selection and final testing. Exact deduplication leaves 5,171 messages. Case and whitespace groups are kept together in train, validation and test partitions and in five training cross-validation folds. The selected word TF-IDF LinearSVC achieves spam F1 0.9531, with four false positives and eight false negatives among 1,034 test messages. Its conditional 95% group-bootstrap F1 interval is 0.9249 to 0.9769. At obfuscation intensity 0.3, mean spam recall falls from 0.9385 to 0.6035 for separator insertion. Character features preserve more recall in these tests but can incur more false positives. An exploratory split using URL and digit templates selects a different model and exposes a worse tradeoff after threshold tuning. These results support a reproducible historical benchmark and a controlled sensitivity study; they do not establish performance on current SMS, new languages or adaptive attacks.</w:t>
+        <w:t>This study evaluates eleven sparse text classifiers on the historical English SMS Spam Collection, separating training search, validation threshold selection and final testing. Deduplication leaves 5,171 messages, with normalized groups kept together in holdouts and training folds. The selected word TF-IDF LinearSVC achieves spam F1 0.9531, with four false positives and eight false negatives among 1,034 test messages. Its conditional 95% group-bootstrap F1 interval is 0.9249 to 0.9769. Separator insertion at intensity 0.3 lowers mean recall from 0.9385 to 0.6035. Character features retain more recall at operating points that can increase false positives. An exploratory template split qualifies the historical comparison. We then evaluate the unchanged artifact on independent published SMS reports under a protocol fixed before prediction. Among 372 distinct English texts with explicit 2023–2024 years, it detects 176 and misses 196: recall 47.31%, with a conditional 95% interval of 42.32% to 52.28%. The pseudonymized positive-only sample cannot estimate modern false-positive rate or F1. High historical quality therefore does not establish reliable transfer to reported smishing.</w:t>
       </w:r>
     </w:p>
     <w:p>
       <w:r>
-        <w:t>Keywords: SMS spam, TF-IDF, grouped evaluation, threshold selection, character obfuscation.</w:t>
+        <w:t>Keywords: SMS spam, TF-IDF, grouped evaluation, external evaluation, character obfuscation.</w:t>
       </w:r>
     </w:p>
     <w:p>
@@ -50,7 +50,7 @@
     </w:p>
     <w:p>
       <w:r>
-        <w:t>The contribution is an auditable comparison of representations and decision rules. All candidates share training folds and attack realizations. Model choice is frozen before test scoring, and a separate validation set chooses the operating threshold. A second grouping rule examines residual template overlap. Neither test set is used to repair a threshold or to replace the selected model after viewing its errors.</w:t>
+        <w:t>The contribution is an auditable comparison of representations and decision rules. Candidates share training folds and attack realizations. Model choice is frozen before test scoring, and validation chooses the threshold. A second grouping rule examines residual template overlap. An independent collection of reported SMS then tests transfer with the original model and threshold; these outcomes do not select or retrain the model.</w:t>
       </w:r>
     </w:p>
     <w:p>
@@ -63,7 +63,7 @@
     </w:p>
     <w:p>
       <w:r>
-        <w:t>The SMS Spam Collection accompanies Almeida, Hidalgo and Yamakami's benchmark research [1, 2]. Its mixed historical sources make it useful for reproducible experiments, while limiting claims about deployment today. Uddin et al. study transformer-based detection and explainability in ExplainableDetector [3]. Li et al.'s SpamDam addresses newer SMS collection, federated learning and adversarial evaluation [4]. COPS studies a compact on-device smishing and URL pipeline [5]. These works motivate broader data and deployment studies; their published metrics are not directly comparable to our deduplicated splits. We do not reproduce those systems or claim to outperform them.</w:t>
+        <w:t>The SMS Spam Collection accompanies Almeida, Hidalgo and Yamakami's benchmark research [1, 2]. Its historical sources limit deployment claims. ExplainableDetector studies transformer detection and explainability [3]; SpamDam investigates newer SMS, federated learning and adversaries [4]; COPS studies an on-device smishing and URL pipeline [5]. Their metrics are not directly comparable to our splits. Agarwal et al. release public smishing reports collected during 2017–2024 [9]. We use that independent artifact for a separate frozen-model evaluation, without claiming to reproduce or outperform those systems.</w:t>
       </w:r>
     </w:p>
     <w:p>
@@ -4552,17 +4552,17 @@
         <w:pStyle w:val="Heading1"/>
       </w:pPr>
       <w:r>
-        <w:t>9 Limitations and next evaluation</w:t>
+        <w:t>9 Scope of the historical experiments</w:t>
       </w:r>
     </w:p>
     <w:p>
       <w:r>
-        <w:t>Both protocols use one historical English corpus. Row order is not a timestamp, and the available text labels do not establish independent senders or campaigns [1]. Related messages may remain after either grouping rule. Performance on modern scams, Russian or Kazakh text, code-switching, email and URLs as separate objects remains unmeasured. A ham prediction does not establish that a link or sender is safe.</w:t>
+        <w:t>Both training protocols use one historical English corpus. Row order is not a timestamp, and the available labels do not establish independent senders or campaigns [1]. Related messages may remain after either grouping rule. Section 10 therefore tests the original model on a separate reported-SMS collection. Russian or Kazakh text, code-switching, email and URLs as separate objects remain unmeasured. A ham prediction does not establish that a link or sender is safe.</w:t>
       </w:r>
     </w:p>
     <w:p>
       <w:r>
-        <w:t>A stronger generalization study should first obtain independently labeled, licensed modern ham and spam, freeze the current model, and report errors by source, time and language before considering retraining. A new final holdout is needed for testing defenses designed after these attacks. Deployment also requires measurements of latency, memory, privacy behavior and the cost of false positives; sparse features alone do not establish on-device suitability.</w:t>
+        <w:t>The external sample has no legitimate messages, so independent modern ham and a new spam holdout are still needed to assess the full error tradeoff. Source/date annotations and representative sampling also matter. Any defense developed after inspecting the reported failures needs new final evaluation data. Deployment additionally requires measurements of latency, memory, privacy behavior and false-positive cost; sparse features alone do not establish on-device suitability.</w:t>
       </w:r>
     </w:p>
     <w:p>
@@ -4575,7 +4575,1071 @@
         <w:pStyle w:val="Heading1"/>
       </w:pPr>
       <w:r>
-        <w:t>10 Reproducibility and conclusion</w:t>
+        <w:t>10 External evaluation on reported SMS</w:t>
+      </w:r>
+    </w:p>
+    <w:p>
+      <w:r>
+        <w:t>We use the CC BY 4.0 author artifact from Fishing for Smishing [9], pinned at commit a6175560b57387199871e51fbef6bc523d2516b4. It contains 33,869 pseudonymized reports with publisher-supplied text and annotations, partly extracted using language models. We use original English text only. A 2025 release does not imply 2025 message dates. Requiring one explicit 2023 or 2024 year yields 488 rows, mostly 2023; normalized deduplication leaves 372 texts in 371 template groups. The supplementary cohort contains 15,531 distinct English texts across all/unknown years. Neither cohort matches the entire historical corpus under exact, normalized or template keys; paraphrase and campaign independence are not established.</w:t>
+      </w:r>
+    </w:p>
+    <w:p>
+      <w:r>
+        <w:t>Source, membership, artifact hash and decision rules were fixed before external prediction (repository PR #8). No fitting or threshold selection occurs. All inputs, including OOV messages, remain in the denominator. Table 5 uses the published pseudonymized text; the two overlapping cohorts are not independent replications.</w:t>
+      </w:r>
+    </w:p>
+    <w:p>
+      <w:pPr>
+        <w:pStyle w:val="Caption"/>
+        <w:keepNext/>
+      </w:pPr>
+      <w:r>
+        <w:t>Table 5. Frozen model on positive reports. No external F1, precision, accuracy or FPR estimate.</w:t>
+      </w:r>
+    </w:p>
+    <w:tbl>
+      <w:tblPr>
+        <w:tblW w:type="auto" w:w="0"/>
+        <w:jc w:val="center"/>
+        <w:tblLayout w:type="fixed"/>
+        <w:tblLook w:firstColumn="1" w:firstRow="1" w:lastColumn="0" w:lastRow="0" w:noHBand="0" w:noVBand="1" w:val="04A0"/>
+      </w:tblPr>
+      <w:tblGrid>
+        <w:gridCol w:w="1440"/>
+        <w:gridCol w:w="1296"/>
+        <w:gridCol w:w="2088"/>
+        <w:gridCol w:w="1008"/>
+        <w:gridCol w:w="1152"/>
+        <w:gridCol w:w="3096"/>
+      </w:tblGrid>
+      <w:tr>
+        <w:trPr>
+          <w:tblHeader/>
+          <w:cantSplit/>
+        </w:trPr>
+        <w:tc>
+          <w:tcPr>
+            <w:tcW w:type="dxa" w:w="1440"/>
+            <w:vAlign w:val="center"/>
+            <w:tcBorders>
+              <w:top w:val="single" w:sz="4" w:color="D9D9D9"/>
+              <w:left w:val="single" w:sz="4" w:color="D9D9D9"/>
+              <w:bottom w:val="single" w:sz="4" w:color="D9D9D9"/>
+              <w:right w:val="single" w:sz="4" w:color="D9D9D9"/>
+            </w:tcBorders>
+            <w:tcMar>
+              <w:top w:w="65" w:type="dxa"/>
+              <w:bottom w:w="65" w:type="dxa"/>
+              <w:left w:w="80" w:type="dxa"/>
+              <w:right w:w="80" w:type="dxa"/>
+            </w:tcMar>
+            <w:shd w:fill="EAEAEA"/>
+          </w:tcPr>
+          <w:p>
+            <w:pPr>
+              <w:spacing w:after="0" w:line="252" w:lineRule="auto"/>
+              <w:jc w:val="left"/>
+            </w:pPr>
+            <w:r>
+              <w:rPr>
+                <w:b/>
+                <w:sz w:val="19"/>
+              </w:rPr>
+              <w:t>Cohort</w:t>
+            </w:r>
+          </w:p>
+        </w:tc>
+        <w:tc>
+          <w:tcPr>
+            <w:tcW w:type="dxa" w:w="1296"/>
+            <w:vAlign w:val="center"/>
+            <w:tcBorders>
+              <w:top w:val="single" w:sz="4" w:color="D9D9D9"/>
+              <w:left w:val="single" w:sz="4" w:color="D9D9D9"/>
+              <w:bottom w:val="single" w:sz="4" w:color="D9D9D9"/>
+              <w:right w:val="single" w:sz="4" w:color="D9D9D9"/>
+            </w:tcBorders>
+            <w:tcMar>
+              <w:top w:w="65" w:type="dxa"/>
+              <w:bottom w:w="65" w:type="dxa"/>
+              <w:left w:w="80" w:type="dxa"/>
+              <w:right w:w="80" w:type="dxa"/>
+            </w:tcMar>
+            <w:shd w:fill="EAEAEA"/>
+          </w:tcPr>
+          <w:p>
+            <w:pPr>
+              <w:spacing w:after="0" w:line="252" w:lineRule="auto"/>
+              <w:jc w:val="center"/>
+            </w:pPr>
+            <w:r>
+              <w:rPr>
+                <w:b/>
+                <w:sz w:val="19"/>
+              </w:rPr>
+              <w:t>Decision</w:t>
+            </w:r>
+          </w:p>
+        </w:tc>
+        <w:tc>
+          <w:tcPr>
+            <w:tcW w:type="dxa" w:w="2088"/>
+            <w:vAlign w:val="center"/>
+            <w:tcBorders>
+              <w:top w:val="single" w:sz="4" w:color="D9D9D9"/>
+              <w:left w:val="single" w:sz="4" w:color="D9D9D9"/>
+              <w:bottom w:val="single" w:sz="4" w:color="D9D9D9"/>
+              <w:right w:val="single" w:sz="4" w:color="D9D9D9"/>
+            </w:tcBorders>
+            <w:tcMar>
+              <w:top w:w="65" w:type="dxa"/>
+              <w:bottom w:w="65" w:type="dxa"/>
+              <w:left w:w="80" w:type="dxa"/>
+              <w:right w:w="80" w:type="dxa"/>
+            </w:tcMar>
+            <w:shd w:fill="EAEAEA"/>
+          </w:tcPr>
+          <w:p>
+            <w:pPr>
+              <w:spacing w:after="0" w:line="252" w:lineRule="auto"/>
+              <w:jc w:val="center"/>
+            </w:pPr>
+            <w:r>
+              <w:rPr>
+                <w:b/>
+                <w:sz w:val="19"/>
+              </w:rPr>
+              <w:t>Detected / total</w:t>
+            </w:r>
+          </w:p>
+        </w:tc>
+        <w:tc>
+          <w:tcPr>
+            <w:tcW w:type="dxa" w:w="1008"/>
+            <w:vAlign w:val="center"/>
+            <w:tcBorders>
+              <w:top w:val="single" w:sz="4" w:color="D9D9D9"/>
+              <w:left w:val="single" w:sz="4" w:color="D9D9D9"/>
+              <w:bottom w:val="single" w:sz="4" w:color="D9D9D9"/>
+              <w:right w:val="single" w:sz="4" w:color="D9D9D9"/>
+            </w:tcBorders>
+            <w:tcMar>
+              <w:top w:w="65" w:type="dxa"/>
+              <w:bottom w:w="65" w:type="dxa"/>
+              <w:left w:w="80" w:type="dxa"/>
+              <w:right w:w="80" w:type="dxa"/>
+            </w:tcMar>
+            <w:shd w:fill="EAEAEA"/>
+          </w:tcPr>
+          <w:p>
+            <w:pPr>
+              <w:spacing w:after="0" w:line="252" w:lineRule="auto"/>
+              <w:jc w:val="center"/>
+            </w:pPr>
+            <w:r>
+              <w:rPr>
+                <w:b/>
+                <w:sz w:val="19"/>
+              </w:rPr>
+              <w:t>Missed</w:t>
+            </w:r>
+          </w:p>
+        </w:tc>
+        <w:tc>
+          <w:tcPr>
+            <w:tcW w:type="dxa" w:w="1152"/>
+            <w:vAlign w:val="center"/>
+            <w:tcBorders>
+              <w:top w:val="single" w:sz="4" w:color="D9D9D9"/>
+              <w:left w:val="single" w:sz="4" w:color="D9D9D9"/>
+              <w:bottom w:val="single" w:sz="4" w:color="D9D9D9"/>
+              <w:right w:val="single" w:sz="4" w:color="D9D9D9"/>
+            </w:tcBorders>
+            <w:tcMar>
+              <w:top w:w="65" w:type="dxa"/>
+              <w:bottom w:w="65" w:type="dxa"/>
+              <w:left w:w="80" w:type="dxa"/>
+              <w:right w:w="80" w:type="dxa"/>
+            </w:tcMar>
+            <w:shd w:fill="EAEAEA"/>
+          </w:tcPr>
+          <w:p>
+            <w:pPr>
+              <w:spacing w:after="0" w:line="252" w:lineRule="auto"/>
+              <w:jc w:val="center"/>
+            </w:pPr>
+            <w:r>
+              <w:rPr>
+                <w:b/>
+                <w:sz w:val="19"/>
+              </w:rPr>
+              <w:t>Recall</w:t>
+            </w:r>
+          </w:p>
+        </w:tc>
+        <w:tc>
+          <w:tcPr>
+            <w:tcW w:type="dxa" w:w="3096"/>
+            <w:vAlign w:val="center"/>
+            <w:tcBorders>
+              <w:top w:val="single" w:sz="4" w:color="D9D9D9"/>
+              <w:left w:val="single" w:sz="4" w:color="D9D9D9"/>
+              <w:bottom w:val="single" w:sz="4" w:color="D9D9D9"/>
+              <w:right w:val="single" w:sz="4" w:color="D9D9D9"/>
+            </w:tcBorders>
+            <w:tcMar>
+              <w:top w:w="65" w:type="dxa"/>
+              <w:bottom w:w="65" w:type="dxa"/>
+              <w:left w:w="80" w:type="dxa"/>
+              <w:right w:w="80" w:type="dxa"/>
+            </w:tcMar>
+            <w:shd w:fill="EAEAEA"/>
+          </w:tcPr>
+          <w:p>
+            <w:pPr>
+              <w:spacing w:after="0" w:line="252" w:lineRule="auto"/>
+              <w:jc w:val="center"/>
+            </w:pPr>
+            <w:r>
+              <w:rPr>
+                <w:b/>
+                <w:sz w:val="19"/>
+              </w:rPr>
+              <w:t>95% interval</w:t>
+            </w:r>
+          </w:p>
+        </w:tc>
+      </w:tr>
+      <w:tr>
+        <w:trPr>
+          <w:cantSplit/>
+        </w:trPr>
+        <w:tc>
+          <w:tcPr>
+            <w:tcW w:type="dxa" w:w="1440"/>
+            <w:vAlign w:val="center"/>
+            <w:tcBorders>
+              <w:top w:val="single" w:sz="4" w:color="D9D9D9"/>
+              <w:left w:val="single" w:sz="4" w:color="D9D9D9"/>
+              <w:bottom w:val="single" w:sz="4" w:color="D9D9D9"/>
+              <w:right w:val="single" w:sz="4" w:color="D9D9D9"/>
+            </w:tcBorders>
+            <w:tcMar>
+              <w:top w:w="65" w:type="dxa"/>
+              <w:bottom w:w="65" w:type="dxa"/>
+              <w:left w:w="80" w:type="dxa"/>
+              <w:right w:w="80" w:type="dxa"/>
+            </w:tcMar>
+          </w:tcPr>
+          <w:p>
+            <w:pPr>
+              <w:spacing w:after="0" w:line="252" w:lineRule="auto"/>
+              <w:jc w:val="left"/>
+            </w:pPr>
+            <w:r>
+              <w:rPr>
+                <w:b w:val="0"/>
+                <w:sz w:val="19"/>
+              </w:rPr>
+              <w:t>2023–2024</w:t>
+            </w:r>
+          </w:p>
+        </w:tc>
+        <w:tc>
+          <w:tcPr>
+            <w:tcW w:type="dxa" w:w="1296"/>
+            <w:vAlign w:val="center"/>
+            <w:tcBorders>
+              <w:top w:val="single" w:sz="4" w:color="D9D9D9"/>
+              <w:left w:val="single" w:sz="4" w:color="D9D9D9"/>
+              <w:bottom w:val="single" w:sz="4" w:color="D9D9D9"/>
+              <w:right w:val="single" w:sz="4" w:color="D9D9D9"/>
+            </w:tcBorders>
+            <w:tcMar>
+              <w:top w:w="65" w:type="dxa"/>
+              <w:bottom w:w="65" w:type="dxa"/>
+              <w:left w:w="80" w:type="dxa"/>
+              <w:right w:w="80" w:type="dxa"/>
+            </w:tcMar>
+          </w:tcPr>
+          <w:p>
+            <w:pPr>
+              <w:spacing w:after="0" w:line="252" w:lineRule="auto"/>
+              <w:jc w:val="center"/>
+            </w:pPr>
+            <w:r>
+              <w:rPr>
+                <w:b w:val="0"/>
+                <w:sz w:val="19"/>
+              </w:rPr>
+              <w:t>Validation</w:t>
+            </w:r>
+          </w:p>
+        </w:tc>
+        <w:tc>
+          <w:tcPr>
+            <w:tcW w:type="dxa" w:w="2088"/>
+            <w:vAlign w:val="center"/>
+            <w:tcBorders>
+              <w:top w:val="single" w:sz="4" w:color="D9D9D9"/>
+              <w:left w:val="single" w:sz="4" w:color="D9D9D9"/>
+              <w:bottom w:val="single" w:sz="4" w:color="D9D9D9"/>
+              <w:right w:val="single" w:sz="4" w:color="D9D9D9"/>
+            </w:tcBorders>
+            <w:tcMar>
+              <w:top w:w="65" w:type="dxa"/>
+              <w:bottom w:w="65" w:type="dxa"/>
+              <w:left w:w="80" w:type="dxa"/>
+              <w:right w:w="80" w:type="dxa"/>
+            </w:tcMar>
+          </w:tcPr>
+          <w:p>
+            <w:pPr>
+              <w:spacing w:after="0" w:line="252" w:lineRule="auto"/>
+              <w:jc w:val="center"/>
+            </w:pPr>
+            <w:r>
+              <w:rPr>
+                <w:b w:val="0"/>
+                <w:sz w:val="19"/>
+              </w:rPr>
+              <w:t>176 / 372</w:t>
+            </w:r>
+          </w:p>
+        </w:tc>
+        <w:tc>
+          <w:tcPr>
+            <w:tcW w:type="dxa" w:w="1008"/>
+            <w:vAlign w:val="center"/>
+            <w:tcBorders>
+              <w:top w:val="single" w:sz="4" w:color="D9D9D9"/>
+              <w:left w:val="single" w:sz="4" w:color="D9D9D9"/>
+              <w:bottom w:val="single" w:sz="4" w:color="D9D9D9"/>
+              <w:right w:val="single" w:sz="4" w:color="D9D9D9"/>
+            </w:tcBorders>
+            <w:tcMar>
+              <w:top w:w="65" w:type="dxa"/>
+              <w:bottom w:w="65" w:type="dxa"/>
+              <w:left w:w="80" w:type="dxa"/>
+              <w:right w:w="80" w:type="dxa"/>
+            </w:tcMar>
+          </w:tcPr>
+          <w:p>
+            <w:pPr>
+              <w:spacing w:after="0" w:line="252" w:lineRule="auto"/>
+              <w:jc w:val="center"/>
+            </w:pPr>
+            <w:r>
+              <w:rPr>
+                <w:b w:val="0"/>
+                <w:sz w:val="19"/>
+              </w:rPr>
+              <w:t>196</w:t>
+            </w:r>
+          </w:p>
+        </w:tc>
+        <w:tc>
+          <w:tcPr>
+            <w:tcW w:type="dxa" w:w="1152"/>
+            <w:vAlign w:val="center"/>
+            <w:tcBorders>
+              <w:top w:val="single" w:sz="4" w:color="D9D9D9"/>
+              <w:left w:val="single" w:sz="4" w:color="D9D9D9"/>
+              <w:bottom w:val="single" w:sz="4" w:color="D9D9D9"/>
+              <w:right w:val="single" w:sz="4" w:color="D9D9D9"/>
+            </w:tcBorders>
+            <w:tcMar>
+              <w:top w:w="65" w:type="dxa"/>
+              <w:bottom w:w="65" w:type="dxa"/>
+              <w:left w:w="80" w:type="dxa"/>
+              <w:right w:w="80" w:type="dxa"/>
+            </w:tcMar>
+          </w:tcPr>
+          <w:p>
+            <w:pPr>
+              <w:spacing w:after="0" w:line="252" w:lineRule="auto"/>
+              <w:jc w:val="center"/>
+            </w:pPr>
+            <w:r>
+              <w:rPr>
+                <w:b w:val="0"/>
+                <w:sz w:val="19"/>
+              </w:rPr>
+              <w:t>47.31%</w:t>
+            </w:r>
+          </w:p>
+        </w:tc>
+        <w:tc>
+          <w:tcPr>
+            <w:tcW w:type="dxa" w:w="3096"/>
+            <w:vAlign w:val="center"/>
+            <w:tcBorders>
+              <w:top w:val="single" w:sz="4" w:color="D9D9D9"/>
+              <w:left w:val="single" w:sz="4" w:color="D9D9D9"/>
+              <w:bottom w:val="single" w:sz="4" w:color="D9D9D9"/>
+              <w:right w:val="single" w:sz="4" w:color="D9D9D9"/>
+            </w:tcBorders>
+            <w:tcMar>
+              <w:top w:w="65" w:type="dxa"/>
+              <w:bottom w:w="65" w:type="dxa"/>
+              <w:left w:w="80" w:type="dxa"/>
+              <w:right w:w="80" w:type="dxa"/>
+            </w:tcMar>
+          </w:tcPr>
+          <w:p>
+            <w:pPr>
+              <w:spacing w:after="0" w:line="252" w:lineRule="auto"/>
+              <w:jc w:val="center"/>
+            </w:pPr>
+            <w:r>
+              <w:rPr>
+                <w:b w:val="0"/>
+                <w:sz w:val="19"/>
+              </w:rPr>
+              <w:t>42.32–52.28%</w:t>
+            </w:r>
+          </w:p>
+        </w:tc>
+      </w:tr>
+      <w:tr>
+        <w:trPr>
+          <w:cantSplit/>
+        </w:trPr>
+        <w:tc>
+          <w:tcPr>
+            <w:tcW w:type="dxa" w:w="1440"/>
+            <w:vAlign w:val="center"/>
+            <w:tcBorders>
+              <w:top w:val="single" w:sz="4" w:color="D9D9D9"/>
+              <w:left w:val="single" w:sz="4" w:color="D9D9D9"/>
+              <w:bottom w:val="single" w:sz="4" w:color="D9D9D9"/>
+              <w:right w:val="single" w:sz="4" w:color="D9D9D9"/>
+            </w:tcBorders>
+            <w:tcMar>
+              <w:top w:w="65" w:type="dxa"/>
+              <w:bottom w:w="65" w:type="dxa"/>
+              <w:left w:w="80" w:type="dxa"/>
+              <w:right w:w="80" w:type="dxa"/>
+            </w:tcMar>
+          </w:tcPr>
+          <w:p>
+            <w:pPr>
+              <w:spacing w:after="0" w:line="252" w:lineRule="auto"/>
+              <w:jc w:val="left"/>
+            </w:pPr>
+            <w:r>
+              <w:rPr>
+                <w:b w:val="0"/>
+                <w:sz w:val="19"/>
+              </w:rPr>
+              <w:t>2023–2024</w:t>
+            </w:r>
+          </w:p>
+        </w:tc>
+        <w:tc>
+          <w:tcPr>
+            <w:tcW w:type="dxa" w:w="1296"/>
+            <w:vAlign w:val="center"/>
+            <w:tcBorders>
+              <w:top w:val="single" w:sz="4" w:color="D9D9D9"/>
+              <w:left w:val="single" w:sz="4" w:color="D9D9D9"/>
+              <w:bottom w:val="single" w:sz="4" w:color="D9D9D9"/>
+              <w:right w:val="single" w:sz="4" w:color="D9D9D9"/>
+            </w:tcBorders>
+            <w:tcMar>
+              <w:top w:w="65" w:type="dxa"/>
+              <w:bottom w:w="65" w:type="dxa"/>
+              <w:left w:w="80" w:type="dxa"/>
+              <w:right w:w="80" w:type="dxa"/>
+            </w:tcMar>
+          </w:tcPr>
+          <w:p>
+            <w:pPr>
+              <w:spacing w:after="0" w:line="252" w:lineRule="auto"/>
+              <w:jc w:val="center"/>
+            </w:pPr>
+            <w:r>
+              <w:rPr>
+                <w:b w:val="0"/>
+                <w:sz w:val="19"/>
+              </w:rPr>
+              <w:t>Native</w:t>
+            </w:r>
+          </w:p>
+        </w:tc>
+        <w:tc>
+          <w:tcPr>
+            <w:tcW w:type="dxa" w:w="2088"/>
+            <w:vAlign w:val="center"/>
+            <w:tcBorders>
+              <w:top w:val="single" w:sz="4" w:color="D9D9D9"/>
+              <w:left w:val="single" w:sz="4" w:color="D9D9D9"/>
+              <w:bottom w:val="single" w:sz="4" w:color="D9D9D9"/>
+              <w:right w:val="single" w:sz="4" w:color="D9D9D9"/>
+            </w:tcBorders>
+            <w:tcMar>
+              <w:top w:w="65" w:type="dxa"/>
+              <w:bottom w:w="65" w:type="dxa"/>
+              <w:left w:w="80" w:type="dxa"/>
+              <w:right w:w="80" w:type="dxa"/>
+            </w:tcMar>
+          </w:tcPr>
+          <w:p>
+            <w:pPr>
+              <w:spacing w:after="0" w:line="252" w:lineRule="auto"/>
+              <w:jc w:val="center"/>
+            </w:pPr>
+            <w:r>
+              <w:rPr>
+                <w:b w:val="0"/>
+                <w:sz w:val="19"/>
+              </w:rPr>
+              <w:t>145 / 372</w:t>
+            </w:r>
+          </w:p>
+        </w:tc>
+        <w:tc>
+          <w:tcPr>
+            <w:tcW w:type="dxa" w:w="1008"/>
+            <w:vAlign w:val="center"/>
+            <w:tcBorders>
+              <w:top w:val="single" w:sz="4" w:color="D9D9D9"/>
+              <w:left w:val="single" w:sz="4" w:color="D9D9D9"/>
+              <w:bottom w:val="single" w:sz="4" w:color="D9D9D9"/>
+              <w:right w:val="single" w:sz="4" w:color="D9D9D9"/>
+            </w:tcBorders>
+            <w:tcMar>
+              <w:top w:w="65" w:type="dxa"/>
+              <w:bottom w:w="65" w:type="dxa"/>
+              <w:left w:w="80" w:type="dxa"/>
+              <w:right w:w="80" w:type="dxa"/>
+            </w:tcMar>
+          </w:tcPr>
+          <w:p>
+            <w:pPr>
+              <w:spacing w:after="0" w:line="252" w:lineRule="auto"/>
+              <w:jc w:val="center"/>
+            </w:pPr>
+            <w:r>
+              <w:rPr>
+                <w:b w:val="0"/>
+                <w:sz w:val="19"/>
+              </w:rPr>
+              <w:t>227</w:t>
+            </w:r>
+          </w:p>
+        </w:tc>
+        <w:tc>
+          <w:tcPr>
+            <w:tcW w:type="dxa" w:w="1152"/>
+            <w:vAlign w:val="center"/>
+            <w:tcBorders>
+              <w:top w:val="single" w:sz="4" w:color="D9D9D9"/>
+              <w:left w:val="single" w:sz="4" w:color="D9D9D9"/>
+              <w:bottom w:val="single" w:sz="4" w:color="D9D9D9"/>
+              <w:right w:val="single" w:sz="4" w:color="D9D9D9"/>
+            </w:tcBorders>
+            <w:tcMar>
+              <w:top w:w="65" w:type="dxa"/>
+              <w:bottom w:w="65" w:type="dxa"/>
+              <w:left w:w="80" w:type="dxa"/>
+              <w:right w:w="80" w:type="dxa"/>
+            </w:tcMar>
+          </w:tcPr>
+          <w:p>
+            <w:pPr>
+              <w:spacing w:after="0" w:line="252" w:lineRule="auto"/>
+              <w:jc w:val="center"/>
+            </w:pPr>
+            <w:r>
+              <w:rPr>
+                <w:b w:val="0"/>
+                <w:sz w:val="19"/>
+              </w:rPr>
+              <w:t>38.98%</w:t>
+            </w:r>
+          </w:p>
+        </w:tc>
+        <w:tc>
+          <w:tcPr>
+            <w:tcW w:type="dxa" w:w="3096"/>
+            <w:vAlign w:val="center"/>
+            <w:tcBorders>
+              <w:top w:val="single" w:sz="4" w:color="D9D9D9"/>
+              <w:left w:val="single" w:sz="4" w:color="D9D9D9"/>
+              <w:bottom w:val="single" w:sz="4" w:color="D9D9D9"/>
+              <w:right w:val="single" w:sz="4" w:color="D9D9D9"/>
+            </w:tcBorders>
+            <w:tcMar>
+              <w:top w:w="65" w:type="dxa"/>
+              <w:bottom w:w="65" w:type="dxa"/>
+              <w:left w:w="80" w:type="dxa"/>
+              <w:right w:w="80" w:type="dxa"/>
+            </w:tcMar>
+          </w:tcPr>
+          <w:p>
+            <w:pPr>
+              <w:spacing w:after="0" w:line="252" w:lineRule="auto"/>
+              <w:jc w:val="center"/>
+            </w:pPr>
+            <w:r>
+              <w:rPr>
+                <w:b w:val="0"/>
+                <w:sz w:val="19"/>
+              </w:rPr>
+              <w:t>33.96–43.97%</w:t>
+            </w:r>
+          </w:p>
+        </w:tc>
+      </w:tr>
+      <w:tr>
+        <w:trPr>
+          <w:cantSplit/>
+        </w:trPr>
+        <w:tc>
+          <w:tcPr>
+            <w:tcW w:type="dxa" w:w="1440"/>
+            <w:vAlign w:val="center"/>
+            <w:tcBorders>
+              <w:top w:val="single" w:sz="4" w:color="D9D9D9"/>
+              <w:left w:val="single" w:sz="4" w:color="D9D9D9"/>
+              <w:bottom w:val="single" w:sz="4" w:color="D9D9D9"/>
+              <w:right w:val="single" w:sz="4" w:color="D9D9D9"/>
+            </w:tcBorders>
+            <w:tcMar>
+              <w:top w:w="65" w:type="dxa"/>
+              <w:bottom w:w="65" w:type="dxa"/>
+              <w:left w:w="80" w:type="dxa"/>
+              <w:right w:w="80" w:type="dxa"/>
+            </w:tcMar>
+          </w:tcPr>
+          <w:p>
+            <w:pPr>
+              <w:spacing w:after="0" w:line="252" w:lineRule="auto"/>
+              <w:jc w:val="left"/>
+            </w:pPr>
+            <w:r>
+              <w:rPr>
+                <w:b w:val="0"/>
+                <w:sz w:val="19"/>
+              </w:rPr>
+              <w:t>All English</w:t>
+            </w:r>
+          </w:p>
+        </w:tc>
+        <w:tc>
+          <w:tcPr>
+            <w:tcW w:type="dxa" w:w="1296"/>
+            <w:vAlign w:val="center"/>
+            <w:tcBorders>
+              <w:top w:val="single" w:sz="4" w:color="D9D9D9"/>
+              <w:left w:val="single" w:sz="4" w:color="D9D9D9"/>
+              <w:bottom w:val="single" w:sz="4" w:color="D9D9D9"/>
+              <w:right w:val="single" w:sz="4" w:color="D9D9D9"/>
+            </w:tcBorders>
+            <w:tcMar>
+              <w:top w:w="65" w:type="dxa"/>
+              <w:bottom w:w="65" w:type="dxa"/>
+              <w:left w:w="80" w:type="dxa"/>
+              <w:right w:w="80" w:type="dxa"/>
+            </w:tcMar>
+          </w:tcPr>
+          <w:p>
+            <w:pPr>
+              <w:spacing w:after="0" w:line="252" w:lineRule="auto"/>
+              <w:jc w:val="center"/>
+            </w:pPr>
+            <w:r>
+              <w:rPr>
+                <w:b w:val="0"/>
+                <w:sz w:val="19"/>
+              </w:rPr>
+              <w:t>Validation</w:t>
+            </w:r>
+          </w:p>
+        </w:tc>
+        <w:tc>
+          <w:tcPr>
+            <w:tcW w:type="dxa" w:w="2088"/>
+            <w:vAlign w:val="center"/>
+            <w:tcBorders>
+              <w:top w:val="single" w:sz="4" w:color="D9D9D9"/>
+              <w:left w:val="single" w:sz="4" w:color="D9D9D9"/>
+              <w:bottom w:val="single" w:sz="4" w:color="D9D9D9"/>
+              <w:right w:val="single" w:sz="4" w:color="D9D9D9"/>
+            </w:tcBorders>
+            <w:tcMar>
+              <w:top w:w="65" w:type="dxa"/>
+              <w:bottom w:w="65" w:type="dxa"/>
+              <w:left w:w="80" w:type="dxa"/>
+              <w:right w:w="80" w:type="dxa"/>
+            </w:tcMar>
+          </w:tcPr>
+          <w:p>
+            <w:pPr>
+              <w:spacing w:after="0" w:line="252" w:lineRule="auto"/>
+              <w:jc w:val="center"/>
+            </w:pPr>
+            <w:r>
+              <w:rPr>
+                <w:b w:val="0"/>
+                <w:sz w:val="19"/>
+              </w:rPr>
+              <w:t>7,491 / 15,531</w:t>
+            </w:r>
+          </w:p>
+        </w:tc>
+        <w:tc>
+          <w:tcPr>
+            <w:tcW w:type="dxa" w:w="1008"/>
+            <w:vAlign w:val="center"/>
+            <w:tcBorders>
+              <w:top w:val="single" w:sz="4" w:color="D9D9D9"/>
+              <w:left w:val="single" w:sz="4" w:color="D9D9D9"/>
+              <w:bottom w:val="single" w:sz="4" w:color="D9D9D9"/>
+              <w:right w:val="single" w:sz="4" w:color="D9D9D9"/>
+            </w:tcBorders>
+            <w:tcMar>
+              <w:top w:w="65" w:type="dxa"/>
+              <w:bottom w:w="65" w:type="dxa"/>
+              <w:left w:w="80" w:type="dxa"/>
+              <w:right w:w="80" w:type="dxa"/>
+            </w:tcMar>
+          </w:tcPr>
+          <w:p>
+            <w:pPr>
+              <w:spacing w:after="0" w:line="252" w:lineRule="auto"/>
+              <w:jc w:val="center"/>
+            </w:pPr>
+            <w:r>
+              <w:rPr>
+                <w:b w:val="0"/>
+                <w:sz w:val="19"/>
+              </w:rPr>
+              <w:t>8,040</w:t>
+            </w:r>
+          </w:p>
+        </w:tc>
+        <w:tc>
+          <w:tcPr>
+            <w:tcW w:type="dxa" w:w="1152"/>
+            <w:vAlign w:val="center"/>
+            <w:tcBorders>
+              <w:top w:val="single" w:sz="4" w:color="D9D9D9"/>
+              <w:left w:val="single" w:sz="4" w:color="D9D9D9"/>
+              <w:bottom w:val="single" w:sz="4" w:color="D9D9D9"/>
+              <w:right w:val="single" w:sz="4" w:color="D9D9D9"/>
+            </w:tcBorders>
+            <w:tcMar>
+              <w:top w:w="65" w:type="dxa"/>
+              <w:bottom w:w="65" w:type="dxa"/>
+              <w:left w:w="80" w:type="dxa"/>
+              <w:right w:w="80" w:type="dxa"/>
+            </w:tcMar>
+          </w:tcPr>
+          <w:p>
+            <w:pPr>
+              <w:spacing w:after="0" w:line="252" w:lineRule="auto"/>
+              <w:jc w:val="center"/>
+            </w:pPr>
+            <w:r>
+              <w:rPr>
+                <w:b w:val="0"/>
+                <w:sz w:val="19"/>
+              </w:rPr>
+              <w:t>48.23%</w:t>
+            </w:r>
+          </w:p>
+        </w:tc>
+        <w:tc>
+          <w:tcPr>
+            <w:tcW w:type="dxa" w:w="3096"/>
+            <w:vAlign w:val="center"/>
+            <w:tcBorders>
+              <w:top w:val="single" w:sz="4" w:color="D9D9D9"/>
+              <w:left w:val="single" w:sz="4" w:color="D9D9D9"/>
+              <w:bottom w:val="single" w:sz="4" w:color="D9D9D9"/>
+              <w:right w:val="single" w:sz="4" w:color="D9D9D9"/>
+            </w:tcBorders>
+            <w:tcMar>
+              <w:top w:w="65" w:type="dxa"/>
+              <w:bottom w:w="65" w:type="dxa"/>
+              <w:left w:w="80" w:type="dxa"/>
+              <w:right w:w="80" w:type="dxa"/>
+            </w:tcMar>
+          </w:tcPr>
+          <w:p>
+            <w:pPr>
+              <w:spacing w:after="0" w:line="252" w:lineRule="auto"/>
+              <w:jc w:val="center"/>
+            </w:pPr>
+            <w:r>
+              <w:rPr>
+                <w:b w:val="0"/>
+                <w:sz w:val="19"/>
+              </w:rPr>
+              <w:t>47.45–49.02%</w:t>
+            </w:r>
+          </w:p>
+        </w:tc>
+      </w:tr>
+      <w:tr>
+        <w:trPr>
+          <w:cantSplit/>
+        </w:trPr>
+        <w:tc>
+          <w:tcPr>
+            <w:tcW w:type="dxa" w:w="1440"/>
+            <w:vAlign w:val="center"/>
+            <w:tcBorders>
+              <w:top w:val="single" w:sz="4" w:color="D9D9D9"/>
+              <w:left w:val="single" w:sz="4" w:color="D9D9D9"/>
+              <w:bottom w:val="single" w:sz="4" w:color="D9D9D9"/>
+              <w:right w:val="single" w:sz="4" w:color="D9D9D9"/>
+            </w:tcBorders>
+            <w:tcMar>
+              <w:top w:w="65" w:type="dxa"/>
+              <w:bottom w:w="65" w:type="dxa"/>
+              <w:left w:w="80" w:type="dxa"/>
+              <w:right w:w="80" w:type="dxa"/>
+            </w:tcMar>
+          </w:tcPr>
+          <w:p>
+            <w:pPr>
+              <w:spacing w:after="0" w:line="252" w:lineRule="auto"/>
+              <w:jc w:val="left"/>
+            </w:pPr>
+            <w:r>
+              <w:rPr>
+                <w:b w:val="0"/>
+                <w:sz w:val="19"/>
+              </w:rPr>
+              <w:t>All English</w:t>
+            </w:r>
+          </w:p>
+        </w:tc>
+        <w:tc>
+          <w:tcPr>
+            <w:tcW w:type="dxa" w:w="1296"/>
+            <w:vAlign w:val="center"/>
+            <w:tcBorders>
+              <w:top w:val="single" w:sz="4" w:color="D9D9D9"/>
+              <w:left w:val="single" w:sz="4" w:color="D9D9D9"/>
+              <w:bottom w:val="single" w:sz="4" w:color="D9D9D9"/>
+              <w:right w:val="single" w:sz="4" w:color="D9D9D9"/>
+            </w:tcBorders>
+            <w:tcMar>
+              <w:top w:w="65" w:type="dxa"/>
+              <w:bottom w:w="65" w:type="dxa"/>
+              <w:left w:w="80" w:type="dxa"/>
+              <w:right w:w="80" w:type="dxa"/>
+            </w:tcMar>
+          </w:tcPr>
+          <w:p>
+            <w:pPr>
+              <w:spacing w:after="0" w:line="252" w:lineRule="auto"/>
+              <w:jc w:val="center"/>
+            </w:pPr>
+            <w:r>
+              <w:rPr>
+                <w:b w:val="0"/>
+                <w:sz w:val="19"/>
+              </w:rPr>
+              <w:t>Native</w:t>
+            </w:r>
+          </w:p>
+        </w:tc>
+        <w:tc>
+          <w:tcPr>
+            <w:tcW w:type="dxa" w:w="2088"/>
+            <w:vAlign w:val="center"/>
+            <w:tcBorders>
+              <w:top w:val="single" w:sz="4" w:color="D9D9D9"/>
+              <w:left w:val="single" w:sz="4" w:color="D9D9D9"/>
+              <w:bottom w:val="single" w:sz="4" w:color="D9D9D9"/>
+              <w:right w:val="single" w:sz="4" w:color="D9D9D9"/>
+            </w:tcBorders>
+            <w:tcMar>
+              <w:top w:w="65" w:type="dxa"/>
+              <w:bottom w:w="65" w:type="dxa"/>
+              <w:left w:w="80" w:type="dxa"/>
+              <w:right w:w="80" w:type="dxa"/>
+            </w:tcMar>
+          </w:tcPr>
+          <w:p>
+            <w:pPr>
+              <w:spacing w:after="0" w:line="252" w:lineRule="auto"/>
+              <w:jc w:val="center"/>
+            </w:pPr>
+            <w:r>
+              <w:rPr>
+                <w:b w:val="0"/>
+                <w:sz w:val="19"/>
+              </w:rPr>
+              <w:t>6,109 / 15,531</w:t>
+            </w:r>
+          </w:p>
+        </w:tc>
+        <w:tc>
+          <w:tcPr>
+            <w:tcW w:type="dxa" w:w="1008"/>
+            <w:vAlign w:val="center"/>
+            <w:tcBorders>
+              <w:top w:val="single" w:sz="4" w:color="D9D9D9"/>
+              <w:left w:val="single" w:sz="4" w:color="D9D9D9"/>
+              <w:bottom w:val="single" w:sz="4" w:color="D9D9D9"/>
+              <w:right w:val="single" w:sz="4" w:color="D9D9D9"/>
+            </w:tcBorders>
+            <w:tcMar>
+              <w:top w:w="65" w:type="dxa"/>
+              <w:bottom w:w="65" w:type="dxa"/>
+              <w:left w:w="80" w:type="dxa"/>
+              <w:right w:w="80" w:type="dxa"/>
+            </w:tcMar>
+          </w:tcPr>
+          <w:p>
+            <w:pPr>
+              <w:spacing w:after="0" w:line="252" w:lineRule="auto"/>
+              <w:jc w:val="center"/>
+            </w:pPr>
+            <w:r>
+              <w:rPr>
+                <w:b w:val="0"/>
+                <w:sz w:val="19"/>
+              </w:rPr>
+              <w:t>9,422</w:t>
+            </w:r>
+          </w:p>
+        </w:tc>
+        <w:tc>
+          <w:tcPr>
+            <w:tcW w:type="dxa" w:w="1152"/>
+            <w:vAlign w:val="center"/>
+            <w:tcBorders>
+              <w:top w:val="single" w:sz="4" w:color="D9D9D9"/>
+              <w:left w:val="single" w:sz="4" w:color="D9D9D9"/>
+              <w:bottom w:val="single" w:sz="4" w:color="D9D9D9"/>
+              <w:right w:val="single" w:sz="4" w:color="D9D9D9"/>
+            </w:tcBorders>
+            <w:tcMar>
+              <w:top w:w="65" w:type="dxa"/>
+              <w:bottom w:w="65" w:type="dxa"/>
+              <w:left w:w="80" w:type="dxa"/>
+              <w:right w:w="80" w:type="dxa"/>
+            </w:tcMar>
+          </w:tcPr>
+          <w:p>
+            <w:pPr>
+              <w:spacing w:after="0" w:line="252" w:lineRule="auto"/>
+              <w:jc w:val="center"/>
+            </w:pPr>
+            <w:r>
+              <w:rPr>
+                <w:b w:val="0"/>
+                <w:sz w:val="19"/>
+              </w:rPr>
+              <w:t>39.33%</w:t>
+            </w:r>
+          </w:p>
+        </w:tc>
+        <w:tc>
+          <w:tcPr>
+            <w:tcW w:type="dxa" w:w="3096"/>
+            <w:vAlign w:val="center"/>
+            <w:tcBorders>
+              <w:top w:val="single" w:sz="4" w:color="D9D9D9"/>
+              <w:left w:val="single" w:sz="4" w:color="D9D9D9"/>
+              <w:bottom w:val="single" w:sz="4" w:color="D9D9D9"/>
+              <w:right w:val="single" w:sz="4" w:color="D9D9D9"/>
+            </w:tcBorders>
+            <w:tcMar>
+              <w:top w:w="65" w:type="dxa"/>
+              <w:bottom w:w="65" w:type="dxa"/>
+              <w:left w:w="80" w:type="dxa"/>
+              <w:right w:w="80" w:type="dxa"/>
+            </w:tcMar>
+          </w:tcPr>
+          <w:p>
+            <w:pPr>
+              <w:spacing w:after="0" w:line="252" w:lineRule="auto"/>
+              <w:jc w:val="center"/>
+            </w:pPr>
+            <w:r>
+              <w:rPr>
+                <w:b w:val="0"/>
+                <w:sz w:val="19"/>
+              </w:rPr>
+              <w:t>38.56–40.09%</w:t>
+            </w:r>
+          </w:p>
+        </w:tc>
+      </w:tr>
+    </w:tbl>
+    <w:p>
+      <w:pPr>
+        <w:spacing w:after="0"/>
+      </w:pPr>
+    </w:p>
+    <w:p>
+      <w:r>
+        <w:drawing>
+          <wp:inline xmlns:a="http://schemas.openxmlformats.org/drawingml/2006/main" xmlns:pic="http://schemas.openxmlformats.org/drawingml/2006/picture">
+            <wp:extent cx="6400800" cy="2702560"/>
+            <wp:docPr id="2" name="Picture 2"/>
+            <wp:cNvGraphicFramePr>
+              <a:graphicFrameLocks noChangeAspect="1"/>
+            </wp:cNvGraphicFramePr>
+            <a:graphic>
+              <a:graphicData uri="http://schemas.openxmlformats.org/drawingml/2006/picture">
+                <pic:pic>
+                  <pic:nvPicPr>
+                    <pic:cNvPr id="0" name="recall.png"/>
+                    <pic:cNvPicPr/>
+                  </pic:nvPicPr>
+                  <pic:blipFill>
+                    <a:blip r:embed="rId11"/>
+                    <a:stretch>
+                      <a:fillRect/>
+                    </a:stretch>
+                  </pic:blipFill>
+                  <pic:spPr>
+                    <a:xfrm>
+                      <a:off x="0" y="0"/>
+                      <a:ext cx="6400800" cy="2702560"/>
+                    </a:xfrm>
+                    <a:prstGeom prst="rect"/>
+                  </pic:spPr>
+                </pic:pic>
+              </a:graphicData>
+            </a:graphic>
+          </wp:inline>
+        </w:drawing>
+      </w:r>
+    </w:p>
+    <w:p>
+      <w:pPr>
+        <w:pStyle w:val="Caption"/>
+      </w:pPr>
+      <w:r>
+        <w:t>Figure 2. Same model and validation threshold. Intervals condition on observed groups; external cohorts overlap. Source, sampling, message type and pseudonymization differ, so the contrast is not a causal estimate of temporal degradation.</w:t>
+      </w:r>
+    </w:p>
+    <w:p>
+      <w:r>
+        <w:t>The primary result is 47.31% recall, with 196 misses. Removing the fixed publisher placeholder tokens gives 47.04% (175 detected), a 0.27 percentage-point change; it cannot recover unredacted originals. Intervals use 5,000 whole-template resamples, seed 42, and exclude training, annotation and sampling uncertainty. Category counts are descriptive. This positive-report convenience sample exposes limited transfer but cannot measure the cost of blocking legitimate SMS.</w:t>
+      </w:r>
+    </w:p>
+    <w:p>
+      <w:r>
+        <w:br w:type="page"/>
+      </w:r>
+    </w:p>
+    <w:p>
+      <w:pPr>
+        <w:pStyle w:val="Heading1"/>
+      </w:pPr>
+      <w:r>
+        <w:t>11 Reproducibility and conclusion</w:t>
       </w:r>
     </w:p>
     <w:p>
@@ -4585,12 +5649,12 @@
     </w:p>
     <w:p>
       <w:r>
-        <w:t>The full run uses python -m spam_detector.train --mode full. Adding --grouping template selects the sensitivity protocol. Independent recomputation uses scripts/verify_results.py with --all-attacks; uncertainty uses python -m spam_detector.uncertainty. Output directories must be unused for training, preventing accidental replacement of a completed run. The README provides the complete commands. Saved model files must come from a trusted run and are regenerated locally rather than committed as binary release artifacts.</w:t>
+        <w:t>The README documents training and historical verification; docs/EXTERNAL_EVALUATION.md records the pinned external source, cohort construction and scoring commands. scripts/verify_external.py reconstructs all 31,806 score rows, 63,612 binary decisions, eight summaries, 72 category rows and intervals directly from the fitted pipeline. External verification requires the original hash-matched local artifact; binaries are not committed. Output directories must be unused, and retraining cannot silently replace the frozen model.</w:t>
       </w:r>
     </w:p>
     <w:p>
       <w:r>
-        <w:t>This study finds high clean-test quality for a CV-selected word model alongside substantial sensitivity to separator edits. Character features improve recall under the tested edits at operating points that can also increase false positives. Template grouping and conditional uncertainty qualify the result without changing it into a deployment guarantee. The next substantive evidence gain would come from independent modern data, rather than another classifier selected on the same test set.</w:t>
+        <w:t>The word model combines high historical F1 with sensitivity to separator edits and low recall on independent reported SMS. Character features retain more recall under the synthetic edits, at operating points that can increase false positives. The external result leaves modern false-positive cost unresolved. Future development needs representative modern ham and new spam, with an untouched final holdout reserved before using these inspected failures to improve the model.</w:t>
       </w:r>
     </w:p>
     <w:p>
@@ -4692,6 +5756,17 @@
           <w:sz w:val="19"/>
         </w:rPr>
         <w:t>[8] SciPy developers. scipy.stats.bootstrap. Reference documentation, accessed 9 October 2026. https://docs.scipy.org/doc/scipy/reference/generated/scipy.stats.bootstrap.html</w:t>
+      </w:r>
+    </w:p>
+    <w:p>
+      <w:pPr>
+        <w:spacing w:after="140"/>
+      </w:pPr>
+      <w:r>
+        <w:rPr>
+          <w:sz w:val="19"/>
+        </w:rPr>
+        <w:t>[9] S. Agarwal, A. Papasavva, G. Suarez-Tangil and M. Vasek. Fishing for Smishing: Understanding SMS Phishing Infrastructure and Strategies by Mining Public User Reports. ACM IMC, 2025. DOI: 10.1145/3730567.3764431. Dataset: https://github.com/reportsmishing/Smishing-Dataset-IMC25</w:t>
       </w:r>
     </w:p>
     <w:sectPr>

</xml_diff>

<commit_message>
Document modern-message adaptation and its false-positive tradeoff
</commit_message>
<xml_diff>
--- a/paper/SMS_Spam_Detection_Paper.docx
+++ b/paper/SMS_Spam_Detection_Paper.docx
@@ -27,7 +27,7 @@
     </w:p>
     <w:p>
       <w:r>
-        <w:t>This study evaluates eleven sparse text classifiers on the historical English SMS Spam Collection, separating training search, validation threshold selection and final testing. Deduplication leaves 5,171 messages, with normalized groups kept together in holdouts and training folds. The selected word TF-IDF LinearSVC achieves spam F1 0.9531, with four false positives and eight false negatives among 1,034 test messages. Its conditional 95% group-bootstrap F1 interval is 0.9249 to 0.9769. Separator insertion at intensity 0.3 lowers mean recall from 0.9385 to 0.6035. Character features retain more recall at operating points that can increase false positives. An exploratory template split qualifies the historical comparison. We then evaluate the unchanged artifact on independent published SMS reports under a protocol fixed before prediction. Among 372 distinct English texts with explicit 2023–2024 years, it detects 176 and misses 196: recall 47.31%, with a conditional 95% interval of 42.32% to 52.28%. The pseudonymized positive-only sample cannot estimate modern false-positive rate or F1. High historical quality therefore does not establish reliable transfer to reported smishing.</w:t>
+        <w:t>This study evaluates eleven sparse classifiers on the historical English SMS Spam Collection, separating training search, validation thresholds and final testing. After deduplication, 5,171 messages remain in grouped splits. The selected word TF-IDF LinearSVC achieves spam F1 0.9531, with four false positives and eight misses among 1,034 test messages. Its conditional 95% group-bootstrap F1 interval is 0.9249 to 0.9769. Separator insertion lowers mean recall from 0.9385 to 0.6035. On 372 independent English reports with explicit 2023–2024 years, the unchanged model detects 176: recall 47.31%. We then refit with newer spam and ordinary financial messages under a separate frozen protocol. On another independent source, recall rises from 42.63% to 58.66%, but false positives on government notifications rise from 11/55 to 19/55. A separate financial holdout improves from F1 0.6400 to 0.8605. The adapted candidate fails the predeclared replacement criterion. Higher historical or spam-class F1 does not establish reliable transfer or acceptable harm to legitimate messages.</w:t>
       </w:r>
     </w:p>
     <w:p>
@@ -50,7 +50,7 @@
     </w:p>
     <w:p>
       <w:r>
-        <w:t>The contribution is an auditable comparison of representations and decision rules. Candidates share training folds and attack realizations. Model choice is frozen before test scoring, and validation chooses the threshold. A second grouping rule examines residual template overlap. An independent collection of reported SMS then tests transfer with the original model and threshold; these outcomes do not select or retrain the model.</w:t>
+        <w:t>The contribution is an auditable comparison of representations and decision rules. Candidates share training folds and attack realizations. Model choice is frozen before test scoring, and validation chooses the threshold. A second grouping rule examines residual template overlap. An independent collection of reported SMS then tests transfer with the original model and threshold. A separate adaptation follow-up uses those inspected reports for development and reserves new test data.</w:t>
       </w:r>
     </w:p>
     <w:p>
@@ -4557,12 +4557,12 @@
     </w:p>
     <w:p>
       <w:r>
-        <w:t>Both training protocols use one historical English corpus. Row order is not a timestamp, and the available labels do not establish independent senders or campaigns [1]. Related messages may remain after either grouping rule. Section 10 therefore tests the original model on a separate reported-SMS collection. Russian or Kazakh text, code-switching, email and URLs as separate objects remain unmeasured. A ham prediction does not establish that a link or sender is safe.</w:t>
+        <w:t>Both historical protocols use one English corpus. Row order is not a timestamp, and the available labels do not establish independent senders or campaigns [1]. Related messages may remain after either grouping rule. Section 10 tests the original model on a separate reported-SMS collection. Russian or Kazakh accuracy, performance by language or channel, and URL safety remain unmeasured. A ham prediction does not establish that a link or sender is safe.</w:t>
       </w:r>
     </w:p>
     <w:p>
       <w:r>
-        <w:t>The external sample has no legitimate messages, so independent modern ham and a new spam holdout are still needed to assess the full error tradeoff. Source/date annotations and representative sampling also matter. Any defense developed after inspecting the reported failures needs new final evaluation data. Deployment additionally requires measurements of latency, memory, privacy behavior and false-positive cost; sparse features alone do not establish on-device suitability.</w:t>
+        <w:t>The IMC sample has no legitimate messages. Section 11 adds two-class follow-up evidence, with limited ham coverage. Representative modern ham, reliable source/date annotations and new final data remain necessary for further development. Deployment also requires measurements of latency, memory, privacy behavior and false-positive cost; sparse features alone do not establish on-device suitability.</w:t>
       </w:r>
     </w:p>
     <w:p>
@@ -5639,22 +5639,1047 @@
         <w:pStyle w:val="Heading1"/>
       </w:pPr>
       <w:r>
-        <w:t>11 Reproducibility and conclusion</w:t>
+        <w:t>11 Adaptation with ordinary messages</w:t>
       </w:r>
     </w:p>
     <w:p>
       <w:r>
-        <w:t>The repository supplies raw-data checks, split and CV manifests, all 84 search results, clean and validation metrics, attack seeds and hashes, complete error ledgers, interval reports and fitted-pipeline export. Dataset, training source and model artifacts have SHA-256 records. Both full protocols were independently checked against saved models, including all 7,920 attacked metric rows per run. The environment uses Python 3.12.14 and scikit-learn 1.9.1; exact dependencies and execution metadata are recorded with each experiment.</w:t>
+        <w:t>A follow-up treats the inspected IMC reports as development material. We add Ahmed and Islam's CC BY 4.0 financial-message dataset, published in October 2025 [10]. It mixes SMS, chats and email, with no receipt dates or per-message channel. Of 523 rows, a Bengali-script exclusion leaves 422; three duplicates and seven historical overlaps leave 412 before splitting. This is a Latin-script auxiliary sample, not verified English-only modern SMS. The independent Spam of the Times source [11] contains dated SMS from one Philippine recipient. We retain unsolicited spam and government public service announcements (PSAs), exclude ambiguous advertising and redacted private texts, and remove repeats and known near-copies. Its 754 test messages span September 2022 to July 2026, mix languages and include only 55 retained ham messages.</w:t>
       </w:r>
     </w:p>
     <w:p>
       <w:r>
-        <w:t>The README documents training and historical verification; docs/EXTERNAL_EVALUATION.md records the pinned external source, cohort construction and scoring commands. scripts/verify_external.py reconstructs all 31,806 score rows, 63,612 binary decisions, eight summaries, 72 category rows and intervals directly from the fitted pipeline. External verification requires the original hash-matched local artifact; binaries are not committed. Output directories must be unused, and retraining cannot silently replace the frozen model.</w:t>
+        <w:t>Source hashes, membership and selection rules were committed before fitting (PR #11). Financial groups use 60/20/20 train/validation/test proportions; IMC uses 80/20. Campaign keys mask entities and numbers; fixed character 5-gram hashing removes near-copies at cosine similarity &gt;=0.85. Historical test groups are excluded from development. After exclusions, training has 15,172 rows, including 99 new ordinary financial messages. Validation has 3,034 rows. The financial test has 32 ham and 46 scam messages; the independent SMS test has 55 PSAs and 699 spam messages. These screens do not certify semantic independence.</w:t>
       </w:r>
     </w:p>
     <w:p>
       <w:r>
-        <w:t>The word model combines high historical F1 with sensitivity to separator edits and low recall on independent reported SMS. Character features retain more recall under the synthetic edits, at operating points that can increase false positives. The external result leaves modern false-positive cost unresolved. Future development needs representative modern ham and new spam, with an untouched final holdout reserved before using these inspected failures to improve the model.</w:t>
+        <w:t>We refit six LinearSVC pipelines: word 1–2 grams, character 3–5 grams and their union, each with C=0.5 or 1. Class totals are equally weighted, then sources and campaigns within each class. Validation maximizes mean source recall subject to FPR &lt;=1% separately on historical and financial ham. It selects word plus character features, C=1 and threshold 0.64907808395485. No refit or tuning follows test inspection.</w:t>
+      </w:r>
+    </w:p>
+    <w:p>
+      <w:pPr>
+        <w:pStyle w:val="Caption"/>
+        <w:keepNext/>
+      </w:pPr>
+      <w:r>
+        <w:t>Table 6. Adaptation improves spam detection but increases errors on independent PSAs.</w:t>
+      </w:r>
+    </w:p>
+    <w:tbl>
+      <w:tblPr>
+        <w:tblW w:type="auto" w:w="0"/>
+        <w:jc w:val="center"/>
+        <w:tblLayout w:type="fixed"/>
+        <w:tblLook w:firstColumn="1" w:firstRow="1" w:lastColumn="0" w:lastRow="0" w:noHBand="0" w:noVBand="1" w:val="04A0"/>
+      </w:tblPr>
+      <w:tblGrid>
+        <w:gridCol w:w="1728"/>
+        <w:gridCol w:w="1440"/>
+        <w:gridCol w:w="1440"/>
+        <w:gridCol w:w="1440"/>
+        <w:gridCol w:w="2016"/>
+        <w:gridCol w:w="2016"/>
+      </w:tblGrid>
+      <w:tr>
+        <w:trPr>
+          <w:tblHeader/>
+          <w:cantSplit/>
+        </w:trPr>
+        <w:tc>
+          <w:tcPr>
+            <w:tcW w:type="dxa" w:w="1728"/>
+            <w:vAlign w:val="center"/>
+            <w:tcBorders>
+              <w:top w:val="single" w:sz="4" w:color="D9D9D9"/>
+              <w:left w:val="single" w:sz="4" w:color="D9D9D9"/>
+              <w:bottom w:val="single" w:sz="4" w:color="D9D9D9"/>
+              <w:right w:val="single" w:sz="4" w:color="D9D9D9"/>
+            </w:tcBorders>
+            <w:tcMar>
+              <w:top w:w="65" w:type="dxa"/>
+              <w:bottom w:w="65" w:type="dxa"/>
+              <w:left w:w="80" w:type="dxa"/>
+              <w:right w:w="80" w:type="dxa"/>
+            </w:tcMar>
+            <w:shd w:fill="EAEAEA"/>
+          </w:tcPr>
+          <w:p>
+            <w:pPr>
+              <w:spacing w:after="0" w:line="252" w:lineRule="auto"/>
+              <w:jc w:val="left"/>
+            </w:pPr>
+            <w:r>
+              <w:rPr>
+                <w:b/>
+                <w:sz w:val="19"/>
+              </w:rPr>
+              <w:t>Test source</w:t>
+            </w:r>
+          </w:p>
+        </w:tc>
+        <w:tc>
+          <w:tcPr>
+            <w:tcW w:type="dxa" w:w="1440"/>
+            <w:vAlign w:val="center"/>
+            <w:tcBorders>
+              <w:top w:val="single" w:sz="4" w:color="D9D9D9"/>
+              <w:left w:val="single" w:sz="4" w:color="D9D9D9"/>
+              <w:bottom w:val="single" w:sz="4" w:color="D9D9D9"/>
+              <w:right w:val="single" w:sz="4" w:color="D9D9D9"/>
+            </w:tcBorders>
+            <w:tcMar>
+              <w:top w:w="65" w:type="dxa"/>
+              <w:bottom w:w="65" w:type="dxa"/>
+              <w:left w:w="80" w:type="dxa"/>
+              <w:right w:w="80" w:type="dxa"/>
+            </w:tcMar>
+            <w:shd w:fill="EAEAEA"/>
+          </w:tcPr>
+          <w:p>
+            <w:pPr>
+              <w:spacing w:after="0" w:line="252" w:lineRule="auto"/>
+              <w:jc w:val="center"/>
+            </w:pPr>
+            <w:r>
+              <w:rPr>
+                <w:b/>
+                <w:sz w:val="19"/>
+              </w:rPr>
+              <w:t>Model</w:t>
+            </w:r>
+          </w:p>
+        </w:tc>
+        <w:tc>
+          <w:tcPr>
+            <w:tcW w:type="dxa" w:w="1440"/>
+            <w:vAlign w:val="center"/>
+            <w:tcBorders>
+              <w:top w:val="single" w:sz="4" w:color="D9D9D9"/>
+              <w:left w:val="single" w:sz="4" w:color="D9D9D9"/>
+              <w:bottom w:val="single" w:sz="4" w:color="D9D9D9"/>
+              <w:right w:val="single" w:sz="4" w:color="D9D9D9"/>
+            </w:tcBorders>
+            <w:tcMar>
+              <w:top w:w="65" w:type="dxa"/>
+              <w:bottom w:w="65" w:type="dxa"/>
+              <w:left w:w="80" w:type="dxa"/>
+              <w:right w:w="80" w:type="dxa"/>
+            </w:tcMar>
+            <w:shd w:fill="EAEAEA"/>
+          </w:tcPr>
+          <w:p>
+            <w:pPr>
+              <w:spacing w:after="0" w:line="252" w:lineRule="auto"/>
+              <w:jc w:val="center"/>
+            </w:pPr>
+            <w:r>
+              <w:rPr>
+                <w:b/>
+                <w:sz w:val="19"/>
+              </w:rPr>
+              <w:t>Recall</w:t>
+            </w:r>
+          </w:p>
+        </w:tc>
+        <w:tc>
+          <w:tcPr>
+            <w:tcW w:type="dxa" w:w="1440"/>
+            <w:vAlign w:val="center"/>
+            <w:tcBorders>
+              <w:top w:val="single" w:sz="4" w:color="D9D9D9"/>
+              <w:left w:val="single" w:sz="4" w:color="D9D9D9"/>
+              <w:bottom w:val="single" w:sz="4" w:color="D9D9D9"/>
+              <w:right w:val="single" w:sz="4" w:color="D9D9D9"/>
+            </w:tcBorders>
+            <w:tcMar>
+              <w:top w:w="65" w:type="dxa"/>
+              <w:bottom w:w="65" w:type="dxa"/>
+              <w:left w:w="80" w:type="dxa"/>
+              <w:right w:w="80" w:type="dxa"/>
+            </w:tcMar>
+            <w:shd w:fill="EAEAEA"/>
+          </w:tcPr>
+          <w:p>
+            <w:pPr>
+              <w:spacing w:after="0" w:line="252" w:lineRule="auto"/>
+              <w:jc w:val="center"/>
+            </w:pPr>
+            <w:r>
+              <w:rPr>
+                <w:b/>
+                <w:sz w:val="19"/>
+              </w:rPr>
+              <w:t>Spam F1</w:t>
+            </w:r>
+          </w:p>
+        </w:tc>
+        <w:tc>
+          <w:tcPr>
+            <w:tcW w:type="dxa" w:w="2016"/>
+            <w:vAlign w:val="center"/>
+            <w:tcBorders>
+              <w:top w:val="single" w:sz="4" w:color="D9D9D9"/>
+              <w:left w:val="single" w:sz="4" w:color="D9D9D9"/>
+              <w:bottom w:val="single" w:sz="4" w:color="D9D9D9"/>
+              <w:right w:val="single" w:sz="4" w:color="D9D9D9"/>
+            </w:tcBorders>
+            <w:tcMar>
+              <w:top w:w="65" w:type="dxa"/>
+              <w:bottom w:w="65" w:type="dxa"/>
+              <w:left w:w="80" w:type="dxa"/>
+              <w:right w:w="80" w:type="dxa"/>
+            </w:tcMar>
+            <w:shd w:fill="EAEAEA"/>
+          </w:tcPr>
+          <w:p>
+            <w:pPr>
+              <w:spacing w:after="0" w:line="252" w:lineRule="auto"/>
+              <w:jc w:val="center"/>
+            </w:pPr>
+            <w:r>
+              <w:rPr>
+                <w:b/>
+                <w:sz w:val="19"/>
+              </w:rPr>
+              <w:t>FP / ham</w:t>
+            </w:r>
+          </w:p>
+        </w:tc>
+        <w:tc>
+          <w:tcPr>
+            <w:tcW w:type="dxa" w:w="2016"/>
+            <w:vAlign w:val="center"/>
+            <w:tcBorders>
+              <w:top w:val="single" w:sz="4" w:color="D9D9D9"/>
+              <w:left w:val="single" w:sz="4" w:color="D9D9D9"/>
+              <w:bottom w:val="single" w:sz="4" w:color="D9D9D9"/>
+              <w:right w:val="single" w:sz="4" w:color="D9D9D9"/>
+            </w:tcBorders>
+            <w:tcMar>
+              <w:top w:w="65" w:type="dxa"/>
+              <w:bottom w:w="65" w:type="dxa"/>
+              <w:left w:w="80" w:type="dxa"/>
+              <w:right w:w="80" w:type="dxa"/>
+            </w:tcMar>
+            <w:shd w:fill="EAEAEA"/>
+          </w:tcPr>
+          <w:p>
+            <w:pPr>
+              <w:spacing w:after="0" w:line="252" w:lineRule="auto"/>
+              <w:jc w:val="center"/>
+            </w:pPr>
+            <w:r>
+              <w:rPr>
+                <w:b/>
+                <w:sz w:val="19"/>
+              </w:rPr>
+              <w:t>FN / spam</w:t>
+            </w:r>
+          </w:p>
+        </w:tc>
+      </w:tr>
+      <w:tr>
+        <w:trPr>
+          <w:cantSplit/>
+        </w:trPr>
+        <w:tc>
+          <w:tcPr>
+            <w:tcW w:type="dxa" w:w="1728"/>
+            <w:vAlign w:val="center"/>
+            <w:tcBorders>
+              <w:top w:val="single" w:sz="4" w:color="D9D9D9"/>
+              <w:left w:val="single" w:sz="4" w:color="D9D9D9"/>
+              <w:bottom w:val="single" w:sz="4" w:color="D9D9D9"/>
+              <w:right w:val="single" w:sz="4" w:color="D9D9D9"/>
+            </w:tcBorders>
+            <w:tcMar>
+              <w:top w:w="65" w:type="dxa"/>
+              <w:bottom w:w="65" w:type="dxa"/>
+              <w:left w:w="80" w:type="dxa"/>
+              <w:right w:w="80" w:type="dxa"/>
+            </w:tcMar>
+          </w:tcPr>
+          <w:p>
+            <w:pPr>
+              <w:spacing w:after="0" w:line="252" w:lineRule="auto"/>
+              <w:jc w:val="left"/>
+            </w:pPr>
+            <w:r>
+              <w:rPr>
+                <w:b w:val="0"/>
+                <w:sz w:val="19"/>
+              </w:rPr>
+              <w:t>Financial</w:t>
+            </w:r>
+          </w:p>
+        </w:tc>
+        <w:tc>
+          <w:tcPr>
+            <w:tcW w:type="dxa" w:w="1440"/>
+            <w:vAlign w:val="center"/>
+            <w:tcBorders>
+              <w:top w:val="single" w:sz="4" w:color="D9D9D9"/>
+              <w:left w:val="single" w:sz="4" w:color="D9D9D9"/>
+              <w:bottom w:val="single" w:sz="4" w:color="D9D9D9"/>
+              <w:right w:val="single" w:sz="4" w:color="D9D9D9"/>
+            </w:tcBorders>
+            <w:tcMar>
+              <w:top w:w="65" w:type="dxa"/>
+              <w:bottom w:w="65" w:type="dxa"/>
+              <w:left w:w="80" w:type="dxa"/>
+              <w:right w:w="80" w:type="dxa"/>
+            </w:tcMar>
+          </w:tcPr>
+          <w:p>
+            <w:pPr>
+              <w:spacing w:after="0" w:line="252" w:lineRule="auto"/>
+              <w:jc w:val="center"/>
+            </w:pPr>
+            <w:r>
+              <w:rPr>
+                <w:b w:val="0"/>
+                <w:sz w:val="19"/>
+              </w:rPr>
+              <w:t>Original</w:t>
+            </w:r>
+          </w:p>
+        </w:tc>
+        <w:tc>
+          <w:tcPr>
+            <w:tcW w:type="dxa" w:w="1440"/>
+            <w:vAlign w:val="center"/>
+            <w:tcBorders>
+              <w:top w:val="single" w:sz="4" w:color="D9D9D9"/>
+              <w:left w:val="single" w:sz="4" w:color="D9D9D9"/>
+              <w:bottom w:val="single" w:sz="4" w:color="D9D9D9"/>
+              <w:right w:val="single" w:sz="4" w:color="D9D9D9"/>
+            </w:tcBorders>
+            <w:tcMar>
+              <w:top w:w="65" w:type="dxa"/>
+              <w:bottom w:w="65" w:type="dxa"/>
+              <w:left w:w="80" w:type="dxa"/>
+              <w:right w:w="80" w:type="dxa"/>
+            </w:tcMar>
+          </w:tcPr>
+          <w:p>
+            <w:pPr>
+              <w:spacing w:after="0" w:line="252" w:lineRule="auto"/>
+              <w:jc w:val="center"/>
+            </w:pPr>
+            <w:r>
+              <w:rPr>
+                <w:b w:val="0"/>
+                <w:sz w:val="19"/>
+              </w:rPr>
+              <w:t>52.17%</w:t>
+            </w:r>
+          </w:p>
+        </w:tc>
+        <w:tc>
+          <w:tcPr>
+            <w:tcW w:type="dxa" w:w="1440"/>
+            <w:vAlign w:val="center"/>
+            <w:tcBorders>
+              <w:top w:val="single" w:sz="4" w:color="D9D9D9"/>
+              <w:left w:val="single" w:sz="4" w:color="D9D9D9"/>
+              <w:bottom w:val="single" w:sz="4" w:color="D9D9D9"/>
+              <w:right w:val="single" w:sz="4" w:color="D9D9D9"/>
+            </w:tcBorders>
+            <w:tcMar>
+              <w:top w:w="65" w:type="dxa"/>
+              <w:bottom w:w="65" w:type="dxa"/>
+              <w:left w:w="80" w:type="dxa"/>
+              <w:right w:w="80" w:type="dxa"/>
+            </w:tcMar>
+          </w:tcPr>
+          <w:p>
+            <w:pPr>
+              <w:spacing w:after="0" w:line="252" w:lineRule="auto"/>
+              <w:jc w:val="center"/>
+            </w:pPr>
+            <w:r>
+              <w:rPr>
+                <w:b w:val="0"/>
+                <w:sz w:val="19"/>
+              </w:rPr>
+              <w:t>0.6400</w:t>
+            </w:r>
+          </w:p>
+        </w:tc>
+        <w:tc>
+          <w:tcPr>
+            <w:tcW w:type="dxa" w:w="2016"/>
+            <w:vAlign w:val="center"/>
+            <w:tcBorders>
+              <w:top w:val="single" w:sz="4" w:color="D9D9D9"/>
+              <w:left w:val="single" w:sz="4" w:color="D9D9D9"/>
+              <w:bottom w:val="single" w:sz="4" w:color="D9D9D9"/>
+              <w:right w:val="single" w:sz="4" w:color="D9D9D9"/>
+            </w:tcBorders>
+            <w:tcMar>
+              <w:top w:w="65" w:type="dxa"/>
+              <w:bottom w:w="65" w:type="dxa"/>
+              <w:left w:w="80" w:type="dxa"/>
+              <w:right w:w="80" w:type="dxa"/>
+            </w:tcMar>
+          </w:tcPr>
+          <w:p>
+            <w:pPr>
+              <w:spacing w:after="0" w:line="252" w:lineRule="auto"/>
+              <w:jc w:val="center"/>
+            </w:pPr>
+            <w:r>
+              <w:rPr>
+                <w:b w:val="0"/>
+                <w:sz w:val="19"/>
+              </w:rPr>
+              <w:t>5 / 32</w:t>
+            </w:r>
+          </w:p>
+        </w:tc>
+        <w:tc>
+          <w:tcPr>
+            <w:tcW w:type="dxa" w:w="2016"/>
+            <w:vAlign w:val="center"/>
+            <w:tcBorders>
+              <w:top w:val="single" w:sz="4" w:color="D9D9D9"/>
+              <w:left w:val="single" w:sz="4" w:color="D9D9D9"/>
+              <w:bottom w:val="single" w:sz="4" w:color="D9D9D9"/>
+              <w:right w:val="single" w:sz="4" w:color="D9D9D9"/>
+            </w:tcBorders>
+            <w:tcMar>
+              <w:top w:w="65" w:type="dxa"/>
+              <w:bottom w:w="65" w:type="dxa"/>
+              <w:left w:w="80" w:type="dxa"/>
+              <w:right w:w="80" w:type="dxa"/>
+            </w:tcMar>
+          </w:tcPr>
+          <w:p>
+            <w:pPr>
+              <w:spacing w:after="0" w:line="252" w:lineRule="auto"/>
+              <w:jc w:val="center"/>
+            </w:pPr>
+            <w:r>
+              <w:rPr>
+                <w:b w:val="0"/>
+                <w:sz w:val="19"/>
+              </w:rPr>
+              <w:t>22 / 46</w:t>
+            </w:r>
+          </w:p>
+        </w:tc>
+      </w:tr>
+      <w:tr>
+        <w:trPr>
+          <w:cantSplit/>
+        </w:trPr>
+        <w:tc>
+          <w:tcPr>
+            <w:tcW w:type="dxa" w:w="1728"/>
+            <w:vAlign w:val="center"/>
+            <w:tcBorders>
+              <w:top w:val="single" w:sz="4" w:color="D9D9D9"/>
+              <w:left w:val="single" w:sz="4" w:color="D9D9D9"/>
+              <w:bottom w:val="single" w:sz="4" w:color="D9D9D9"/>
+              <w:right w:val="single" w:sz="4" w:color="D9D9D9"/>
+            </w:tcBorders>
+            <w:tcMar>
+              <w:top w:w="65" w:type="dxa"/>
+              <w:bottom w:w="65" w:type="dxa"/>
+              <w:left w:w="80" w:type="dxa"/>
+              <w:right w:w="80" w:type="dxa"/>
+            </w:tcMar>
+          </w:tcPr>
+          <w:p>
+            <w:pPr>
+              <w:spacing w:after="0" w:line="252" w:lineRule="auto"/>
+              <w:jc w:val="left"/>
+            </w:pPr>
+            <w:r>
+              <w:rPr>
+                <w:b w:val="0"/>
+                <w:sz w:val="19"/>
+              </w:rPr>
+              <w:t>Financial</w:t>
+            </w:r>
+          </w:p>
+        </w:tc>
+        <w:tc>
+          <w:tcPr>
+            <w:tcW w:type="dxa" w:w="1440"/>
+            <w:vAlign w:val="center"/>
+            <w:tcBorders>
+              <w:top w:val="single" w:sz="4" w:color="D9D9D9"/>
+              <w:left w:val="single" w:sz="4" w:color="D9D9D9"/>
+              <w:bottom w:val="single" w:sz="4" w:color="D9D9D9"/>
+              <w:right w:val="single" w:sz="4" w:color="D9D9D9"/>
+            </w:tcBorders>
+            <w:tcMar>
+              <w:top w:w="65" w:type="dxa"/>
+              <w:bottom w:w="65" w:type="dxa"/>
+              <w:left w:w="80" w:type="dxa"/>
+              <w:right w:w="80" w:type="dxa"/>
+            </w:tcMar>
+          </w:tcPr>
+          <w:p>
+            <w:pPr>
+              <w:spacing w:after="0" w:line="252" w:lineRule="auto"/>
+              <w:jc w:val="center"/>
+            </w:pPr>
+            <w:r>
+              <w:rPr>
+                <w:b w:val="0"/>
+                <w:sz w:val="19"/>
+              </w:rPr>
+              <w:t>Adapted</w:t>
+            </w:r>
+          </w:p>
+        </w:tc>
+        <w:tc>
+          <w:tcPr>
+            <w:tcW w:type="dxa" w:w="1440"/>
+            <w:vAlign w:val="center"/>
+            <w:tcBorders>
+              <w:top w:val="single" w:sz="4" w:color="D9D9D9"/>
+              <w:left w:val="single" w:sz="4" w:color="D9D9D9"/>
+              <w:bottom w:val="single" w:sz="4" w:color="D9D9D9"/>
+              <w:right w:val="single" w:sz="4" w:color="D9D9D9"/>
+            </w:tcBorders>
+            <w:tcMar>
+              <w:top w:w="65" w:type="dxa"/>
+              <w:bottom w:w="65" w:type="dxa"/>
+              <w:left w:w="80" w:type="dxa"/>
+              <w:right w:w="80" w:type="dxa"/>
+            </w:tcMar>
+          </w:tcPr>
+          <w:p>
+            <w:pPr>
+              <w:spacing w:after="0" w:line="252" w:lineRule="auto"/>
+              <w:jc w:val="center"/>
+            </w:pPr>
+            <w:r>
+              <w:rPr>
+                <w:b w:val="0"/>
+                <w:sz w:val="19"/>
+              </w:rPr>
+              <w:t>80.43%</w:t>
+            </w:r>
+          </w:p>
+        </w:tc>
+        <w:tc>
+          <w:tcPr>
+            <w:tcW w:type="dxa" w:w="1440"/>
+            <w:vAlign w:val="center"/>
+            <w:tcBorders>
+              <w:top w:val="single" w:sz="4" w:color="D9D9D9"/>
+              <w:left w:val="single" w:sz="4" w:color="D9D9D9"/>
+              <w:bottom w:val="single" w:sz="4" w:color="D9D9D9"/>
+              <w:right w:val="single" w:sz="4" w:color="D9D9D9"/>
+            </w:tcBorders>
+            <w:tcMar>
+              <w:top w:w="65" w:type="dxa"/>
+              <w:bottom w:w="65" w:type="dxa"/>
+              <w:left w:w="80" w:type="dxa"/>
+              <w:right w:w="80" w:type="dxa"/>
+            </w:tcMar>
+          </w:tcPr>
+          <w:p>
+            <w:pPr>
+              <w:spacing w:after="0" w:line="252" w:lineRule="auto"/>
+              <w:jc w:val="center"/>
+            </w:pPr>
+            <w:r>
+              <w:rPr>
+                <w:b w:val="0"/>
+                <w:sz w:val="19"/>
+              </w:rPr>
+              <w:t>0.8605</w:t>
+            </w:r>
+          </w:p>
+        </w:tc>
+        <w:tc>
+          <w:tcPr>
+            <w:tcW w:type="dxa" w:w="2016"/>
+            <w:vAlign w:val="center"/>
+            <w:tcBorders>
+              <w:top w:val="single" w:sz="4" w:color="D9D9D9"/>
+              <w:left w:val="single" w:sz="4" w:color="D9D9D9"/>
+              <w:bottom w:val="single" w:sz="4" w:color="D9D9D9"/>
+              <w:right w:val="single" w:sz="4" w:color="D9D9D9"/>
+            </w:tcBorders>
+            <w:tcMar>
+              <w:top w:w="65" w:type="dxa"/>
+              <w:bottom w:w="65" w:type="dxa"/>
+              <w:left w:w="80" w:type="dxa"/>
+              <w:right w:w="80" w:type="dxa"/>
+            </w:tcMar>
+          </w:tcPr>
+          <w:p>
+            <w:pPr>
+              <w:spacing w:after="0" w:line="252" w:lineRule="auto"/>
+              <w:jc w:val="center"/>
+            </w:pPr>
+            <w:r>
+              <w:rPr>
+                <w:b w:val="0"/>
+                <w:sz w:val="19"/>
+              </w:rPr>
+              <w:t>3 / 32</w:t>
+            </w:r>
+          </w:p>
+        </w:tc>
+        <w:tc>
+          <w:tcPr>
+            <w:tcW w:type="dxa" w:w="2016"/>
+            <w:vAlign w:val="center"/>
+            <w:tcBorders>
+              <w:top w:val="single" w:sz="4" w:color="D9D9D9"/>
+              <w:left w:val="single" w:sz="4" w:color="D9D9D9"/>
+              <w:bottom w:val="single" w:sz="4" w:color="D9D9D9"/>
+              <w:right w:val="single" w:sz="4" w:color="D9D9D9"/>
+            </w:tcBorders>
+            <w:tcMar>
+              <w:top w:w="65" w:type="dxa"/>
+              <w:bottom w:w="65" w:type="dxa"/>
+              <w:left w:w="80" w:type="dxa"/>
+              <w:right w:w="80" w:type="dxa"/>
+            </w:tcMar>
+          </w:tcPr>
+          <w:p>
+            <w:pPr>
+              <w:spacing w:after="0" w:line="252" w:lineRule="auto"/>
+              <w:jc w:val="center"/>
+            </w:pPr>
+            <w:r>
+              <w:rPr>
+                <w:b w:val="0"/>
+                <w:sz w:val="19"/>
+              </w:rPr>
+              <w:t>9 / 46</w:t>
+            </w:r>
+          </w:p>
+        </w:tc>
+      </w:tr>
+      <w:tr>
+        <w:trPr>
+          <w:cantSplit/>
+        </w:trPr>
+        <w:tc>
+          <w:tcPr>
+            <w:tcW w:type="dxa" w:w="1728"/>
+            <w:vAlign w:val="center"/>
+            <w:tcBorders>
+              <w:top w:val="single" w:sz="4" w:color="D9D9D9"/>
+              <w:left w:val="single" w:sz="4" w:color="D9D9D9"/>
+              <w:bottom w:val="single" w:sz="4" w:color="D9D9D9"/>
+              <w:right w:val="single" w:sz="4" w:color="D9D9D9"/>
+            </w:tcBorders>
+            <w:tcMar>
+              <w:top w:w="65" w:type="dxa"/>
+              <w:bottom w:w="65" w:type="dxa"/>
+              <w:left w:w="80" w:type="dxa"/>
+              <w:right w:w="80" w:type="dxa"/>
+            </w:tcMar>
+          </w:tcPr>
+          <w:p>
+            <w:pPr>
+              <w:spacing w:after="0" w:line="252" w:lineRule="auto"/>
+              <w:jc w:val="left"/>
+            </w:pPr>
+            <w:r>
+              <w:rPr>
+                <w:b w:val="0"/>
+                <w:sz w:val="19"/>
+              </w:rPr>
+              <w:t>SMS history</w:t>
+            </w:r>
+          </w:p>
+        </w:tc>
+        <w:tc>
+          <w:tcPr>
+            <w:tcW w:type="dxa" w:w="1440"/>
+            <w:vAlign w:val="center"/>
+            <w:tcBorders>
+              <w:top w:val="single" w:sz="4" w:color="D9D9D9"/>
+              <w:left w:val="single" w:sz="4" w:color="D9D9D9"/>
+              <w:bottom w:val="single" w:sz="4" w:color="D9D9D9"/>
+              <w:right w:val="single" w:sz="4" w:color="D9D9D9"/>
+            </w:tcBorders>
+            <w:tcMar>
+              <w:top w:w="65" w:type="dxa"/>
+              <w:bottom w:w="65" w:type="dxa"/>
+              <w:left w:w="80" w:type="dxa"/>
+              <w:right w:w="80" w:type="dxa"/>
+            </w:tcMar>
+          </w:tcPr>
+          <w:p>
+            <w:pPr>
+              <w:spacing w:after="0" w:line="252" w:lineRule="auto"/>
+              <w:jc w:val="center"/>
+            </w:pPr>
+            <w:r>
+              <w:rPr>
+                <w:b w:val="0"/>
+                <w:sz w:val="19"/>
+              </w:rPr>
+              <w:t>Original</w:t>
+            </w:r>
+          </w:p>
+        </w:tc>
+        <w:tc>
+          <w:tcPr>
+            <w:tcW w:type="dxa" w:w="1440"/>
+            <w:vAlign w:val="center"/>
+            <w:tcBorders>
+              <w:top w:val="single" w:sz="4" w:color="D9D9D9"/>
+              <w:left w:val="single" w:sz="4" w:color="D9D9D9"/>
+              <w:bottom w:val="single" w:sz="4" w:color="D9D9D9"/>
+              <w:right w:val="single" w:sz="4" w:color="D9D9D9"/>
+            </w:tcBorders>
+            <w:tcMar>
+              <w:top w:w="65" w:type="dxa"/>
+              <w:bottom w:w="65" w:type="dxa"/>
+              <w:left w:w="80" w:type="dxa"/>
+              <w:right w:w="80" w:type="dxa"/>
+            </w:tcMar>
+          </w:tcPr>
+          <w:p>
+            <w:pPr>
+              <w:spacing w:after="0" w:line="252" w:lineRule="auto"/>
+              <w:jc w:val="center"/>
+            </w:pPr>
+            <w:r>
+              <w:rPr>
+                <w:b w:val="0"/>
+                <w:sz w:val="19"/>
+              </w:rPr>
+              <w:t>42.63%</w:t>
+            </w:r>
+          </w:p>
+        </w:tc>
+        <w:tc>
+          <w:tcPr>
+            <w:tcW w:type="dxa" w:w="1440"/>
+            <w:vAlign w:val="center"/>
+            <w:tcBorders>
+              <w:top w:val="single" w:sz="4" w:color="D9D9D9"/>
+              <w:left w:val="single" w:sz="4" w:color="D9D9D9"/>
+              <w:bottom w:val="single" w:sz="4" w:color="D9D9D9"/>
+              <w:right w:val="single" w:sz="4" w:color="D9D9D9"/>
+            </w:tcBorders>
+            <w:tcMar>
+              <w:top w:w="65" w:type="dxa"/>
+              <w:bottom w:w="65" w:type="dxa"/>
+              <w:left w:w="80" w:type="dxa"/>
+              <w:right w:w="80" w:type="dxa"/>
+            </w:tcMar>
+          </w:tcPr>
+          <w:p>
+            <w:pPr>
+              <w:spacing w:after="0" w:line="252" w:lineRule="auto"/>
+              <w:jc w:val="center"/>
+            </w:pPr>
+            <w:r>
+              <w:rPr>
+                <w:b w:val="0"/>
+                <w:sz w:val="19"/>
+              </w:rPr>
+              <w:t>0.5913</w:t>
+            </w:r>
+          </w:p>
+        </w:tc>
+        <w:tc>
+          <w:tcPr>
+            <w:tcW w:type="dxa" w:w="2016"/>
+            <w:vAlign w:val="center"/>
+            <w:tcBorders>
+              <w:top w:val="single" w:sz="4" w:color="D9D9D9"/>
+              <w:left w:val="single" w:sz="4" w:color="D9D9D9"/>
+              <w:bottom w:val="single" w:sz="4" w:color="D9D9D9"/>
+              <w:right w:val="single" w:sz="4" w:color="D9D9D9"/>
+            </w:tcBorders>
+            <w:tcMar>
+              <w:top w:w="65" w:type="dxa"/>
+              <w:bottom w:w="65" w:type="dxa"/>
+              <w:left w:w="80" w:type="dxa"/>
+              <w:right w:w="80" w:type="dxa"/>
+            </w:tcMar>
+          </w:tcPr>
+          <w:p>
+            <w:pPr>
+              <w:spacing w:after="0" w:line="252" w:lineRule="auto"/>
+              <w:jc w:val="center"/>
+            </w:pPr>
+            <w:r>
+              <w:rPr>
+                <w:b w:val="0"/>
+                <w:sz w:val="19"/>
+              </w:rPr>
+              <w:t>11 / 55</w:t>
+            </w:r>
+          </w:p>
+        </w:tc>
+        <w:tc>
+          <w:tcPr>
+            <w:tcW w:type="dxa" w:w="2016"/>
+            <w:vAlign w:val="center"/>
+            <w:tcBorders>
+              <w:top w:val="single" w:sz="4" w:color="D9D9D9"/>
+              <w:left w:val="single" w:sz="4" w:color="D9D9D9"/>
+              <w:bottom w:val="single" w:sz="4" w:color="D9D9D9"/>
+              <w:right w:val="single" w:sz="4" w:color="D9D9D9"/>
+            </w:tcBorders>
+            <w:tcMar>
+              <w:top w:w="65" w:type="dxa"/>
+              <w:bottom w:w="65" w:type="dxa"/>
+              <w:left w:w="80" w:type="dxa"/>
+              <w:right w:w="80" w:type="dxa"/>
+            </w:tcMar>
+          </w:tcPr>
+          <w:p>
+            <w:pPr>
+              <w:spacing w:after="0" w:line="252" w:lineRule="auto"/>
+              <w:jc w:val="center"/>
+            </w:pPr>
+            <w:r>
+              <w:rPr>
+                <w:b w:val="0"/>
+                <w:sz w:val="19"/>
+              </w:rPr>
+              <w:t>401 / 699</w:t>
+            </w:r>
+          </w:p>
+        </w:tc>
+      </w:tr>
+      <w:tr>
+        <w:trPr>
+          <w:cantSplit/>
+        </w:trPr>
+        <w:tc>
+          <w:tcPr>
+            <w:tcW w:type="dxa" w:w="1728"/>
+            <w:vAlign w:val="center"/>
+            <w:tcBorders>
+              <w:top w:val="single" w:sz="4" w:color="D9D9D9"/>
+              <w:left w:val="single" w:sz="4" w:color="D9D9D9"/>
+              <w:bottom w:val="single" w:sz="4" w:color="D9D9D9"/>
+              <w:right w:val="single" w:sz="4" w:color="D9D9D9"/>
+            </w:tcBorders>
+            <w:tcMar>
+              <w:top w:w="65" w:type="dxa"/>
+              <w:bottom w:w="65" w:type="dxa"/>
+              <w:left w:w="80" w:type="dxa"/>
+              <w:right w:w="80" w:type="dxa"/>
+            </w:tcMar>
+          </w:tcPr>
+          <w:p>
+            <w:pPr>
+              <w:spacing w:after="0" w:line="252" w:lineRule="auto"/>
+              <w:jc w:val="left"/>
+            </w:pPr>
+            <w:r>
+              <w:rPr>
+                <w:b w:val="0"/>
+                <w:sz w:val="19"/>
+              </w:rPr>
+              <w:t>SMS history</w:t>
+            </w:r>
+          </w:p>
+        </w:tc>
+        <w:tc>
+          <w:tcPr>
+            <w:tcW w:type="dxa" w:w="1440"/>
+            <w:vAlign w:val="center"/>
+            <w:tcBorders>
+              <w:top w:val="single" w:sz="4" w:color="D9D9D9"/>
+              <w:left w:val="single" w:sz="4" w:color="D9D9D9"/>
+              <w:bottom w:val="single" w:sz="4" w:color="D9D9D9"/>
+              <w:right w:val="single" w:sz="4" w:color="D9D9D9"/>
+            </w:tcBorders>
+            <w:tcMar>
+              <w:top w:w="65" w:type="dxa"/>
+              <w:bottom w:w="65" w:type="dxa"/>
+              <w:left w:w="80" w:type="dxa"/>
+              <w:right w:w="80" w:type="dxa"/>
+            </w:tcMar>
+          </w:tcPr>
+          <w:p>
+            <w:pPr>
+              <w:spacing w:after="0" w:line="252" w:lineRule="auto"/>
+              <w:jc w:val="center"/>
+            </w:pPr>
+            <w:r>
+              <w:rPr>
+                <w:b w:val="0"/>
+                <w:sz w:val="19"/>
+              </w:rPr>
+              <w:t>Adapted</w:t>
+            </w:r>
+          </w:p>
+        </w:tc>
+        <w:tc>
+          <w:tcPr>
+            <w:tcW w:type="dxa" w:w="1440"/>
+            <w:vAlign w:val="center"/>
+            <w:tcBorders>
+              <w:top w:val="single" w:sz="4" w:color="D9D9D9"/>
+              <w:left w:val="single" w:sz="4" w:color="D9D9D9"/>
+              <w:bottom w:val="single" w:sz="4" w:color="D9D9D9"/>
+              <w:right w:val="single" w:sz="4" w:color="D9D9D9"/>
+            </w:tcBorders>
+            <w:tcMar>
+              <w:top w:w="65" w:type="dxa"/>
+              <w:bottom w:w="65" w:type="dxa"/>
+              <w:left w:w="80" w:type="dxa"/>
+              <w:right w:w="80" w:type="dxa"/>
+            </w:tcMar>
+          </w:tcPr>
+          <w:p>
+            <w:pPr>
+              <w:spacing w:after="0" w:line="252" w:lineRule="auto"/>
+              <w:jc w:val="center"/>
+            </w:pPr>
+            <w:r>
+              <w:rPr>
+                <w:b w:val="0"/>
+                <w:sz w:val="19"/>
+              </w:rPr>
+              <w:t>58.66%</w:t>
+            </w:r>
+          </w:p>
+        </w:tc>
+        <w:tc>
+          <w:tcPr>
+            <w:tcW w:type="dxa" w:w="1440"/>
+            <w:vAlign w:val="center"/>
+            <w:tcBorders>
+              <w:top w:val="single" w:sz="4" w:color="D9D9D9"/>
+              <w:left w:val="single" w:sz="4" w:color="D9D9D9"/>
+              <w:bottom w:val="single" w:sz="4" w:color="D9D9D9"/>
+              <w:right w:val="single" w:sz="4" w:color="D9D9D9"/>
+            </w:tcBorders>
+            <w:tcMar>
+              <w:top w:w="65" w:type="dxa"/>
+              <w:bottom w:w="65" w:type="dxa"/>
+              <w:left w:w="80" w:type="dxa"/>
+              <w:right w:w="80" w:type="dxa"/>
+            </w:tcMar>
+          </w:tcPr>
+          <w:p>
+            <w:pPr>
+              <w:spacing w:after="0" w:line="252" w:lineRule="auto"/>
+              <w:jc w:val="center"/>
+            </w:pPr>
+            <w:r>
+              <w:rPr>
+                <w:b w:val="0"/>
+                <w:sz w:val="19"/>
+              </w:rPr>
+              <w:t>0.7270</w:t>
+            </w:r>
+          </w:p>
+        </w:tc>
+        <w:tc>
+          <w:tcPr>
+            <w:tcW w:type="dxa" w:w="2016"/>
+            <w:vAlign w:val="center"/>
+            <w:tcBorders>
+              <w:top w:val="single" w:sz="4" w:color="D9D9D9"/>
+              <w:left w:val="single" w:sz="4" w:color="D9D9D9"/>
+              <w:bottom w:val="single" w:sz="4" w:color="D9D9D9"/>
+              <w:right w:val="single" w:sz="4" w:color="D9D9D9"/>
+            </w:tcBorders>
+            <w:tcMar>
+              <w:top w:w="65" w:type="dxa"/>
+              <w:bottom w:w="65" w:type="dxa"/>
+              <w:left w:w="80" w:type="dxa"/>
+              <w:right w:w="80" w:type="dxa"/>
+            </w:tcMar>
+          </w:tcPr>
+          <w:p>
+            <w:pPr>
+              <w:spacing w:after="0" w:line="252" w:lineRule="auto"/>
+              <w:jc w:val="center"/>
+            </w:pPr>
+            <w:r>
+              <w:rPr>
+                <w:b w:val="0"/>
+                <w:sz w:val="19"/>
+              </w:rPr>
+              <w:t>19 / 55</w:t>
+            </w:r>
+          </w:p>
+        </w:tc>
+        <w:tc>
+          <w:tcPr>
+            <w:tcW w:type="dxa" w:w="2016"/>
+            <w:vAlign w:val="center"/>
+            <w:tcBorders>
+              <w:top w:val="single" w:sz="4" w:color="D9D9D9"/>
+              <w:left w:val="single" w:sz="4" w:color="D9D9D9"/>
+              <w:bottom w:val="single" w:sz="4" w:color="D9D9D9"/>
+              <w:right w:val="single" w:sz="4" w:color="D9D9D9"/>
+            </w:tcBorders>
+            <w:tcMar>
+              <w:top w:w="65" w:type="dxa"/>
+              <w:bottom w:w="65" w:type="dxa"/>
+              <w:left w:w="80" w:type="dxa"/>
+              <w:right w:w="80" w:type="dxa"/>
+            </w:tcMar>
+          </w:tcPr>
+          <w:p>
+            <w:pPr>
+              <w:spacing w:after="0" w:line="252" w:lineRule="auto"/>
+              <w:jc w:val="center"/>
+            </w:pPr>
+            <w:r>
+              <w:rPr>
+                <w:b w:val="0"/>
+                <w:sz w:val="19"/>
+              </w:rPr>
+              <w:t>289 / 699</w:t>
+            </w:r>
+          </w:p>
+        </w:tc>
+      </w:tr>
+    </w:tbl>
+    <w:p>
+      <w:pPr>
+        <w:spacing w:after="0"/>
+      </w:pPr>
+    </w:p>
+    <w:p>
+      <w:r>
+        <w:t>The independent source gains 112 spam detections but eight additional false positives. Paired conditional 95% group-bootstrap intervals are +0.0998 to +0.1721 for F1 change and +1.79 to +28.07 percentage points for FPR change (5,000 resamples, seed 20261018). ROC-AUC falls from 0.6979 to 0.6466. The financial holdout's F1 change interval is +0.1102 to +0.3457; its FPR-change interval includes zero. The predeclared replacement criterion requires a positive 95% lower bound for independent F1 improvement and FPR no worse than baseline and &lt;=1% on each new test source. It fails. The candidate remains experimental and the default is unchanged. Small, narrow ham samples and source/language differences limit generalization.</w:t>
+      </w:r>
+    </w:p>
+    <w:p>
+      <w:r>
+        <w:br w:type="page"/>
+      </w:r>
+    </w:p>
+    <w:p>
+      <w:pPr>
+        <w:pStyle w:val="Heading1"/>
+      </w:pPr>
+      <w:r>
+        <w:t>12 Reproducibility and conclusion</w:t>
+      </w:r>
+    </w:p>
+    <w:p>
+      <w:r>
+        <w:t>The repository supplies split/CV manifests, all 84 search results, validation and test metrics, attack realizations, error ledgers, intervals and fitted-pipeline export. Dataset, source code and artifacts have SHA-256 records. Both historical protocols were independently verified, including all 7,920 attack metric rows per run. Python 3.12.14, scikit-learn 1.9.1 and exact dependencies are recorded. scripts/verify_external.py reconstructs the separate IMC scores, decisions and summaries from the original fitted pipeline. Verification requires hash-matched local models; binaries are excluded from Git and runs cannot silently overwrite frozen outputs.</w:t>
+      </w:r>
+    </w:p>
+    <w:p>
+      <w:r>
+        <w:t>The adaptation follow-up records six fitted candidates, 18,204 validation scores and 1,664 test scores. scripts/verify_adaptation.py independently checks thresholds by exhaustive search, metrics and paired intervals by resampling message rows through whole groups. No model fitting occurs during verification. docs/MODERN_ADAPTATION.md documents the sources, fixed protocol, failed replacement criterion and reproduction commands.</w:t>
+      </w:r>
+    </w:p>
+    <w:p>
+      <w:r>
+        <w:t>The word model combines high historical F1 with sensitivity to separator edits and limited source transfer. Refitting on newer messages improves spam recall and same-source financial F1, but increases false positives on independent government notifications. This measured tradeoff prevents replacing the default. Further progress needs more diverse genuine ordinary SMS and a new untouched test; the reported holdouts must not be reused as independent evidence after tuning on these findings.</w:t>
       </w:r>
     </w:p>
     <w:p>
@@ -5767,6 +6792,28 @@
           <w:sz w:val="19"/>
         </w:rPr>
         <w:t>[9] S. Agarwal, A. Papasavva, G. Suarez-Tangil and M. Vasek. Fishing for Smishing: Understanding SMS Phishing Infrastructure and Strategies by Mining Public User Reports. ACM IMC, 2025. DOI: 10.1145/3730567.3764431. Dataset: https://github.com/reportsmishing/Smishing-Dataset-IMC25</w:t>
+      </w:r>
+    </w:p>
+    <w:p>
+      <w:pPr>
+        <w:spacing w:after="140"/>
+      </w:pPr>
+      <w:r>
+        <w:rPr>
+          <w:sz w:val="19"/>
+        </w:rPr>
+        <w:t>[10] A. R. Ahmed and G. F. Islam. Financial scams detection dataset. Mendeley Data, version 2, 22 October 2025. CC BY 4.0. DOI: 10.17632/znsk27yk3h.2. https://data.mendeley.com/datasets/znsk27yk3h/2</w:t>
+      </w:r>
+    </w:p>
+    <w:p>
+      <w:pPr>
+        <w:spacing w:after="140"/>
+      </w:pPr>
+      <w:r>
+        <w:rPr>
+          <w:sz w:val="19"/>
+        </w:rPr>
+        <w:t>[11] S. L. Chua. Spam of the Times: spam and marketing SMS. CC BY 4.0. Snapshot ad50c348c53f738645f78ee8baa8be5082a1de91, 20 August 2026. https://github.com/scottleechua/data/tree/ad50c348c53f738645f78ee8baa8be5082a1de91/spam-and-marketing-sms</w:t>
       </w:r>
     </w:p>
     <w:sectPr>

</xml_diff>

<commit_message>
Document ordinary-SMS expansion and remaining false positives
</commit_message>
<xml_diff>
--- a/paper/SMS_Spam_Detection_Paper.docx
+++ b/paper/SMS_Spam_Detection_Paper.docx
@@ -27,7 +27,7 @@
     </w:p>
     <w:p>
       <w:r>
-        <w:t>This study evaluates eleven sparse classifiers on the historical English SMS Spam Collection, separating training search, validation thresholds and final testing. After deduplication, 5,171 messages remain in grouped splits. The selected word TF-IDF LinearSVC achieves spam F1 0.9531, with four false positives and eight misses among 1,034 test messages. Its conditional 95% group-bootstrap F1 interval is 0.9249 to 0.9769. Separator insertion lowers mean recall from 0.9385 to 0.6035. On 372 independent English reports with explicit 2023–2024 years, the unchanged model detects 176: recall 47.31%. We then refit with newer spam and ordinary financial messages under a separate frozen protocol. On another independent source, recall rises from 42.63% to 58.66%, but false positives on government notifications rise from 11/55 to 19/55. A separate financial holdout improves from F1 0.6400 to 0.8605. The adapted candidate fails the predeclared replacement criterion. Higher historical or spam-class F1 does not establish reliable transfer or acceptable harm to legitimate messages.</w:t>
+        <w:t>This study evaluates eleven sparse classifiers on the historical English SMS Spam Collection, separating training search, validation thresholds and final testing. The selected word TF-IDF LinearSVC achieves spam F1 0.9531, with four false positives and eight misses among 1,034 test messages. Its conditional 95% group-bootstrap F1 interval is 0.9249 to 0.9769. Separator insertion lowers mean recall from 0.9385 to 0.6035. On 372 independent English reports dated 2023–2024, the unchanged model detects 176: recall 47.31%. A first adaptation improves independent SMS recall but increases false positives on government notifications from 11/55 to 19/55. A second study adds 1,968 ordinary training SMS from an author corpus covering 2018–2023. On its new group holdout, false positives change from 17 to 14 of 1,178 ham, while recall rises from 73.26% to 95.22% on 7,109 spam messages. The FPR difference is statistically inconclusive and 1.19% exceeds the 1% target. Both candidates fail their replacement criteria. These findings distinguish improved spam detection from demonstrated protection of legitimate communication.</w:t>
       </w:r>
     </w:p>
     <w:p>
@@ -6664,22 +6664,1047 @@
         <w:pStyle w:val="Heading1"/>
       </w:pPr>
       <w:r>
-        <w:t>12 Reproducibility and conclusion</w:t>
+        <w:t>12 Expanding ordinary SMS to reduce false positives</w:t>
       </w:r>
     </w:p>
     <w:p>
       <w:r>
-        <w:t>The repository supplies split/CV manifests, all 84 search results, validation and test metrics, attack realizations, error ledgers, intervals and fitted-pipeline export. Dataset, source code and artifacts have SHA-256 records. Both historical protocols were independently verified, including all 7,920 attack metric rows per run. Python 3.12.14, scikit-learn 1.9.1 and exact dependencies are recorded. scripts/verify_external.py reconstructs the separate IMC scores, decisions and summaries from the original fitted pipeline. Verification requires hash-matched local models; binaries are excluded from Git and runs cannot silently overwrite frozen outputs.</w:t>
+        <w:t>We next use Salman et al.'s Super SMS Dataset [12], specifically the author-labeled 2018–2023 subset: 4,028 ham and 25,375 spam before screening. The paper describes 2,325 ham collected from consenting volunteers during October 2021–June 2023, but their rows and receipt dates are not individually identified. The authors offer research access without a standard data license; raw messages are not redistributed. This is not representative 2025–2026 traffic.</w:t>
       </w:r>
     </w:p>
     <w:p>
       <w:r>
-        <w:t>The adaptation follow-up records six fitted candidates, 18,204 validation scores and 1,664 test scores. scripts/verify_adaptation.py independently checks thresholds by exhaustive search, metrics and paired intervals by resampling message rows through whole groups. No model fitting occurs during verification. docs/MODERN_ADAPTATION.md documents the sources, fixed protocol, failed replacement criterion and reproduction commands.</w:t>
+        <w:t>The protocol and membership were merged before fitting (PR #14). We remove duplicates, conflicts and similarity &gt;=0.85 overlaps with every previously acquired source, then form near-copy connected components before a stratified 50/20/30 group split. New training adds 1,968 ham and 11,860 spam; new validation has 787 ham and 4,497 spam. The previous SMS-history test becomes development and cannot supply independent evidence again. Total training has 29,593 messages and validation 8,443. Six word/character candidates vary C in {0.5, 1} and ham weighting in {1, 2, 4}; source and group balancing remain explicit. Validation selects C=1, multiplier=1 and threshold 0.48587418949350525 under separate 1% FPR constraints per ham source.</w:t>
+      </w:r>
+    </w:p>
+    <w:p>
+      <w:pPr>
+        <w:pStyle w:val="Caption"/>
+        <w:keepNext/>
+      </w:pPr>
+      <w:r>
+        <w:t>Table 7. All four operating points on the same untouched 8,287-message group holdout.</w:t>
+      </w:r>
+    </w:p>
+    <w:tbl>
+      <w:tblPr>
+        <w:tblW w:type="auto" w:w="0"/>
+        <w:jc w:val="center"/>
+        <w:tblLayout w:type="fixed"/>
+        <w:tblLook w:firstColumn="1" w:firstRow="1" w:lastColumn="0" w:lastRow="0" w:noHBand="0" w:noVBand="1" w:val="04A0"/>
+      </w:tblPr>
+      <w:tblGrid>
+        <w:gridCol w:w="2376"/>
+        <w:gridCol w:w="1584"/>
+        <w:gridCol w:w="1152"/>
+        <w:gridCol w:w="1944"/>
+        <w:gridCol w:w="1440"/>
+        <w:gridCol w:w="1584"/>
+      </w:tblGrid>
+      <w:tr>
+        <w:trPr>
+          <w:tblHeader/>
+          <w:cantSplit/>
+        </w:trPr>
+        <w:tc>
+          <w:tcPr>
+            <w:tcW w:type="dxa" w:w="2376"/>
+            <w:vAlign w:val="center"/>
+            <w:tcBorders>
+              <w:top w:val="single" w:sz="4" w:color="D9D9D9"/>
+              <w:left w:val="single" w:sz="4" w:color="D9D9D9"/>
+              <w:bottom w:val="single" w:sz="4" w:color="D9D9D9"/>
+              <w:right w:val="single" w:sz="4" w:color="D9D9D9"/>
+            </w:tcBorders>
+            <w:tcMar>
+              <w:top w:w="65" w:type="dxa"/>
+              <w:bottom w:w="65" w:type="dxa"/>
+              <w:left w:w="80" w:type="dxa"/>
+              <w:right w:w="80" w:type="dxa"/>
+            </w:tcMar>
+            <w:shd w:fill="EAEAEA"/>
+          </w:tcPr>
+          <w:p>
+            <w:pPr>
+              <w:spacing w:after="0" w:line="252" w:lineRule="auto"/>
+              <w:jc w:val="left"/>
+            </w:pPr>
+            <w:r>
+              <w:rPr>
+                <w:b/>
+                <w:sz w:val="19"/>
+              </w:rPr>
+              <w:t>Model</w:t>
+            </w:r>
+          </w:p>
+        </w:tc>
+        <w:tc>
+          <w:tcPr>
+            <w:tcW w:type="dxa" w:w="1584"/>
+            <w:vAlign w:val="center"/>
+            <w:tcBorders>
+              <w:top w:val="single" w:sz="4" w:color="D9D9D9"/>
+              <w:left w:val="single" w:sz="4" w:color="D9D9D9"/>
+              <w:bottom w:val="single" w:sz="4" w:color="D9D9D9"/>
+              <w:right w:val="single" w:sz="4" w:color="D9D9D9"/>
+            </w:tcBorders>
+            <w:tcMar>
+              <w:top w:w="65" w:type="dxa"/>
+              <w:bottom w:w="65" w:type="dxa"/>
+              <w:left w:w="80" w:type="dxa"/>
+              <w:right w:w="80" w:type="dxa"/>
+            </w:tcMar>
+            <w:shd w:fill="EAEAEA"/>
+          </w:tcPr>
+          <w:p>
+            <w:pPr>
+              <w:spacing w:after="0" w:line="252" w:lineRule="auto"/>
+              <w:jc w:val="center"/>
+            </w:pPr>
+            <w:r>
+              <w:rPr>
+                <w:b/>
+                <w:sz w:val="19"/>
+              </w:rPr>
+              <w:t>FP / ham</w:t>
+            </w:r>
+          </w:p>
+        </w:tc>
+        <w:tc>
+          <w:tcPr>
+            <w:tcW w:type="dxa" w:w="1152"/>
+            <w:vAlign w:val="center"/>
+            <w:tcBorders>
+              <w:top w:val="single" w:sz="4" w:color="D9D9D9"/>
+              <w:left w:val="single" w:sz="4" w:color="D9D9D9"/>
+              <w:bottom w:val="single" w:sz="4" w:color="D9D9D9"/>
+              <w:right w:val="single" w:sz="4" w:color="D9D9D9"/>
+            </w:tcBorders>
+            <w:tcMar>
+              <w:top w:w="65" w:type="dxa"/>
+              <w:bottom w:w="65" w:type="dxa"/>
+              <w:left w:w="80" w:type="dxa"/>
+              <w:right w:w="80" w:type="dxa"/>
+            </w:tcMar>
+            <w:shd w:fill="EAEAEA"/>
+          </w:tcPr>
+          <w:p>
+            <w:pPr>
+              <w:spacing w:after="0" w:line="252" w:lineRule="auto"/>
+              <w:jc w:val="center"/>
+            </w:pPr>
+            <w:r>
+              <w:rPr>
+                <w:b/>
+                <w:sz w:val="19"/>
+              </w:rPr>
+              <w:t>FPR</w:t>
+            </w:r>
+          </w:p>
+        </w:tc>
+        <w:tc>
+          <w:tcPr>
+            <w:tcW w:type="dxa" w:w="1944"/>
+            <w:vAlign w:val="center"/>
+            <w:tcBorders>
+              <w:top w:val="single" w:sz="4" w:color="D9D9D9"/>
+              <w:left w:val="single" w:sz="4" w:color="D9D9D9"/>
+              <w:bottom w:val="single" w:sz="4" w:color="D9D9D9"/>
+              <w:right w:val="single" w:sz="4" w:color="D9D9D9"/>
+            </w:tcBorders>
+            <w:tcMar>
+              <w:top w:w="65" w:type="dxa"/>
+              <w:bottom w:w="65" w:type="dxa"/>
+              <w:left w:w="80" w:type="dxa"/>
+              <w:right w:w="80" w:type="dxa"/>
+            </w:tcMar>
+            <w:shd w:fill="EAEAEA"/>
+          </w:tcPr>
+          <w:p>
+            <w:pPr>
+              <w:spacing w:after="0" w:line="252" w:lineRule="auto"/>
+              <w:jc w:val="center"/>
+            </w:pPr>
+            <w:r>
+              <w:rPr>
+                <w:b/>
+                <w:sz w:val="19"/>
+              </w:rPr>
+              <w:t>FN / spam</w:t>
+            </w:r>
+          </w:p>
+        </w:tc>
+        <w:tc>
+          <w:tcPr>
+            <w:tcW w:type="dxa" w:w="1440"/>
+            <w:vAlign w:val="center"/>
+            <w:tcBorders>
+              <w:top w:val="single" w:sz="4" w:color="D9D9D9"/>
+              <w:left w:val="single" w:sz="4" w:color="D9D9D9"/>
+              <w:bottom w:val="single" w:sz="4" w:color="D9D9D9"/>
+              <w:right w:val="single" w:sz="4" w:color="D9D9D9"/>
+            </w:tcBorders>
+            <w:tcMar>
+              <w:top w:w="65" w:type="dxa"/>
+              <w:bottom w:w="65" w:type="dxa"/>
+              <w:left w:w="80" w:type="dxa"/>
+              <w:right w:w="80" w:type="dxa"/>
+            </w:tcMar>
+            <w:shd w:fill="EAEAEA"/>
+          </w:tcPr>
+          <w:p>
+            <w:pPr>
+              <w:spacing w:after="0" w:line="252" w:lineRule="auto"/>
+              <w:jc w:val="center"/>
+            </w:pPr>
+            <w:r>
+              <w:rPr>
+                <w:b/>
+                <w:sz w:val="19"/>
+              </w:rPr>
+              <w:t>Recall</w:t>
+            </w:r>
+          </w:p>
+        </w:tc>
+        <w:tc>
+          <w:tcPr>
+            <w:tcW w:type="dxa" w:w="1584"/>
+            <w:vAlign w:val="center"/>
+            <w:tcBorders>
+              <w:top w:val="single" w:sz="4" w:color="D9D9D9"/>
+              <w:left w:val="single" w:sz="4" w:color="D9D9D9"/>
+              <w:bottom w:val="single" w:sz="4" w:color="D9D9D9"/>
+              <w:right w:val="single" w:sz="4" w:color="D9D9D9"/>
+            </w:tcBorders>
+            <w:tcMar>
+              <w:top w:w="65" w:type="dxa"/>
+              <w:bottom w:w="65" w:type="dxa"/>
+              <w:left w:w="80" w:type="dxa"/>
+              <w:right w:w="80" w:type="dxa"/>
+            </w:tcMar>
+            <w:shd w:fill="EAEAEA"/>
+          </w:tcPr>
+          <w:p>
+            <w:pPr>
+              <w:spacing w:after="0" w:line="252" w:lineRule="auto"/>
+              <w:jc w:val="center"/>
+            </w:pPr>
+            <w:r>
+              <w:rPr>
+                <w:b/>
+                <w:sz w:val="19"/>
+              </w:rPr>
+              <w:t>Spam F1</w:t>
+            </w:r>
+          </w:p>
+        </w:tc>
+      </w:tr>
+      <w:tr>
+        <w:trPr>
+          <w:cantSplit/>
+        </w:trPr>
+        <w:tc>
+          <w:tcPr>
+            <w:tcW w:type="dxa" w:w="2376"/>
+            <w:vAlign w:val="center"/>
+            <w:tcBorders>
+              <w:top w:val="single" w:sz="4" w:color="D9D9D9"/>
+              <w:left w:val="single" w:sz="4" w:color="D9D9D9"/>
+              <w:bottom w:val="single" w:sz="4" w:color="D9D9D9"/>
+              <w:right w:val="single" w:sz="4" w:color="D9D9D9"/>
+            </w:tcBorders>
+            <w:tcMar>
+              <w:top w:w="65" w:type="dxa"/>
+              <w:bottom w:w="65" w:type="dxa"/>
+              <w:left w:w="80" w:type="dxa"/>
+              <w:right w:w="80" w:type="dxa"/>
+            </w:tcMar>
+          </w:tcPr>
+          <w:p>
+            <w:pPr>
+              <w:spacing w:after="0" w:line="252" w:lineRule="auto"/>
+              <w:jc w:val="left"/>
+            </w:pPr>
+            <w:r>
+              <w:rPr>
+                <w:b w:val="0"/>
+                <w:sz w:val="19"/>
+              </w:rPr>
+              <w:t>Original</w:t>
+            </w:r>
+          </w:p>
+        </w:tc>
+        <w:tc>
+          <w:tcPr>
+            <w:tcW w:type="dxa" w:w="1584"/>
+            <w:vAlign w:val="center"/>
+            <w:tcBorders>
+              <w:top w:val="single" w:sz="4" w:color="D9D9D9"/>
+              <w:left w:val="single" w:sz="4" w:color="D9D9D9"/>
+              <w:bottom w:val="single" w:sz="4" w:color="D9D9D9"/>
+              <w:right w:val="single" w:sz="4" w:color="D9D9D9"/>
+            </w:tcBorders>
+            <w:tcMar>
+              <w:top w:w="65" w:type="dxa"/>
+              <w:bottom w:w="65" w:type="dxa"/>
+              <w:left w:w="80" w:type="dxa"/>
+              <w:right w:w="80" w:type="dxa"/>
+            </w:tcMar>
+          </w:tcPr>
+          <w:p>
+            <w:pPr>
+              <w:spacing w:after="0" w:line="252" w:lineRule="auto"/>
+              <w:jc w:val="center"/>
+            </w:pPr>
+            <w:r>
+              <w:rPr>
+                <w:b w:val="0"/>
+                <w:sz w:val="19"/>
+              </w:rPr>
+              <w:t>15 / 1178</w:t>
+            </w:r>
+          </w:p>
+        </w:tc>
+        <w:tc>
+          <w:tcPr>
+            <w:tcW w:type="dxa" w:w="1152"/>
+            <w:vAlign w:val="center"/>
+            <w:tcBorders>
+              <w:top w:val="single" w:sz="4" w:color="D9D9D9"/>
+              <w:left w:val="single" w:sz="4" w:color="D9D9D9"/>
+              <w:bottom w:val="single" w:sz="4" w:color="D9D9D9"/>
+              <w:right w:val="single" w:sz="4" w:color="D9D9D9"/>
+            </w:tcBorders>
+            <w:tcMar>
+              <w:top w:w="65" w:type="dxa"/>
+              <w:bottom w:w="65" w:type="dxa"/>
+              <w:left w:w="80" w:type="dxa"/>
+              <w:right w:w="80" w:type="dxa"/>
+            </w:tcMar>
+          </w:tcPr>
+          <w:p>
+            <w:pPr>
+              <w:spacing w:after="0" w:line="252" w:lineRule="auto"/>
+              <w:jc w:val="center"/>
+            </w:pPr>
+            <w:r>
+              <w:rPr>
+                <w:b w:val="0"/>
+                <w:sz w:val="19"/>
+              </w:rPr>
+              <w:t>1.27%</w:t>
+            </w:r>
+          </w:p>
+        </w:tc>
+        <w:tc>
+          <w:tcPr>
+            <w:tcW w:type="dxa" w:w="1944"/>
+            <w:vAlign w:val="center"/>
+            <w:tcBorders>
+              <w:top w:val="single" w:sz="4" w:color="D9D9D9"/>
+              <w:left w:val="single" w:sz="4" w:color="D9D9D9"/>
+              <w:bottom w:val="single" w:sz="4" w:color="D9D9D9"/>
+              <w:right w:val="single" w:sz="4" w:color="D9D9D9"/>
+            </w:tcBorders>
+            <w:tcMar>
+              <w:top w:w="65" w:type="dxa"/>
+              <w:bottom w:w="65" w:type="dxa"/>
+              <w:left w:w="80" w:type="dxa"/>
+              <w:right w:w="80" w:type="dxa"/>
+            </w:tcMar>
+          </w:tcPr>
+          <w:p>
+            <w:pPr>
+              <w:spacing w:after="0" w:line="252" w:lineRule="auto"/>
+              <w:jc w:val="center"/>
+            </w:pPr>
+            <w:r>
+              <w:rPr>
+                <w:b w:val="0"/>
+                <w:sz w:val="19"/>
+              </w:rPr>
+              <w:t>3561 / 7109</w:t>
+            </w:r>
+          </w:p>
+        </w:tc>
+        <w:tc>
+          <w:tcPr>
+            <w:tcW w:type="dxa" w:w="1440"/>
+            <w:vAlign w:val="center"/>
+            <w:tcBorders>
+              <w:top w:val="single" w:sz="4" w:color="D9D9D9"/>
+              <w:left w:val="single" w:sz="4" w:color="D9D9D9"/>
+              <w:bottom w:val="single" w:sz="4" w:color="D9D9D9"/>
+              <w:right w:val="single" w:sz="4" w:color="D9D9D9"/>
+            </w:tcBorders>
+            <w:tcMar>
+              <w:top w:w="65" w:type="dxa"/>
+              <w:bottom w:w="65" w:type="dxa"/>
+              <w:left w:w="80" w:type="dxa"/>
+              <w:right w:w="80" w:type="dxa"/>
+            </w:tcMar>
+          </w:tcPr>
+          <w:p>
+            <w:pPr>
+              <w:spacing w:after="0" w:line="252" w:lineRule="auto"/>
+              <w:jc w:val="center"/>
+            </w:pPr>
+            <w:r>
+              <w:rPr>
+                <w:b w:val="0"/>
+                <w:sz w:val="19"/>
+              </w:rPr>
+              <w:t>49.91%</w:t>
+            </w:r>
+          </w:p>
+        </w:tc>
+        <w:tc>
+          <w:tcPr>
+            <w:tcW w:type="dxa" w:w="1584"/>
+            <w:vAlign w:val="center"/>
+            <w:tcBorders>
+              <w:top w:val="single" w:sz="4" w:color="D9D9D9"/>
+              <w:left w:val="single" w:sz="4" w:color="D9D9D9"/>
+              <w:bottom w:val="single" w:sz="4" w:color="D9D9D9"/>
+              <w:right w:val="single" w:sz="4" w:color="D9D9D9"/>
+            </w:tcBorders>
+            <w:tcMar>
+              <w:top w:w="65" w:type="dxa"/>
+              <w:bottom w:w="65" w:type="dxa"/>
+              <w:left w:w="80" w:type="dxa"/>
+              <w:right w:w="80" w:type="dxa"/>
+            </w:tcMar>
+          </w:tcPr>
+          <w:p>
+            <w:pPr>
+              <w:spacing w:after="0" w:line="252" w:lineRule="auto"/>
+              <w:jc w:val="center"/>
+            </w:pPr>
+            <w:r>
+              <w:rPr>
+                <w:b w:val="0"/>
+                <w:sz w:val="19"/>
+              </w:rPr>
+              <w:t>0.6649</w:t>
+            </w:r>
+          </w:p>
+        </w:tc>
+      </w:tr>
+      <w:tr>
+        <w:trPr>
+          <w:cantSplit/>
+        </w:trPr>
+        <w:tc>
+          <w:tcPr>
+            <w:tcW w:type="dxa" w:w="2376"/>
+            <w:vAlign w:val="center"/>
+            <w:tcBorders>
+              <w:top w:val="single" w:sz="4" w:color="D9D9D9"/>
+              <w:left w:val="single" w:sz="4" w:color="D9D9D9"/>
+              <w:bottom w:val="single" w:sz="4" w:color="D9D9D9"/>
+              <w:right w:val="single" w:sz="4" w:color="D9D9D9"/>
+            </w:tcBorders>
+            <w:tcMar>
+              <w:top w:w="65" w:type="dxa"/>
+              <w:bottom w:w="65" w:type="dxa"/>
+              <w:left w:w="80" w:type="dxa"/>
+              <w:right w:w="80" w:type="dxa"/>
+            </w:tcMar>
+          </w:tcPr>
+          <w:p>
+            <w:pPr>
+              <w:spacing w:after="0" w:line="252" w:lineRule="auto"/>
+              <w:jc w:val="left"/>
+            </w:pPr>
+            <w:r>
+              <w:rPr>
+                <w:b w:val="0"/>
+                <w:sz w:val="19"/>
+              </w:rPr>
+              <w:t>Previous adaptation</w:t>
+            </w:r>
+          </w:p>
+        </w:tc>
+        <w:tc>
+          <w:tcPr>
+            <w:tcW w:type="dxa" w:w="1584"/>
+            <w:vAlign w:val="center"/>
+            <w:tcBorders>
+              <w:top w:val="single" w:sz="4" w:color="D9D9D9"/>
+              <w:left w:val="single" w:sz="4" w:color="D9D9D9"/>
+              <w:bottom w:val="single" w:sz="4" w:color="D9D9D9"/>
+              <w:right w:val="single" w:sz="4" w:color="D9D9D9"/>
+            </w:tcBorders>
+            <w:tcMar>
+              <w:top w:w="65" w:type="dxa"/>
+              <w:bottom w:w="65" w:type="dxa"/>
+              <w:left w:w="80" w:type="dxa"/>
+              <w:right w:w="80" w:type="dxa"/>
+            </w:tcMar>
+          </w:tcPr>
+          <w:p>
+            <w:pPr>
+              <w:spacing w:after="0" w:line="252" w:lineRule="auto"/>
+              <w:jc w:val="center"/>
+            </w:pPr>
+            <w:r>
+              <w:rPr>
+                <w:b w:val="0"/>
+                <w:sz w:val="19"/>
+              </w:rPr>
+              <w:t>17 / 1178</w:t>
+            </w:r>
+          </w:p>
+        </w:tc>
+        <w:tc>
+          <w:tcPr>
+            <w:tcW w:type="dxa" w:w="1152"/>
+            <w:vAlign w:val="center"/>
+            <w:tcBorders>
+              <w:top w:val="single" w:sz="4" w:color="D9D9D9"/>
+              <w:left w:val="single" w:sz="4" w:color="D9D9D9"/>
+              <w:bottom w:val="single" w:sz="4" w:color="D9D9D9"/>
+              <w:right w:val="single" w:sz="4" w:color="D9D9D9"/>
+            </w:tcBorders>
+            <w:tcMar>
+              <w:top w:w="65" w:type="dxa"/>
+              <w:bottom w:w="65" w:type="dxa"/>
+              <w:left w:w="80" w:type="dxa"/>
+              <w:right w:w="80" w:type="dxa"/>
+            </w:tcMar>
+          </w:tcPr>
+          <w:p>
+            <w:pPr>
+              <w:spacing w:after="0" w:line="252" w:lineRule="auto"/>
+              <w:jc w:val="center"/>
+            </w:pPr>
+            <w:r>
+              <w:rPr>
+                <w:b w:val="0"/>
+                <w:sz w:val="19"/>
+              </w:rPr>
+              <w:t>1.44%</w:t>
+            </w:r>
+          </w:p>
+        </w:tc>
+        <w:tc>
+          <w:tcPr>
+            <w:tcW w:type="dxa" w:w="1944"/>
+            <w:vAlign w:val="center"/>
+            <w:tcBorders>
+              <w:top w:val="single" w:sz="4" w:color="D9D9D9"/>
+              <w:left w:val="single" w:sz="4" w:color="D9D9D9"/>
+              <w:bottom w:val="single" w:sz="4" w:color="D9D9D9"/>
+              <w:right w:val="single" w:sz="4" w:color="D9D9D9"/>
+            </w:tcBorders>
+            <w:tcMar>
+              <w:top w:w="65" w:type="dxa"/>
+              <w:bottom w:w="65" w:type="dxa"/>
+              <w:left w:w="80" w:type="dxa"/>
+              <w:right w:w="80" w:type="dxa"/>
+            </w:tcMar>
+          </w:tcPr>
+          <w:p>
+            <w:pPr>
+              <w:spacing w:after="0" w:line="252" w:lineRule="auto"/>
+              <w:jc w:val="center"/>
+            </w:pPr>
+            <w:r>
+              <w:rPr>
+                <w:b w:val="0"/>
+                <w:sz w:val="19"/>
+              </w:rPr>
+              <w:t>1901 / 7109</w:t>
+            </w:r>
+          </w:p>
+        </w:tc>
+        <w:tc>
+          <w:tcPr>
+            <w:tcW w:type="dxa" w:w="1440"/>
+            <w:vAlign w:val="center"/>
+            <w:tcBorders>
+              <w:top w:val="single" w:sz="4" w:color="D9D9D9"/>
+              <w:left w:val="single" w:sz="4" w:color="D9D9D9"/>
+              <w:bottom w:val="single" w:sz="4" w:color="D9D9D9"/>
+              <w:right w:val="single" w:sz="4" w:color="D9D9D9"/>
+            </w:tcBorders>
+            <w:tcMar>
+              <w:top w:w="65" w:type="dxa"/>
+              <w:bottom w:w="65" w:type="dxa"/>
+              <w:left w:w="80" w:type="dxa"/>
+              <w:right w:w="80" w:type="dxa"/>
+            </w:tcMar>
+          </w:tcPr>
+          <w:p>
+            <w:pPr>
+              <w:spacing w:after="0" w:line="252" w:lineRule="auto"/>
+              <w:jc w:val="center"/>
+            </w:pPr>
+            <w:r>
+              <w:rPr>
+                <w:b w:val="0"/>
+                <w:sz w:val="19"/>
+              </w:rPr>
+              <w:t>73.26%</w:t>
+            </w:r>
+          </w:p>
+        </w:tc>
+        <w:tc>
+          <w:tcPr>
+            <w:tcW w:type="dxa" w:w="1584"/>
+            <w:vAlign w:val="center"/>
+            <w:tcBorders>
+              <w:top w:val="single" w:sz="4" w:color="D9D9D9"/>
+              <w:left w:val="single" w:sz="4" w:color="D9D9D9"/>
+              <w:bottom w:val="single" w:sz="4" w:color="D9D9D9"/>
+              <w:right w:val="single" w:sz="4" w:color="D9D9D9"/>
+            </w:tcBorders>
+            <w:tcMar>
+              <w:top w:w="65" w:type="dxa"/>
+              <w:bottom w:w="65" w:type="dxa"/>
+              <w:left w:w="80" w:type="dxa"/>
+              <w:right w:w="80" w:type="dxa"/>
+            </w:tcMar>
+          </w:tcPr>
+          <w:p>
+            <w:pPr>
+              <w:spacing w:after="0" w:line="252" w:lineRule="auto"/>
+              <w:jc w:val="center"/>
+            </w:pPr>
+            <w:r>
+              <w:rPr>
+                <w:b w:val="0"/>
+                <w:sz w:val="19"/>
+              </w:rPr>
+              <w:t>0.8445</w:t>
+            </w:r>
+          </w:p>
+        </w:tc>
+      </w:tr>
+      <w:tr>
+        <w:trPr>
+          <w:cantSplit/>
+        </w:trPr>
+        <w:tc>
+          <w:tcPr>
+            <w:tcW w:type="dxa" w:w="2376"/>
+            <w:vAlign w:val="center"/>
+            <w:tcBorders>
+              <w:top w:val="single" w:sz="4" w:color="D9D9D9"/>
+              <w:left w:val="single" w:sz="4" w:color="D9D9D9"/>
+              <w:bottom w:val="single" w:sz="4" w:color="D9D9D9"/>
+              <w:right w:val="single" w:sz="4" w:color="D9D9D9"/>
+            </w:tcBorders>
+            <w:tcMar>
+              <w:top w:w="65" w:type="dxa"/>
+              <w:bottom w:w="65" w:type="dxa"/>
+              <w:left w:w="80" w:type="dxa"/>
+              <w:right w:w="80" w:type="dxa"/>
+            </w:tcMar>
+          </w:tcPr>
+          <w:p>
+            <w:pPr>
+              <w:spacing w:after="0" w:line="252" w:lineRule="auto"/>
+              <w:jc w:val="left"/>
+            </w:pPr>
+            <w:r>
+              <w:rPr>
+                <w:b w:val="0"/>
+                <w:sz w:val="19"/>
+              </w:rPr>
+              <w:t>Threshold only</w:t>
+            </w:r>
+          </w:p>
+        </w:tc>
+        <w:tc>
+          <w:tcPr>
+            <w:tcW w:type="dxa" w:w="1584"/>
+            <w:vAlign w:val="center"/>
+            <w:tcBorders>
+              <w:top w:val="single" w:sz="4" w:color="D9D9D9"/>
+              <w:left w:val="single" w:sz="4" w:color="D9D9D9"/>
+              <w:bottom w:val="single" w:sz="4" w:color="D9D9D9"/>
+              <w:right w:val="single" w:sz="4" w:color="D9D9D9"/>
+            </w:tcBorders>
+            <w:tcMar>
+              <w:top w:w="65" w:type="dxa"/>
+              <w:bottom w:w="65" w:type="dxa"/>
+              <w:left w:w="80" w:type="dxa"/>
+              <w:right w:w="80" w:type="dxa"/>
+            </w:tcMar>
+          </w:tcPr>
+          <w:p>
+            <w:pPr>
+              <w:spacing w:after="0" w:line="252" w:lineRule="auto"/>
+              <w:jc w:val="center"/>
+            </w:pPr>
+            <w:r>
+              <w:rPr>
+                <w:b w:val="0"/>
+                <w:sz w:val="19"/>
+              </w:rPr>
+              <w:t>0 / 1178</w:t>
+            </w:r>
+          </w:p>
+        </w:tc>
+        <w:tc>
+          <w:tcPr>
+            <w:tcW w:type="dxa" w:w="1152"/>
+            <w:vAlign w:val="center"/>
+            <w:tcBorders>
+              <w:top w:val="single" w:sz="4" w:color="D9D9D9"/>
+              <w:left w:val="single" w:sz="4" w:color="D9D9D9"/>
+              <w:bottom w:val="single" w:sz="4" w:color="D9D9D9"/>
+              <w:right w:val="single" w:sz="4" w:color="D9D9D9"/>
+            </w:tcBorders>
+            <w:tcMar>
+              <w:top w:w="65" w:type="dxa"/>
+              <w:bottom w:w="65" w:type="dxa"/>
+              <w:left w:w="80" w:type="dxa"/>
+              <w:right w:w="80" w:type="dxa"/>
+            </w:tcMar>
+          </w:tcPr>
+          <w:p>
+            <w:pPr>
+              <w:spacing w:after="0" w:line="252" w:lineRule="auto"/>
+              <w:jc w:val="center"/>
+            </w:pPr>
+            <w:r>
+              <w:rPr>
+                <w:b w:val="0"/>
+                <w:sz w:val="19"/>
+              </w:rPr>
+              <w:t>0.00%</w:t>
+            </w:r>
+          </w:p>
+        </w:tc>
+        <w:tc>
+          <w:tcPr>
+            <w:tcW w:type="dxa" w:w="1944"/>
+            <w:vAlign w:val="center"/>
+            <w:tcBorders>
+              <w:top w:val="single" w:sz="4" w:color="D9D9D9"/>
+              <w:left w:val="single" w:sz="4" w:color="D9D9D9"/>
+              <w:bottom w:val="single" w:sz="4" w:color="D9D9D9"/>
+              <w:right w:val="single" w:sz="4" w:color="D9D9D9"/>
+            </w:tcBorders>
+            <w:tcMar>
+              <w:top w:w="65" w:type="dxa"/>
+              <w:bottom w:w="65" w:type="dxa"/>
+              <w:left w:w="80" w:type="dxa"/>
+              <w:right w:w="80" w:type="dxa"/>
+            </w:tcMar>
+          </w:tcPr>
+          <w:p>
+            <w:pPr>
+              <w:spacing w:after="0" w:line="252" w:lineRule="auto"/>
+              <w:jc w:val="center"/>
+            </w:pPr>
+            <w:r>
+              <w:rPr>
+                <w:b w:val="0"/>
+                <w:sz w:val="19"/>
+              </w:rPr>
+              <w:t>6762 / 7109</w:t>
+            </w:r>
+          </w:p>
+        </w:tc>
+        <w:tc>
+          <w:tcPr>
+            <w:tcW w:type="dxa" w:w="1440"/>
+            <w:vAlign w:val="center"/>
+            <w:tcBorders>
+              <w:top w:val="single" w:sz="4" w:color="D9D9D9"/>
+              <w:left w:val="single" w:sz="4" w:color="D9D9D9"/>
+              <w:bottom w:val="single" w:sz="4" w:color="D9D9D9"/>
+              <w:right w:val="single" w:sz="4" w:color="D9D9D9"/>
+            </w:tcBorders>
+            <w:tcMar>
+              <w:top w:w="65" w:type="dxa"/>
+              <w:bottom w:w="65" w:type="dxa"/>
+              <w:left w:w="80" w:type="dxa"/>
+              <w:right w:w="80" w:type="dxa"/>
+            </w:tcMar>
+          </w:tcPr>
+          <w:p>
+            <w:pPr>
+              <w:spacing w:after="0" w:line="252" w:lineRule="auto"/>
+              <w:jc w:val="center"/>
+            </w:pPr>
+            <w:r>
+              <w:rPr>
+                <w:b w:val="0"/>
+                <w:sz w:val="19"/>
+              </w:rPr>
+              <w:t>4.88%</w:t>
+            </w:r>
+          </w:p>
+        </w:tc>
+        <w:tc>
+          <w:tcPr>
+            <w:tcW w:type="dxa" w:w="1584"/>
+            <w:vAlign w:val="center"/>
+            <w:tcBorders>
+              <w:top w:val="single" w:sz="4" w:color="D9D9D9"/>
+              <w:left w:val="single" w:sz="4" w:color="D9D9D9"/>
+              <w:bottom w:val="single" w:sz="4" w:color="D9D9D9"/>
+              <w:right w:val="single" w:sz="4" w:color="D9D9D9"/>
+            </w:tcBorders>
+            <w:tcMar>
+              <w:top w:w="65" w:type="dxa"/>
+              <w:bottom w:w="65" w:type="dxa"/>
+              <w:left w:w="80" w:type="dxa"/>
+              <w:right w:w="80" w:type="dxa"/>
+            </w:tcMar>
+          </w:tcPr>
+          <w:p>
+            <w:pPr>
+              <w:spacing w:after="0" w:line="252" w:lineRule="auto"/>
+              <w:jc w:val="center"/>
+            </w:pPr>
+            <w:r>
+              <w:rPr>
+                <w:b w:val="0"/>
+                <w:sz w:val="19"/>
+              </w:rPr>
+              <w:t>0.0931</w:t>
+            </w:r>
+          </w:p>
+        </w:tc>
+      </w:tr>
+      <w:tr>
+        <w:trPr>
+          <w:cantSplit/>
+        </w:trPr>
+        <w:tc>
+          <w:tcPr>
+            <w:tcW w:type="dxa" w:w="2376"/>
+            <w:vAlign w:val="center"/>
+            <w:tcBorders>
+              <w:top w:val="single" w:sz="4" w:color="D9D9D9"/>
+              <w:left w:val="single" w:sz="4" w:color="D9D9D9"/>
+              <w:bottom w:val="single" w:sz="4" w:color="D9D9D9"/>
+              <w:right w:val="single" w:sz="4" w:color="D9D9D9"/>
+            </w:tcBorders>
+            <w:tcMar>
+              <w:top w:w="65" w:type="dxa"/>
+              <w:bottom w:w="65" w:type="dxa"/>
+              <w:left w:w="80" w:type="dxa"/>
+              <w:right w:w="80" w:type="dxa"/>
+            </w:tcMar>
+          </w:tcPr>
+          <w:p>
+            <w:pPr>
+              <w:spacing w:after="0" w:line="252" w:lineRule="auto"/>
+              <w:jc w:val="left"/>
+            </w:pPr>
+            <w:r>
+              <w:rPr>
+                <w:b w:val="0"/>
+                <w:sz w:val="19"/>
+              </w:rPr>
+              <w:t>Expanded data</w:t>
+            </w:r>
+          </w:p>
+        </w:tc>
+        <w:tc>
+          <w:tcPr>
+            <w:tcW w:type="dxa" w:w="1584"/>
+            <w:vAlign w:val="center"/>
+            <w:tcBorders>
+              <w:top w:val="single" w:sz="4" w:color="D9D9D9"/>
+              <w:left w:val="single" w:sz="4" w:color="D9D9D9"/>
+              <w:bottom w:val="single" w:sz="4" w:color="D9D9D9"/>
+              <w:right w:val="single" w:sz="4" w:color="D9D9D9"/>
+            </w:tcBorders>
+            <w:tcMar>
+              <w:top w:w="65" w:type="dxa"/>
+              <w:bottom w:w="65" w:type="dxa"/>
+              <w:left w:w="80" w:type="dxa"/>
+              <w:right w:w="80" w:type="dxa"/>
+            </w:tcMar>
+          </w:tcPr>
+          <w:p>
+            <w:pPr>
+              <w:spacing w:after="0" w:line="252" w:lineRule="auto"/>
+              <w:jc w:val="center"/>
+            </w:pPr>
+            <w:r>
+              <w:rPr>
+                <w:b w:val="0"/>
+                <w:sz w:val="19"/>
+              </w:rPr>
+              <w:t>14 / 1178</w:t>
+            </w:r>
+          </w:p>
+        </w:tc>
+        <w:tc>
+          <w:tcPr>
+            <w:tcW w:type="dxa" w:w="1152"/>
+            <w:vAlign w:val="center"/>
+            <w:tcBorders>
+              <w:top w:val="single" w:sz="4" w:color="D9D9D9"/>
+              <w:left w:val="single" w:sz="4" w:color="D9D9D9"/>
+              <w:bottom w:val="single" w:sz="4" w:color="D9D9D9"/>
+              <w:right w:val="single" w:sz="4" w:color="D9D9D9"/>
+            </w:tcBorders>
+            <w:tcMar>
+              <w:top w:w="65" w:type="dxa"/>
+              <w:bottom w:w="65" w:type="dxa"/>
+              <w:left w:w="80" w:type="dxa"/>
+              <w:right w:w="80" w:type="dxa"/>
+            </w:tcMar>
+          </w:tcPr>
+          <w:p>
+            <w:pPr>
+              <w:spacing w:after="0" w:line="252" w:lineRule="auto"/>
+              <w:jc w:val="center"/>
+            </w:pPr>
+            <w:r>
+              <w:rPr>
+                <w:b w:val="0"/>
+                <w:sz w:val="19"/>
+              </w:rPr>
+              <w:t>1.19%</w:t>
+            </w:r>
+          </w:p>
+        </w:tc>
+        <w:tc>
+          <w:tcPr>
+            <w:tcW w:type="dxa" w:w="1944"/>
+            <w:vAlign w:val="center"/>
+            <w:tcBorders>
+              <w:top w:val="single" w:sz="4" w:color="D9D9D9"/>
+              <w:left w:val="single" w:sz="4" w:color="D9D9D9"/>
+              <w:bottom w:val="single" w:sz="4" w:color="D9D9D9"/>
+              <w:right w:val="single" w:sz="4" w:color="D9D9D9"/>
+            </w:tcBorders>
+            <w:tcMar>
+              <w:top w:w="65" w:type="dxa"/>
+              <w:bottom w:w="65" w:type="dxa"/>
+              <w:left w:w="80" w:type="dxa"/>
+              <w:right w:w="80" w:type="dxa"/>
+            </w:tcMar>
+          </w:tcPr>
+          <w:p>
+            <w:pPr>
+              <w:spacing w:after="0" w:line="252" w:lineRule="auto"/>
+              <w:jc w:val="center"/>
+            </w:pPr>
+            <w:r>
+              <w:rPr>
+                <w:b w:val="0"/>
+                <w:sz w:val="19"/>
+              </w:rPr>
+              <w:t>340 / 7109</w:t>
+            </w:r>
+          </w:p>
+        </w:tc>
+        <w:tc>
+          <w:tcPr>
+            <w:tcW w:type="dxa" w:w="1440"/>
+            <w:vAlign w:val="center"/>
+            <w:tcBorders>
+              <w:top w:val="single" w:sz="4" w:color="D9D9D9"/>
+              <w:left w:val="single" w:sz="4" w:color="D9D9D9"/>
+              <w:bottom w:val="single" w:sz="4" w:color="D9D9D9"/>
+              <w:right w:val="single" w:sz="4" w:color="D9D9D9"/>
+            </w:tcBorders>
+            <w:tcMar>
+              <w:top w:w="65" w:type="dxa"/>
+              <w:bottom w:w="65" w:type="dxa"/>
+              <w:left w:w="80" w:type="dxa"/>
+              <w:right w:w="80" w:type="dxa"/>
+            </w:tcMar>
+          </w:tcPr>
+          <w:p>
+            <w:pPr>
+              <w:spacing w:after="0" w:line="252" w:lineRule="auto"/>
+              <w:jc w:val="center"/>
+            </w:pPr>
+            <w:r>
+              <w:rPr>
+                <w:b w:val="0"/>
+                <w:sz w:val="19"/>
+              </w:rPr>
+              <w:t>95.22%</w:t>
+            </w:r>
+          </w:p>
+        </w:tc>
+        <w:tc>
+          <w:tcPr>
+            <w:tcW w:type="dxa" w:w="1584"/>
+            <w:vAlign w:val="center"/>
+            <w:tcBorders>
+              <w:top w:val="single" w:sz="4" w:color="D9D9D9"/>
+              <w:left w:val="single" w:sz="4" w:color="D9D9D9"/>
+              <w:bottom w:val="single" w:sz="4" w:color="D9D9D9"/>
+              <w:right w:val="single" w:sz="4" w:color="D9D9D9"/>
+            </w:tcBorders>
+            <w:tcMar>
+              <w:top w:w="65" w:type="dxa"/>
+              <w:bottom w:w="65" w:type="dxa"/>
+              <w:left w:w="80" w:type="dxa"/>
+              <w:right w:w="80" w:type="dxa"/>
+            </w:tcMar>
+          </w:tcPr>
+          <w:p>
+            <w:pPr>
+              <w:spacing w:after="0" w:line="252" w:lineRule="auto"/>
+              <w:jc w:val="center"/>
+            </w:pPr>
+            <w:r>
+              <w:rPr>
+                <w:b w:val="0"/>
+                <w:sz w:val="19"/>
+              </w:rPr>
+              <w:t>0.9745</w:t>
+            </w:r>
+          </w:p>
+        </w:tc>
+      </w:tr>
+    </w:tbl>
+    <w:p>
+      <w:pPr>
+        <w:spacing w:after="0"/>
+      </w:pPr>
+    </w:p>
+    <w:p>
+      <w:r>
+        <w:t>The new model corrects ten earlier ham errors and introduces seven. The FPR change versus the previous adaptation is -0.25 percentage points, with a paired conditional 95% interval of -1.02 to +0.51 points; the decrease is not established. Candidate FPR is 1.19% (interval 0.59–1.94%), exceeding the 1% gate. Recall improves by 21.96 points (interval +20.64 to +23.30), with ROC-AUC 0.9946. Recalibrating only the previous model's threshold on the same validation set yields zero FP but 4.88% recall. The refit remains experimental, with no further tuning after test inspection.</w:t>
       </w:r>
     </w:p>
     <w:p>
       <w:r>
-        <w:t>The word model combines high historical F1 with sensitivity to separator edits and limited source transfer. Refitting on newer messages improves spam recall and same-source financial F1, but increases false positives on independent government notifications. This measured tradeoff prevents replacing the default. Further progress needs more diverse genuine ordinary SMS and a new untouched test; the reported holdouts must not be reused as independent evidence after tuning on these findings.</w:t>
+        <w:t>This is a held-out component sample from the same author corpus as added development data, not an unseen-provider or chronological test. Recipient consent, sender identity, individual dates, label ambiguity and occasional transliteration/encoding artifacts limit inference. Precision and F1 depend on the spam-heavy mix. The comparison does not isolate ham's causal contribution because spam and PSA development also change.</w:t>
+      </w:r>
+    </w:p>
+    <w:p>
+      <w:r>
+        <w:br w:type="page"/>
+      </w:r>
+    </w:p>
+    <w:p>
+      <w:pPr>
+        <w:pStyle w:val="Heading1"/>
+      </w:pPr>
+      <w:r>
+        <w:t>13 Reproducibility and conclusion</w:t>
+      </w:r>
+    </w:p>
+    <w:p>
+      <w:r>
+        <w:t>The repository supplies split/CV manifests, all search results, predictions, attack realizations and conditional intervals. Data, code and artifacts have SHA-256 records. Both historical protocols were independently verified, including all 7,920 attack metric rows per run. Python 3.12.14, scikit-learn 1.9.1 and dependencies are pinned. Hash-matched binaries remain local; completed runs cannot silently be overwritten.</w:t>
+      </w:r>
+    </w:p>
+    <w:p>
+      <w:r>
+        <w:t>Separate verification scripts reconstruct external scores and independently check adaptation thresholds, metrics and paired intervals without fitting. The first adaptation records 18,204 validation and 1,664 test scores. The ham expansion records 59,101 validation and 33,148 test scores, including the threshold-only control and three 5,000-draw comparisons. The source audits, frozen rules and reproduction commands are documented in docs/MODERN_ADAPTATION.md and docs/HAM_EXPANSION.md.</w:t>
+      </w:r>
+    </w:p>
+    <w:p>
+      <w:r>
+        <w:t>The word model has high historical F1 but limited source transfer. Broader training improves spam recall; the latest FPR decrease remains statistically uncertain and FPR exceeds the chosen limit. Neither adaptation replaces the default. Further evaluation needs dated ordinary SMS from an unseen provider, with consent context and a new untouched test. Inspected holdouts cannot support another independent claim after tuning.</w:t>
       </w:r>
     </w:p>
     <w:p>
@@ -6814,6 +7839,17 @@
           <w:sz w:val="19"/>
         </w:rPr>
         <w:t>[11] S. L. Chua. Spam of the Times: spam and marketing SMS. CC BY 4.0. Snapshot ad50c348c53f738645f78ee8baa8be5082a1de91, 20 August 2026. https://github.com/scottleechua/data/tree/ad50c348c53f738645f78ee8baa8be5082a1de91/spam-and-marketing-sms</w:t>
+      </w:r>
+    </w:p>
+    <w:p>
+      <w:pPr>
+        <w:spacing w:after="140"/>
+      </w:pPr>
+      <w:r>
+        <w:rPr>
+          <w:sz w:val="19"/>
+        </w:rPr>
+        <w:t>[12] M. Salman, M. Ikram and M. A. Kaafar. Investigating Evasive Techniques in SMS Spam Filtering: A Comparative Analysis of Machine Learning Models. IEEE Access, vol. 12, pp. 24306–24324, 2024. DOI: 10.1109/ACCESS.2024.3364671. Data: https://github.com/smspamresearch/spstudy (2018–2023 subset, snapshot d83c99c6c3ae8c498b373e66b3a8129356a87b63).</w:t>
       </w:r>
     </w:p>
     <w:sectPr>

</xml_diff>

<commit_message>
Document ordinary-SMS expansion and remaining false positives (#16)
Report the ordinary-SMS expansion consistently in the README, model
card, research report, notebook and manuscript. Explain the 2018–2023
source limits, shared-corpus group holdout, threshold-only control, and
why 14/1,178 false positives and an inconclusive paired FPR decrease do
not satisfy the replacement criterion despite 95.22% spam recall.

Keep both earlier studies intact, explicitly retire the inspected
SMS-history test from independent evidence for the new model, and update
the next research priority to dated ordinary messages from an unseen
provider.

Validation: all 14 notebook code cells executed; all nine PDF pages
visually inspected; seven editable tables and two figures retained;
Table 7 checked against all four saved metric rows; local documentation
links and both frozen adaptation source manifests verified. The paper
builder checks hashes and verification records before incorporating
results.
</commit_message>
<xml_diff>
--- a/paper/SMS_Spam_Detection_Paper.docx
+++ b/paper/SMS_Spam_Detection_Paper.docx
@@ -27,7 +27,7 @@
     </w:p>
     <w:p>
       <w:r>
-        <w:t>This study evaluates eleven sparse classifiers on the historical English SMS Spam Collection, separating training search, validation thresholds and final testing. After deduplication, 5,171 messages remain in grouped splits. The selected word TF-IDF LinearSVC achieves spam F1 0.9531, with four false positives and eight misses among 1,034 test messages. Its conditional 95% group-bootstrap F1 interval is 0.9249 to 0.9769. Separator insertion lowers mean recall from 0.9385 to 0.6035. On 372 independent English reports with explicit 2023–2024 years, the unchanged model detects 176: recall 47.31%. We then refit with newer spam and ordinary financial messages under a separate frozen protocol. On another independent source, recall rises from 42.63% to 58.66%, but false positives on government notifications rise from 11/55 to 19/55. A separate financial holdout improves from F1 0.6400 to 0.8605. The adapted candidate fails the predeclared replacement criterion. Higher historical or spam-class F1 does not establish reliable transfer or acceptable harm to legitimate messages.</w:t>
+        <w:t>This study evaluates eleven sparse classifiers on the historical English SMS Spam Collection, separating training search, validation thresholds and final testing. The selected word TF-IDF LinearSVC achieves spam F1 0.9531, with four false positives and eight misses among 1,034 test messages. Its conditional 95% group-bootstrap F1 interval is 0.9249 to 0.9769. Separator insertion lowers mean recall from 0.9385 to 0.6035. On 372 independent English reports dated 2023–2024, the unchanged model detects 176: recall 47.31%. A first adaptation improves independent SMS recall but increases false positives on government notifications from 11/55 to 19/55. A second study adds 1,968 ordinary training SMS from an author corpus covering 2018–2023. On its new group holdout, false positives change from 17 to 14 of 1,178 ham, while recall rises from 73.26% to 95.22% on 7,109 spam messages. The FPR difference is statistically inconclusive and 1.19% exceeds the 1% target. Both candidates fail their replacement criteria. These findings distinguish improved spam detection from demonstrated protection of legitimate communication.</w:t>
       </w:r>
     </w:p>
     <w:p>
@@ -6664,22 +6664,1047 @@
         <w:pStyle w:val="Heading1"/>
       </w:pPr>
       <w:r>
-        <w:t>12 Reproducibility and conclusion</w:t>
+        <w:t>12 Expanding ordinary SMS to reduce false positives</w:t>
       </w:r>
     </w:p>
     <w:p>
       <w:r>
-        <w:t>The repository supplies split/CV manifests, all 84 search results, validation and test metrics, attack realizations, error ledgers, intervals and fitted-pipeline export. Dataset, source code and artifacts have SHA-256 records. Both historical protocols were independently verified, including all 7,920 attack metric rows per run. Python 3.12.14, scikit-learn 1.9.1 and exact dependencies are recorded. scripts/verify_external.py reconstructs the separate IMC scores, decisions and summaries from the original fitted pipeline. Verification requires hash-matched local models; binaries are excluded from Git and runs cannot silently overwrite frozen outputs.</w:t>
+        <w:t>We next use Salman et al.'s Super SMS Dataset [12], specifically the author-labeled 2018–2023 subset: 4,028 ham and 25,375 spam before screening. The paper describes 2,325 ham collected from consenting volunteers during October 2021–June 2023, but their rows and receipt dates are not individually identified. The authors offer research access without a standard data license; raw messages are not redistributed. This is not representative 2025–2026 traffic.</w:t>
       </w:r>
     </w:p>
     <w:p>
       <w:r>
-        <w:t>The adaptation follow-up records six fitted candidates, 18,204 validation scores and 1,664 test scores. scripts/verify_adaptation.py independently checks thresholds by exhaustive search, metrics and paired intervals by resampling message rows through whole groups. No model fitting occurs during verification. docs/MODERN_ADAPTATION.md documents the sources, fixed protocol, failed replacement criterion and reproduction commands.</w:t>
+        <w:t>The protocol and membership were merged before fitting (PR #14). We remove duplicates, conflicts and similarity &gt;=0.85 overlaps with every previously acquired source, then form near-copy connected components before a stratified 50/20/30 group split. New training adds 1,968 ham and 11,860 spam; new validation has 787 ham and 4,497 spam. The previous SMS-history test becomes development and cannot supply independent evidence again. Total training has 29,593 messages and validation 8,443. Six word/character candidates vary C in {0.5, 1} and ham weighting in {1, 2, 4}; source and group balancing remain explicit. Validation selects C=1, multiplier=1 and threshold 0.48587418949350525 under separate 1% FPR constraints per ham source.</w:t>
+      </w:r>
+    </w:p>
+    <w:p>
+      <w:pPr>
+        <w:pStyle w:val="Caption"/>
+        <w:keepNext/>
+      </w:pPr>
+      <w:r>
+        <w:t>Table 7. All four operating points on the same untouched 8,287-message group holdout.</w:t>
+      </w:r>
+    </w:p>
+    <w:tbl>
+      <w:tblPr>
+        <w:tblW w:type="auto" w:w="0"/>
+        <w:jc w:val="center"/>
+        <w:tblLayout w:type="fixed"/>
+        <w:tblLook w:firstColumn="1" w:firstRow="1" w:lastColumn="0" w:lastRow="0" w:noHBand="0" w:noVBand="1" w:val="04A0"/>
+      </w:tblPr>
+      <w:tblGrid>
+        <w:gridCol w:w="2376"/>
+        <w:gridCol w:w="1584"/>
+        <w:gridCol w:w="1152"/>
+        <w:gridCol w:w="1944"/>
+        <w:gridCol w:w="1440"/>
+        <w:gridCol w:w="1584"/>
+      </w:tblGrid>
+      <w:tr>
+        <w:trPr>
+          <w:tblHeader/>
+          <w:cantSplit/>
+        </w:trPr>
+        <w:tc>
+          <w:tcPr>
+            <w:tcW w:type="dxa" w:w="2376"/>
+            <w:vAlign w:val="center"/>
+            <w:tcBorders>
+              <w:top w:val="single" w:sz="4" w:color="D9D9D9"/>
+              <w:left w:val="single" w:sz="4" w:color="D9D9D9"/>
+              <w:bottom w:val="single" w:sz="4" w:color="D9D9D9"/>
+              <w:right w:val="single" w:sz="4" w:color="D9D9D9"/>
+            </w:tcBorders>
+            <w:tcMar>
+              <w:top w:w="65" w:type="dxa"/>
+              <w:bottom w:w="65" w:type="dxa"/>
+              <w:left w:w="80" w:type="dxa"/>
+              <w:right w:w="80" w:type="dxa"/>
+            </w:tcMar>
+            <w:shd w:fill="EAEAEA"/>
+          </w:tcPr>
+          <w:p>
+            <w:pPr>
+              <w:spacing w:after="0" w:line="252" w:lineRule="auto"/>
+              <w:jc w:val="left"/>
+            </w:pPr>
+            <w:r>
+              <w:rPr>
+                <w:b/>
+                <w:sz w:val="19"/>
+              </w:rPr>
+              <w:t>Model</w:t>
+            </w:r>
+          </w:p>
+        </w:tc>
+        <w:tc>
+          <w:tcPr>
+            <w:tcW w:type="dxa" w:w="1584"/>
+            <w:vAlign w:val="center"/>
+            <w:tcBorders>
+              <w:top w:val="single" w:sz="4" w:color="D9D9D9"/>
+              <w:left w:val="single" w:sz="4" w:color="D9D9D9"/>
+              <w:bottom w:val="single" w:sz="4" w:color="D9D9D9"/>
+              <w:right w:val="single" w:sz="4" w:color="D9D9D9"/>
+            </w:tcBorders>
+            <w:tcMar>
+              <w:top w:w="65" w:type="dxa"/>
+              <w:bottom w:w="65" w:type="dxa"/>
+              <w:left w:w="80" w:type="dxa"/>
+              <w:right w:w="80" w:type="dxa"/>
+            </w:tcMar>
+            <w:shd w:fill="EAEAEA"/>
+          </w:tcPr>
+          <w:p>
+            <w:pPr>
+              <w:spacing w:after="0" w:line="252" w:lineRule="auto"/>
+              <w:jc w:val="center"/>
+            </w:pPr>
+            <w:r>
+              <w:rPr>
+                <w:b/>
+                <w:sz w:val="19"/>
+              </w:rPr>
+              <w:t>FP / ham</w:t>
+            </w:r>
+          </w:p>
+        </w:tc>
+        <w:tc>
+          <w:tcPr>
+            <w:tcW w:type="dxa" w:w="1152"/>
+            <w:vAlign w:val="center"/>
+            <w:tcBorders>
+              <w:top w:val="single" w:sz="4" w:color="D9D9D9"/>
+              <w:left w:val="single" w:sz="4" w:color="D9D9D9"/>
+              <w:bottom w:val="single" w:sz="4" w:color="D9D9D9"/>
+              <w:right w:val="single" w:sz="4" w:color="D9D9D9"/>
+            </w:tcBorders>
+            <w:tcMar>
+              <w:top w:w="65" w:type="dxa"/>
+              <w:bottom w:w="65" w:type="dxa"/>
+              <w:left w:w="80" w:type="dxa"/>
+              <w:right w:w="80" w:type="dxa"/>
+            </w:tcMar>
+            <w:shd w:fill="EAEAEA"/>
+          </w:tcPr>
+          <w:p>
+            <w:pPr>
+              <w:spacing w:after="0" w:line="252" w:lineRule="auto"/>
+              <w:jc w:val="center"/>
+            </w:pPr>
+            <w:r>
+              <w:rPr>
+                <w:b/>
+                <w:sz w:val="19"/>
+              </w:rPr>
+              <w:t>FPR</w:t>
+            </w:r>
+          </w:p>
+        </w:tc>
+        <w:tc>
+          <w:tcPr>
+            <w:tcW w:type="dxa" w:w="1944"/>
+            <w:vAlign w:val="center"/>
+            <w:tcBorders>
+              <w:top w:val="single" w:sz="4" w:color="D9D9D9"/>
+              <w:left w:val="single" w:sz="4" w:color="D9D9D9"/>
+              <w:bottom w:val="single" w:sz="4" w:color="D9D9D9"/>
+              <w:right w:val="single" w:sz="4" w:color="D9D9D9"/>
+            </w:tcBorders>
+            <w:tcMar>
+              <w:top w:w="65" w:type="dxa"/>
+              <w:bottom w:w="65" w:type="dxa"/>
+              <w:left w:w="80" w:type="dxa"/>
+              <w:right w:w="80" w:type="dxa"/>
+            </w:tcMar>
+            <w:shd w:fill="EAEAEA"/>
+          </w:tcPr>
+          <w:p>
+            <w:pPr>
+              <w:spacing w:after="0" w:line="252" w:lineRule="auto"/>
+              <w:jc w:val="center"/>
+            </w:pPr>
+            <w:r>
+              <w:rPr>
+                <w:b/>
+                <w:sz w:val="19"/>
+              </w:rPr>
+              <w:t>FN / spam</w:t>
+            </w:r>
+          </w:p>
+        </w:tc>
+        <w:tc>
+          <w:tcPr>
+            <w:tcW w:type="dxa" w:w="1440"/>
+            <w:vAlign w:val="center"/>
+            <w:tcBorders>
+              <w:top w:val="single" w:sz="4" w:color="D9D9D9"/>
+              <w:left w:val="single" w:sz="4" w:color="D9D9D9"/>
+              <w:bottom w:val="single" w:sz="4" w:color="D9D9D9"/>
+              <w:right w:val="single" w:sz="4" w:color="D9D9D9"/>
+            </w:tcBorders>
+            <w:tcMar>
+              <w:top w:w="65" w:type="dxa"/>
+              <w:bottom w:w="65" w:type="dxa"/>
+              <w:left w:w="80" w:type="dxa"/>
+              <w:right w:w="80" w:type="dxa"/>
+            </w:tcMar>
+            <w:shd w:fill="EAEAEA"/>
+          </w:tcPr>
+          <w:p>
+            <w:pPr>
+              <w:spacing w:after="0" w:line="252" w:lineRule="auto"/>
+              <w:jc w:val="center"/>
+            </w:pPr>
+            <w:r>
+              <w:rPr>
+                <w:b/>
+                <w:sz w:val="19"/>
+              </w:rPr>
+              <w:t>Recall</w:t>
+            </w:r>
+          </w:p>
+        </w:tc>
+        <w:tc>
+          <w:tcPr>
+            <w:tcW w:type="dxa" w:w="1584"/>
+            <w:vAlign w:val="center"/>
+            <w:tcBorders>
+              <w:top w:val="single" w:sz="4" w:color="D9D9D9"/>
+              <w:left w:val="single" w:sz="4" w:color="D9D9D9"/>
+              <w:bottom w:val="single" w:sz="4" w:color="D9D9D9"/>
+              <w:right w:val="single" w:sz="4" w:color="D9D9D9"/>
+            </w:tcBorders>
+            <w:tcMar>
+              <w:top w:w="65" w:type="dxa"/>
+              <w:bottom w:w="65" w:type="dxa"/>
+              <w:left w:w="80" w:type="dxa"/>
+              <w:right w:w="80" w:type="dxa"/>
+            </w:tcMar>
+            <w:shd w:fill="EAEAEA"/>
+          </w:tcPr>
+          <w:p>
+            <w:pPr>
+              <w:spacing w:after="0" w:line="252" w:lineRule="auto"/>
+              <w:jc w:val="center"/>
+            </w:pPr>
+            <w:r>
+              <w:rPr>
+                <w:b/>
+                <w:sz w:val="19"/>
+              </w:rPr>
+              <w:t>Spam F1</w:t>
+            </w:r>
+          </w:p>
+        </w:tc>
+      </w:tr>
+      <w:tr>
+        <w:trPr>
+          <w:cantSplit/>
+        </w:trPr>
+        <w:tc>
+          <w:tcPr>
+            <w:tcW w:type="dxa" w:w="2376"/>
+            <w:vAlign w:val="center"/>
+            <w:tcBorders>
+              <w:top w:val="single" w:sz="4" w:color="D9D9D9"/>
+              <w:left w:val="single" w:sz="4" w:color="D9D9D9"/>
+              <w:bottom w:val="single" w:sz="4" w:color="D9D9D9"/>
+              <w:right w:val="single" w:sz="4" w:color="D9D9D9"/>
+            </w:tcBorders>
+            <w:tcMar>
+              <w:top w:w="65" w:type="dxa"/>
+              <w:bottom w:w="65" w:type="dxa"/>
+              <w:left w:w="80" w:type="dxa"/>
+              <w:right w:w="80" w:type="dxa"/>
+            </w:tcMar>
+          </w:tcPr>
+          <w:p>
+            <w:pPr>
+              <w:spacing w:after="0" w:line="252" w:lineRule="auto"/>
+              <w:jc w:val="left"/>
+            </w:pPr>
+            <w:r>
+              <w:rPr>
+                <w:b w:val="0"/>
+                <w:sz w:val="19"/>
+              </w:rPr>
+              <w:t>Original</w:t>
+            </w:r>
+          </w:p>
+        </w:tc>
+        <w:tc>
+          <w:tcPr>
+            <w:tcW w:type="dxa" w:w="1584"/>
+            <w:vAlign w:val="center"/>
+            <w:tcBorders>
+              <w:top w:val="single" w:sz="4" w:color="D9D9D9"/>
+              <w:left w:val="single" w:sz="4" w:color="D9D9D9"/>
+              <w:bottom w:val="single" w:sz="4" w:color="D9D9D9"/>
+              <w:right w:val="single" w:sz="4" w:color="D9D9D9"/>
+            </w:tcBorders>
+            <w:tcMar>
+              <w:top w:w="65" w:type="dxa"/>
+              <w:bottom w:w="65" w:type="dxa"/>
+              <w:left w:w="80" w:type="dxa"/>
+              <w:right w:w="80" w:type="dxa"/>
+            </w:tcMar>
+          </w:tcPr>
+          <w:p>
+            <w:pPr>
+              <w:spacing w:after="0" w:line="252" w:lineRule="auto"/>
+              <w:jc w:val="center"/>
+            </w:pPr>
+            <w:r>
+              <w:rPr>
+                <w:b w:val="0"/>
+                <w:sz w:val="19"/>
+              </w:rPr>
+              <w:t>15 / 1178</w:t>
+            </w:r>
+          </w:p>
+        </w:tc>
+        <w:tc>
+          <w:tcPr>
+            <w:tcW w:type="dxa" w:w="1152"/>
+            <w:vAlign w:val="center"/>
+            <w:tcBorders>
+              <w:top w:val="single" w:sz="4" w:color="D9D9D9"/>
+              <w:left w:val="single" w:sz="4" w:color="D9D9D9"/>
+              <w:bottom w:val="single" w:sz="4" w:color="D9D9D9"/>
+              <w:right w:val="single" w:sz="4" w:color="D9D9D9"/>
+            </w:tcBorders>
+            <w:tcMar>
+              <w:top w:w="65" w:type="dxa"/>
+              <w:bottom w:w="65" w:type="dxa"/>
+              <w:left w:w="80" w:type="dxa"/>
+              <w:right w:w="80" w:type="dxa"/>
+            </w:tcMar>
+          </w:tcPr>
+          <w:p>
+            <w:pPr>
+              <w:spacing w:after="0" w:line="252" w:lineRule="auto"/>
+              <w:jc w:val="center"/>
+            </w:pPr>
+            <w:r>
+              <w:rPr>
+                <w:b w:val="0"/>
+                <w:sz w:val="19"/>
+              </w:rPr>
+              <w:t>1.27%</w:t>
+            </w:r>
+          </w:p>
+        </w:tc>
+        <w:tc>
+          <w:tcPr>
+            <w:tcW w:type="dxa" w:w="1944"/>
+            <w:vAlign w:val="center"/>
+            <w:tcBorders>
+              <w:top w:val="single" w:sz="4" w:color="D9D9D9"/>
+              <w:left w:val="single" w:sz="4" w:color="D9D9D9"/>
+              <w:bottom w:val="single" w:sz="4" w:color="D9D9D9"/>
+              <w:right w:val="single" w:sz="4" w:color="D9D9D9"/>
+            </w:tcBorders>
+            <w:tcMar>
+              <w:top w:w="65" w:type="dxa"/>
+              <w:bottom w:w="65" w:type="dxa"/>
+              <w:left w:w="80" w:type="dxa"/>
+              <w:right w:w="80" w:type="dxa"/>
+            </w:tcMar>
+          </w:tcPr>
+          <w:p>
+            <w:pPr>
+              <w:spacing w:after="0" w:line="252" w:lineRule="auto"/>
+              <w:jc w:val="center"/>
+            </w:pPr>
+            <w:r>
+              <w:rPr>
+                <w:b w:val="0"/>
+                <w:sz w:val="19"/>
+              </w:rPr>
+              <w:t>3561 / 7109</w:t>
+            </w:r>
+          </w:p>
+        </w:tc>
+        <w:tc>
+          <w:tcPr>
+            <w:tcW w:type="dxa" w:w="1440"/>
+            <w:vAlign w:val="center"/>
+            <w:tcBorders>
+              <w:top w:val="single" w:sz="4" w:color="D9D9D9"/>
+              <w:left w:val="single" w:sz="4" w:color="D9D9D9"/>
+              <w:bottom w:val="single" w:sz="4" w:color="D9D9D9"/>
+              <w:right w:val="single" w:sz="4" w:color="D9D9D9"/>
+            </w:tcBorders>
+            <w:tcMar>
+              <w:top w:w="65" w:type="dxa"/>
+              <w:bottom w:w="65" w:type="dxa"/>
+              <w:left w:w="80" w:type="dxa"/>
+              <w:right w:w="80" w:type="dxa"/>
+            </w:tcMar>
+          </w:tcPr>
+          <w:p>
+            <w:pPr>
+              <w:spacing w:after="0" w:line="252" w:lineRule="auto"/>
+              <w:jc w:val="center"/>
+            </w:pPr>
+            <w:r>
+              <w:rPr>
+                <w:b w:val="0"/>
+                <w:sz w:val="19"/>
+              </w:rPr>
+              <w:t>49.91%</w:t>
+            </w:r>
+          </w:p>
+        </w:tc>
+        <w:tc>
+          <w:tcPr>
+            <w:tcW w:type="dxa" w:w="1584"/>
+            <w:vAlign w:val="center"/>
+            <w:tcBorders>
+              <w:top w:val="single" w:sz="4" w:color="D9D9D9"/>
+              <w:left w:val="single" w:sz="4" w:color="D9D9D9"/>
+              <w:bottom w:val="single" w:sz="4" w:color="D9D9D9"/>
+              <w:right w:val="single" w:sz="4" w:color="D9D9D9"/>
+            </w:tcBorders>
+            <w:tcMar>
+              <w:top w:w="65" w:type="dxa"/>
+              <w:bottom w:w="65" w:type="dxa"/>
+              <w:left w:w="80" w:type="dxa"/>
+              <w:right w:w="80" w:type="dxa"/>
+            </w:tcMar>
+          </w:tcPr>
+          <w:p>
+            <w:pPr>
+              <w:spacing w:after="0" w:line="252" w:lineRule="auto"/>
+              <w:jc w:val="center"/>
+            </w:pPr>
+            <w:r>
+              <w:rPr>
+                <w:b w:val="0"/>
+                <w:sz w:val="19"/>
+              </w:rPr>
+              <w:t>0.6649</w:t>
+            </w:r>
+          </w:p>
+        </w:tc>
+      </w:tr>
+      <w:tr>
+        <w:trPr>
+          <w:cantSplit/>
+        </w:trPr>
+        <w:tc>
+          <w:tcPr>
+            <w:tcW w:type="dxa" w:w="2376"/>
+            <w:vAlign w:val="center"/>
+            <w:tcBorders>
+              <w:top w:val="single" w:sz="4" w:color="D9D9D9"/>
+              <w:left w:val="single" w:sz="4" w:color="D9D9D9"/>
+              <w:bottom w:val="single" w:sz="4" w:color="D9D9D9"/>
+              <w:right w:val="single" w:sz="4" w:color="D9D9D9"/>
+            </w:tcBorders>
+            <w:tcMar>
+              <w:top w:w="65" w:type="dxa"/>
+              <w:bottom w:w="65" w:type="dxa"/>
+              <w:left w:w="80" w:type="dxa"/>
+              <w:right w:w="80" w:type="dxa"/>
+            </w:tcMar>
+          </w:tcPr>
+          <w:p>
+            <w:pPr>
+              <w:spacing w:after="0" w:line="252" w:lineRule="auto"/>
+              <w:jc w:val="left"/>
+            </w:pPr>
+            <w:r>
+              <w:rPr>
+                <w:b w:val="0"/>
+                <w:sz w:val="19"/>
+              </w:rPr>
+              <w:t>Previous adaptation</w:t>
+            </w:r>
+          </w:p>
+        </w:tc>
+        <w:tc>
+          <w:tcPr>
+            <w:tcW w:type="dxa" w:w="1584"/>
+            <w:vAlign w:val="center"/>
+            <w:tcBorders>
+              <w:top w:val="single" w:sz="4" w:color="D9D9D9"/>
+              <w:left w:val="single" w:sz="4" w:color="D9D9D9"/>
+              <w:bottom w:val="single" w:sz="4" w:color="D9D9D9"/>
+              <w:right w:val="single" w:sz="4" w:color="D9D9D9"/>
+            </w:tcBorders>
+            <w:tcMar>
+              <w:top w:w="65" w:type="dxa"/>
+              <w:bottom w:w="65" w:type="dxa"/>
+              <w:left w:w="80" w:type="dxa"/>
+              <w:right w:w="80" w:type="dxa"/>
+            </w:tcMar>
+          </w:tcPr>
+          <w:p>
+            <w:pPr>
+              <w:spacing w:after="0" w:line="252" w:lineRule="auto"/>
+              <w:jc w:val="center"/>
+            </w:pPr>
+            <w:r>
+              <w:rPr>
+                <w:b w:val="0"/>
+                <w:sz w:val="19"/>
+              </w:rPr>
+              <w:t>17 / 1178</w:t>
+            </w:r>
+          </w:p>
+        </w:tc>
+        <w:tc>
+          <w:tcPr>
+            <w:tcW w:type="dxa" w:w="1152"/>
+            <w:vAlign w:val="center"/>
+            <w:tcBorders>
+              <w:top w:val="single" w:sz="4" w:color="D9D9D9"/>
+              <w:left w:val="single" w:sz="4" w:color="D9D9D9"/>
+              <w:bottom w:val="single" w:sz="4" w:color="D9D9D9"/>
+              <w:right w:val="single" w:sz="4" w:color="D9D9D9"/>
+            </w:tcBorders>
+            <w:tcMar>
+              <w:top w:w="65" w:type="dxa"/>
+              <w:bottom w:w="65" w:type="dxa"/>
+              <w:left w:w="80" w:type="dxa"/>
+              <w:right w:w="80" w:type="dxa"/>
+            </w:tcMar>
+          </w:tcPr>
+          <w:p>
+            <w:pPr>
+              <w:spacing w:after="0" w:line="252" w:lineRule="auto"/>
+              <w:jc w:val="center"/>
+            </w:pPr>
+            <w:r>
+              <w:rPr>
+                <w:b w:val="0"/>
+                <w:sz w:val="19"/>
+              </w:rPr>
+              <w:t>1.44%</w:t>
+            </w:r>
+          </w:p>
+        </w:tc>
+        <w:tc>
+          <w:tcPr>
+            <w:tcW w:type="dxa" w:w="1944"/>
+            <w:vAlign w:val="center"/>
+            <w:tcBorders>
+              <w:top w:val="single" w:sz="4" w:color="D9D9D9"/>
+              <w:left w:val="single" w:sz="4" w:color="D9D9D9"/>
+              <w:bottom w:val="single" w:sz="4" w:color="D9D9D9"/>
+              <w:right w:val="single" w:sz="4" w:color="D9D9D9"/>
+            </w:tcBorders>
+            <w:tcMar>
+              <w:top w:w="65" w:type="dxa"/>
+              <w:bottom w:w="65" w:type="dxa"/>
+              <w:left w:w="80" w:type="dxa"/>
+              <w:right w:w="80" w:type="dxa"/>
+            </w:tcMar>
+          </w:tcPr>
+          <w:p>
+            <w:pPr>
+              <w:spacing w:after="0" w:line="252" w:lineRule="auto"/>
+              <w:jc w:val="center"/>
+            </w:pPr>
+            <w:r>
+              <w:rPr>
+                <w:b w:val="0"/>
+                <w:sz w:val="19"/>
+              </w:rPr>
+              <w:t>1901 / 7109</w:t>
+            </w:r>
+          </w:p>
+        </w:tc>
+        <w:tc>
+          <w:tcPr>
+            <w:tcW w:type="dxa" w:w="1440"/>
+            <w:vAlign w:val="center"/>
+            <w:tcBorders>
+              <w:top w:val="single" w:sz="4" w:color="D9D9D9"/>
+              <w:left w:val="single" w:sz="4" w:color="D9D9D9"/>
+              <w:bottom w:val="single" w:sz="4" w:color="D9D9D9"/>
+              <w:right w:val="single" w:sz="4" w:color="D9D9D9"/>
+            </w:tcBorders>
+            <w:tcMar>
+              <w:top w:w="65" w:type="dxa"/>
+              <w:bottom w:w="65" w:type="dxa"/>
+              <w:left w:w="80" w:type="dxa"/>
+              <w:right w:w="80" w:type="dxa"/>
+            </w:tcMar>
+          </w:tcPr>
+          <w:p>
+            <w:pPr>
+              <w:spacing w:after="0" w:line="252" w:lineRule="auto"/>
+              <w:jc w:val="center"/>
+            </w:pPr>
+            <w:r>
+              <w:rPr>
+                <w:b w:val="0"/>
+                <w:sz w:val="19"/>
+              </w:rPr>
+              <w:t>73.26%</w:t>
+            </w:r>
+          </w:p>
+        </w:tc>
+        <w:tc>
+          <w:tcPr>
+            <w:tcW w:type="dxa" w:w="1584"/>
+            <w:vAlign w:val="center"/>
+            <w:tcBorders>
+              <w:top w:val="single" w:sz="4" w:color="D9D9D9"/>
+              <w:left w:val="single" w:sz="4" w:color="D9D9D9"/>
+              <w:bottom w:val="single" w:sz="4" w:color="D9D9D9"/>
+              <w:right w:val="single" w:sz="4" w:color="D9D9D9"/>
+            </w:tcBorders>
+            <w:tcMar>
+              <w:top w:w="65" w:type="dxa"/>
+              <w:bottom w:w="65" w:type="dxa"/>
+              <w:left w:w="80" w:type="dxa"/>
+              <w:right w:w="80" w:type="dxa"/>
+            </w:tcMar>
+          </w:tcPr>
+          <w:p>
+            <w:pPr>
+              <w:spacing w:after="0" w:line="252" w:lineRule="auto"/>
+              <w:jc w:val="center"/>
+            </w:pPr>
+            <w:r>
+              <w:rPr>
+                <w:b w:val="0"/>
+                <w:sz w:val="19"/>
+              </w:rPr>
+              <w:t>0.8445</w:t>
+            </w:r>
+          </w:p>
+        </w:tc>
+      </w:tr>
+      <w:tr>
+        <w:trPr>
+          <w:cantSplit/>
+        </w:trPr>
+        <w:tc>
+          <w:tcPr>
+            <w:tcW w:type="dxa" w:w="2376"/>
+            <w:vAlign w:val="center"/>
+            <w:tcBorders>
+              <w:top w:val="single" w:sz="4" w:color="D9D9D9"/>
+              <w:left w:val="single" w:sz="4" w:color="D9D9D9"/>
+              <w:bottom w:val="single" w:sz="4" w:color="D9D9D9"/>
+              <w:right w:val="single" w:sz="4" w:color="D9D9D9"/>
+            </w:tcBorders>
+            <w:tcMar>
+              <w:top w:w="65" w:type="dxa"/>
+              <w:bottom w:w="65" w:type="dxa"/>
+              <w:left w:w="80" w:type="dxa"/>
+              <w:right w:w="80" w:type="dxa"/>
+            </w:tcMar>
+          </w:tcPr>
+          <w:p>
+            <w:pPr>
+              <w:spacing w:after="0" w:line="252" w:lineRule="auto"/>
+              <w:jc w:val="left"/>
+            </w:pPr>
+            <w:r>
+              <w:rPr>
+                <w:b w:val="0"/>
+                <w:sz w:val="19"/>
+              </w:rPr>
+              <w:t>Threshold only</w:t>
+            </w:r>
+          </w:p>
+        </w:tc>
+        <w:tc>
+          <w:tcPr>
+            <w:tcW w:type="dxa" w:w="1584"/>
+            <w:vAlign w:val="center"/>
+            <w:tcBorders>
+              <w:top w:val="single" w:sz="4" w:color="D9D9D9"/>
+              <w:left w:val="single" w:sz="4" w:color="D9D9D9"/>
+              <w:bottom w:val="single" w:sz="4" w:color="D9D9D9"/>
+              <w:right w:val="single" w:sz="4" w:color="D9D9D9"/>
+            </w:tcBorders>
+            <w:tcMar>
+              <w:top w:w="65" w:type="dxa"/>
+              <w:bottom w:w="65" w:type="dxa"/>
+              <w:left w:w="80" w:type="dxa"/>
+              <w:right w:w="80" w:type="dxa"/>
+            </w:tcMar>
+          </w:tcPr>
+          <w:p>
+            <w:pPr>
+              <w:spacing w:after="0" w:line="252" w:lineRule="auto"/>
+              <w:jc w:val="center"/>
+            </w:pPr>
+            <w:r>
+              <w:rPr>
+                <w:b w:val="0"/>
+                <w:sz w:val="19"/>
+              </w:rPr>
+              <w:t>0 / 1178</w:t>
+            </w:r>
+          </w:p>
+        </w:tc>
+        <w:tc>
+          <w:tcPr>
+            <w:tcW w:type="dxa" w:w="1152"/>
+            <w:vAlign w:val="center"/>
+            <w:tcBorders>
+              <w:top w:val="single" w:sz="4" w:color="D9D9D9"/>
+              <w:left w:val="single" w:sz="4" w:color="D9D9D9"/>
+              <w:bottom w:val="single" w:sz="4" w:color="D9D9D9"/>
+              <w:right w:val="single" w:sz="4" w:color="D9D9D9"/>
+            </w:tcBorders>
+            <w:tcMar>
+              <w:top w:w="65" w:type="dxa"/>
+              <w:bottom w:w="65" w:type="dxa"/>
+              <w:left w:w="80" w:type="dxa"/>
+              <w:right w:w="80" w:type="dxa"/>
+            </w:tcMar>
+          </w:tcPr>
+          <w:p>
+            <w:pPr>
+              <w:spacing w:after="0" w:line="252" w:lineRule="auto"/>
+              <w:jc w:val="center"/>
+            </w:pPr>
+            <w:r>
+              <w:rPr>
+                <w:b w:val="0"/>
+                <w:sz w:val="19"/>
+              </w:rPr>
+              <w:t>0.00%</w:t>
+            </w:r>
+          </w:p>
+        </w:tc>
+        <w:tc>
+          <w:tcPr>
+            <w:tcW w:type="dxa" w:w="1944"/>
+            <w:vAlign w:val="center"/>
+            <w:tcBorders>
+              <w:top w:val="single" w:sz="4" w:color="D9D9D9"/>
+              <w:left w:val="single" w:sz="4" w:color="D9D9D9"/>
+              <w:bottom w:val="single" w:sz="4" w:color="D9D9D9"/>
+              <w:right w:val="single" w:sz="4" w:color="D9D9D9"/>
+            </w:tcBorders>
+            <w:tcMar>
+              <w:top w:w="65" w:type="dxa"/>
+              <w:bottom w:w="65" w:type="dxa"/>
+              <w:left w:w="80" w:type="dxa"/>
+              <w:right w:w="80" w:type="dxa"/>
+            </w:tcMar>
+          </w:tcPr>
+          <w:p>
+            <w:pPr>
+              <w:spacing w:after="0" w:line="252" w:lineRule="auto"/>
+              <w:jc w:val="center"/>
+            </w:pPr>
+            <w:r>
+              <w:rPr>
+                <w:b w:val="0"/>
+                <w:sz w:val="19"/>
+              </w:rPr>
+              <w:t>6762 / 7109</w:t>
+            </w:r>
+          </w:p>
+        </w:tc>
+        <w:tc>
+          <w:tcPr>
+            <w:tcW w:type="dxa" w:w="1440"/>
+            <w:vAlign w:val="center"/>
+            <w:tcBorders>
+              <w:top w:val="single" w:sz="4" w:color="D9D9D9"/>
+              <w:left w:val="single" w:sz="4" w:color="D9D9D9"/>
+              <w:bottom w:val="single" w:sz="4" w:color="D9D9D9"/>
+              <w:right w:val="single" w:sz="4" w:color="D9D9D9"/>
+            </w:tcBorders>
+            <w:tcMar>
+              <w:top w:w="65" w:type="dxa"/>
+              <w:bottom w:w="65" w:type="dxa"/>
+              <w:left w:w="80" w:type="dxa"/>
+              <w:right w:w="80" w:type="dxa"/>
+            </w:tcMar>
+          </w:tcPr>
+          <w:p>
+            <w:pPr>
+              <w:spacing w:after="0" w:line="252" w:lineRule="auto"/>
+              <w:jc w:val="center"/>
+            </w:pPr>
+            <w:r>
+              <w:rPr>
+                <w:b w:val="0"/>
+                <w:sz w:val="19"/>
+              </w:rPr>
+              <w:t>4.88%</w:t>
+            </w:r>
+          </w:p>
+        </w:tc>
+        <w:tc>
+          <w:tcPr>
+            <w:tcW w:type="dxa" w:w="1584"/>
+            <w:vAlign w:val="center"/>
+            <w:tcBorders>
+              <w:top w:val="single" w:sz="4" w:color="D9D9D9"/>
+              <w:left w:val="single" w:sz="4" w:color="D9D9D9"/>
+              <w:bottom w:val="single" w:sz="4" w:color="D9D9D9"/>
+              <w:right w:val="single" w:sz="4" w:color="D9D9D9"/>
+            </w:tcBorders>
+            <w:tcMar>
+              <w:top w:w="65" w:type="dxa"/>
+              <w:bottom w:w="65" w:type="dxa"/>
+              <w:left w:w="80" w:type="dxa"/>
+              <w:right w:w="80" w:type="dxa"/>
+            </w:tcMar>
+          </w:tcPr>
+          <w:p>
+            <w:pPr>
+              <w:spacing w:after="0" w:line="252" w:lineRule="auto"/>
+              <w:jc w:val="center"/>
+            </w:pPr>
+            <w:r>
+              <w:rPr>
+                <w:b w:val="0"/>
+                <w:sz w:val="19"/>
+              </w:rPr>
+              <w:t>0.0931</w:t>
+            </w:r>
+          </w:p>
+        </w:tc>
+      </w:tr>
+      <w:tr>
+        <w:trPr>
+          <w:cantSplit/>
+        </w:trPr>
+        <w:tc>
+          <w:tcPr>
+            <w:tcW w:type="dxa" w:w="2376"/>
+            <w:vAlign w:val="center"/>
+            <w:tcBorders>
+              <w:top w:val="single" w:sz="4" w:color="D9D9D9"/>
+              <w:left w:val="single" w:sz="4" w:color="D9D9D9"/>
+              <w:bottom w:val="single" w:sz="4" w:color="D9D9D9"/>
+              <w:right w:val="single" w:sz="4" w:color="D9D9D9"/>
+            </w:tcBorders>
+            <w:tcMar>
+              <w:top w:w="65" w:type="dxa"/>
+              <w:bottom w:w="65" w:type="dxa"/>
+              <w:left w:w="80" w:type="dxa"/>
+              <w:right w:w="80" w:type="dxa"/>
+            </w:tcMar>
+          </w:tcPr>
+          <w:p>
+            <w:pPr>
+              <w:spacing w:after="0" w:line="252" w:lineRule="auto"/>
+              <w:jc w:val="left"/>
+            </w:pPr>
+            <w:r>
+              <w:rPr>
+                <w:b w:val="0"/>
+                <w:sz w:val="19"/>
+              </w:rPr>
+              <w:t>Expanded data</w:t>
+            </w:r>
+          </w:p>
+        </w:tc>
+        <w:tc>
+          <w:tcPr>
+            <w:tcW w:type="dxa" w:w="1584"/>
+            <w:vAlign w:val="center"/>
+            <w:tcBorders>
+              <w:top w:val="single" w:sz="4" w:color="D9D9D9"/>
+              <w:left w:val="single" w:sz="4" w:color="D9D9D9"/>
+              <w:bottom w:val="single" w:sz="4" w:color="D9D9D9"/>
+              <w:right w:val="single" w:sz="4" w:color="D9D9D9"/>
+            </w:tcBorders>
+            <w:tcMar>
+              <w:top w:w="65" w:type="dxa"/>
+              <w:bottom w:w="65" w:type="dxa"/>
+              <w:left w:w="80" w:type="dxa"/>
+              <w:right w:w="80" w:type="dxa"/>
+            </w:tcMar>
+          </w:tcPr>
+          <w:p>
+            <w:pPr>
+              <w:spacing w:after="0" w:line="252" w:lineRule="auto"/>
+              <w:jc w:val="center"/>
+            </w:pPr>
+            <w:r>
+              <w:rPr>
+                <w:b w:val="0"/>
+                <w:sz w:val="19"/>
+              </w:rPr>
+              <w:t>14 / 1178</w:t>
+            </w:r>
+          </w:p>
+        </w:tc>
+        <w:tc>
+          <w:tcPr>
+            <w:tcW w:type="dxa" w:w="1152"/>
+            <w:vAlign w:val="center"/>
+            <w:tcBorders>
+              <w:top w:val="single" w:sz="4" w:color="D9D9D9"/>
+              <w:left w:val="single" w:sz="4" w:color="D9D9D9"/>
+              <w:bottom w:val="single" w:sz="4" w:color="D9D9D9"/>
+              <w:right w:val="single" w:sz="4" w:color="D9D9D9"/>
+            </w:tcBorders>
+            <w:tcMar>
+              <w:top w:w="65" w:type="dxa"/>
+              <w:bottom w:w="65" w:type="dxa"/>
+              <w:left w:w="80" w:type="dxa"/>
+              <w:right w:w="80" w:type="dxa"/>
+            </w:tcMar>
+          </w:tcPr>
+          <w:p>
+            <w:pPr>
+              <w:spacing w:after="0" w:line="252" w:lineRule="auto"/>
+              <w:jc w:val="center"/>
+            </w:pPr>
+            <w:r>
+              <w:rPr>
+                <w:b w:val="0"/>
+                <w:sz w:val="19"/>
+              </w:rPr>
+              <w:t>1.19%</w:t>
+            </w:r>
+          </w:p>
+        </w:tc>
+        <w:tc>
+          <w:tcPr>
+            <w:tcW w:type="dxa" w:w="1944"/>
+            <w:vAlign w:val="center"/>
+            <w:tcBorders>
+              <w:top w:val="single" w:sz="4" w:color="D9D9D9"/>
+              <w:left w:val="single" w:sz="4" w:color="D9D9D9"/>
+              <w:bottom w:val="single" w:sz="4" w:color="D9D9D9"/>
+              <w:right w:val="single" w:sz="4" w:color="D9D9D9"/>
+            </w:tcBorders>
+            <w:tcMar>
+              <w:top w:w="65" w:type="dxa"/>
+              <w:bottom w:w="65" w:type="dxa"/>
+              <w:left w:w="80" w:type="dxa"/>
+              <w:right w:w="80" w:type="dxa"/>
+            </w:tcMar>
+          </w:tcPr>
+          <w:p>
+            <w:pPr>
+              <w:spacing w:after="0" w:line="252" w:lineRule="auto"/>
+              <w:jc w:val="center"/>
+            </w:pPr>
+            <w:r>
+              <w:rPr>
+                <w:b w:val="0"/>
+                <w:sz w:val="19"/>
+              </w:rPr>
+              <w:t>340 / 7109</w:t>
+            </w:r>
+          </w:p>
+        </w:tc>
+        <w:tc>
+          <w:tcPr>
+            <w:tcW w:type="dxa" w:w="1440"/>
+            <w:vAlign w:val="center"/>
+            <w:tcBorders>
+              <w:top w:val="single" w:sz="4" w:color="D9D9D9"/>
+              <w:left w:val="single" w:sz="4" w:color="D9D9D9"/>
+              <w:bottom w:val="single" w:sz="4" w:color="D9D9D9"/>
+              <w:right w:val="single" w:sz="4" w:color="D9D9D9"/>
+            </w:tcBorders>
+            <w:tcMar>
+              <w:top w:w="65" w:type="dxa"/>
+              <w:bottom w:w="65" w:type="dxa"/>
+              <w:left w:w="80" w:type="dxa"/>
+              <w:right w:w="80" w:type="dxa"/>
+            </w:tcMar>
+          </w:tcPr>
+          <w:p>
+            <w:pPr>
+              <w:spacing w:after="0" w:line="252" w:lineRule="auto"/>
+              <w:jc w:val="center"/>
+            </w:pPr>
+            <w:r>
+              <w:rPr>
+                <w:b w:val="0"/>
+                <w:sz w:val="19"/>
+              </w:rPr>
+              <w:t>95.22%</w:t>
+            </w:r>
+          </w:p>
+        </w:tc>
+        <w:tc>
+          <w:tcPr>
+            <w:tcW w:type="dxa" w:w="1584"/>
+            <w:vAlign w:val="center"/>
+            <w:tcBorders>
+              <w:top w:val="single" w:sz="4" w:color="D9D9D9"/>
+              <w:left w:val="single" w:sz="4" w:color="D9D9D9"/>
+              <w:bottom w:val="single" w:sz="4" w:color="D9D9D9"/>
+              <w:right w:val="single" w:sz="4" w:color="D9D9D9"/>
+            </w:tcBorders>
+            <w:tcMar>
+              <w:top w:w="65" w:type="dxa"/>
+              <w:bottom w:w="65" w:type="dxa"/>
+              <w:left w:w="80" w:type="dxa"/>
+              <w:right w:w="80" w:type="dxa"/>
+            </w:tcMar>
+          </w:tcPr>
+          <w:p>
+            <w:pPr>
+              <w:spacing w:after="0" w:line="252" w:lineRule="auto"/>
+              <w:jc w:val="center"/>
+            </w:pPr>
+            <w:r>
+              <w:rPr>
+                <w:b w:val="0"/>
+                <w:sz w:val="19"/>
+              </w:rPr>
+              <w:t>0.9745</w:t>
+            </w:r>
+          </w:p>
+        </w:tc>
+      </w:tr>
+    </w:tbl>
+    <w:p>
+      <w:pPr>
+        <w:spacing w:after="0"/>
+      </w:pPr>
+    </w:p>
+    <w:p>
+      <w:r>
+        <w:t>The new model corrects ten earlier ham errors and introduces seven. The FPR change versus the previous adaptation is -0.25 percentage points, with a paired conditional 95% interval of -1.02 to +0.51 points; the decrease is not established. Candidate FPR is 1.19% (interval 0.59–1.94%), exceeding the 1% gate. Recall improves by 21.96 points (interval +20.64 to +23.30), with ROC-AUC 0.9946. Recalibrating only the previous model's threshold on the same validation set yields zero FP but 4.88% recall. The refit remains experimental, with no further tuning after test inspection.</w:t>
       </w:r>
     </w:p>
     <w:p>
       <w:r>
-        <w:t>The word model combines high historical F1 with sensitivity to separator edits and limited source transfer. Refitting on newer messages improves spam recall and same-source financial F1, but increases false positives on independent government notifications. This measured tradeoff prevents replacing the default. Further progress needs more diverse genuine ordinary SMS and a new untouched test; the reported holdouts must not be reused as independent evidence after tuning on these findings.</w:t>
+        <w:t>This is a held-out component sample from the same author corpus as added development data, not an unseen-provider or chronological test. Recipient consent, sender identity, individual dates, label ambiguity and occasional transliteration/encoding artifacts limit inference. Precision and F1 depend on the spam-heavy mix. The comparison does not isolate ham's causal contribution because spam and PSA development also change.</w:t>
+      </w:r>
+    </w:p>
+    <w:p>
+      <w:r>
+        <w:br w:type="page"/>
+      </w:r>
+    </w:p>
+    <w:p>
+      <w:pPr>
+        <w:pStyle w:val="Heading1"/>
+      </w:pPr>
+      <w:r>
+        <w:t>13 Reproducibility and conclusion</w:t>
+      </w:r>
+    </w:p>
+    <w:p>
+      <w:r>
+        <w:t>The repository supplies split/CV manifests, all search results, predictions, attack realizations and conditional intervals. Data, code and artifacts have SHA-256 records. Both historical protocols were independently verified, including all 7,920 attack metric rows per run. Python 3.12.14, scikit-learn 1.9.1 and dependencies are pinned. Hash-matched binaries remain local; completed runs cannot silently be overwritten.</w:t>
+      </w:r>
+    </w:p>
+    <w:p>
+      <w:r>
+        <w:t>Separate verification scripts reconstruct external scores and independently check adaptation thresholds, metrics and paired intervals without fitting. The first adaptation records 18,204 validation and 1,664 test scores. The ham expansion records 59,101 validation and 33,148 test scores, including the threshold-only control and three 5,000-draw comparisons. The source audits, frozen rules and reproduction commands are documented in docs/MODERN_ADAPTATION.md and docs/HAM_EXPANSION.md.</w:t>
+      </w:r>
+    </w:p>
+    <w:p>
+      <w:r>
+        <w:t>The word model has high historical F1 but limited source transfer. Broader training improves spam recall; the latest FPR decrease remains statistically uncertain and FPR exceeds the chosen limit. Neither adaptation replaces the default. Further evaluation needs dated ordinary SMS from an unseen provider, with consent context and a new untouched test. Inspected holdouts cannot support another independent claim after tuning.</w:t>
       </w:r>
     </w:p>
     <w:p>
@@ -6814,6 +7839,17 @@
           <w:sz w:val="19"/>
         </w:rPr>
         <w:t>[11] S. L. Chua. Spam of the Times: spam and marketing SMS. CC BY 4.0. Snapshot ad50c348c53f738645f78ee8baa8be5082a1de91, 20 August 2026. https://github.com/scottleechua/data/tree/ad50c348c53f738645f78ee8baa8be5082a1de91/spam-and-marketing-sms</w:t>
+      </w:r>
+    </w:p>
+    <w:p>
+      <w:pPr>
+        <w:spacing w:after="140"/>
+      </w:pPr>
+      <w:r>
+        <w:rPr>
+          <w:sz w:val="19"/>
+        </w:rPr>
+        <w:t>[12] M. Salman, M. Ikram and M. A. Kaafar. Investigating Evasive Techniques in SMS Spam Filtering: A Comparative Analysis of Machine Learning Models. IEEE Access, vol. 12, pp. 24306–24324, 2024. DOI: 10.1109/ACCESS.2024.3364671. Data: https://github.com/smspamresearch/spstudy (2018–2023 subset, snapshot d83c99c6c3ae8c498b373e66b3a8129356a87b63).</w:t>
       </w:r>
     </w:p>
     <w:sectPr>

</xml_diff>

<commit_message>
docs: align model scope across research materials
</commit_message>
<xml_diff>
--- a/paper/SMS_Spam_Detection_Paper.docx
+++ b/paper/SMS_Spam_Detection_Paper.docx
@@ -27,7 +27,7 @@
     </w:p>
     <w:p>
       <w:r>
-        <w:t>This study evaluates eleven sparse classifiers on the historical English SMS Spam Collection, separating training search, validation thresholds and final testing. The selected word TF-IDF LinearSVC achieves spam F1 0.9531, with four false positives and eight misses among 1,034 test messages. Its conditional 95% group-bootstrap F1 interval is 0.9249 to 0.9769. Separator insertion lowers mean recall from 0.9385 to 0.6035. On 372 independent English reports dated 2023–2024, the unchanged model detects 176: recall 47.31%. A first adaptation improves independent SMS recall but increases false positives on government notifications from 11/55 to 19/55. A second study adds 1,968 ordinary training SMS from an author corpus covering 2018–2023. On its new group holdout, false positives change from 17 to 14 of 1,178 ham, while recall rises from 73.26% to 95.22% on 7,109 spam messages. The FPR difference is statistically inconclusive and 1.19% exceeds the 1% target. Both candidates fail their replacement criteria. These findings distinguish improved spam detection from demonstrated protection of legitimate communication.</w:t>
+        <w:t>This study evaluates eleven sparse classifiers on the historical English SMS Spam Collection, separating training search, validation thresholds and final testing. The selected word TF-IDF LinearSVC achieves spam F1 0.9531, with four false positives and eight misses among 1,034 test messages. Its conditional 95% group-bootstrap F1 interval is 0.9249 to 0.9769. Separator insertion at intensity 0.3 lowers mean recall from 0.9385 to 0.6035. On 372 external English reports dated 2023–2024, the unchanged model detects 176: recall 47.31%. Two subsequent adaptation studies improve recall but fail their replacement criteria: the first increases false positives on government notifications, while the second has an uncertain FPR decrease and exceeds the 1% limit on its new group holdout. The original model remains the default. The completed studies document strong historical performance, limited source transfer and unresolved false-positive costs.</w:t>
       </w:r>
     </w:p>
     <w:p>
@@ -50,7 +50,7 @@
     </w:p>
     <w:p>
       <w:r>
-        <w:t>The contribution is an auditable comparison of representations and decision rules. Candidates share training folds and attack realizations. Model choice is frozen before test scoring, and validation chooses the threshold. A second grouping rule examines residual template overlap. An independent collection of reported SMS then tests transfer with the original model and threshold. A separate adaptation follow-up uses those inspected reports for development and reserves new test data.</w:t>
+        <w:t>The contribution is an auditable comparison of representations and decision rules. Candidates share training folds and attack realizations. Model choice is frozen before test scoring, and validation chooses the threshold. A second grouping rule examines residual template overlap. A separate collection of reported SMS then tests transfer with the original model and threshold. Two adaptation studies subsequently use inspected data for development, each reserving new test data before fitting and selection.</w:t>
       </w:r>
     </w:p>
     <w:p>
@@ -806,7 +806,7 @@
         <w:keepNext/>
       </w:pPr>
       <w:r>
-        <w:t>Table 2. Default protocol. FP/FN and FPR use the validation threshold. *CV-selected model.</w:t>
+        <w:t>Table 2. Default protocol. Native F1 uses classifier predictions; tuned F1, FP/FN and FPR use the validation threshold. *CV-selected model.</w:t>
       </w:r>
     </w:p>
     <w:tbl>
@@ -921,7 +921,7 @@
                 <w:b/>
                 <w:sz w:val="19"/>
               </w:rPr>
-              <w:t>Default F1</w:t>
+              <w:t>Native F1</w:t>
             </w:r>
           </w:p>
         </w:tc>
@@ -3131,7 +3131,7 @@
     </w:p>
     <w:p>
       <w:r>
-        <w:t>Training CV selects word/gentle LinearSVC (C = 1, balanced class weights, vocabulary limit 5,000). At threshold -0.08620419778818611, test precision is 0.9683 and recall is 0.9385. The confusion counts are TN = 900, FP = 4, FN = 8 and TP = 122. Accuracy is 0.9884, ROC-AUC is 0.9957 and average precision is 0.9817. Native default predictions yield three false positives and ten false negatives, so tuning exchanges one additional false positive for two fewer missed spam messages.</w:t>
+        <w:t>Training CV selects word/gentle LinearSVC, model ID linear_svc_word_gentle (C = 1, balanced class weights, vocabulary limit 5,000). This remains the default model in the local demo. At threshold -0.08620419778818611, test precision is 0.9683 and recall is 0.9385. The confusion counts are TN = 900, FP = 4, FN = 8 and TP = 122. Accuracy is 0.9884, ROC-AUC is 0.9957 and average precision is 0.9817. Native default predictions yield three false positives and ten false negatives, so tuning exchanges one additional false positive for two fewer missed spam messages.</w:t>
       </w:r>
     </w:p>
     <w:p>
@@ -4562,7 +4562,7 @@
     </w:p>
     <w:p>
       <w:r>
-        <w:t>The IMC sample has no legitimate messages. Section 11 adds two-class follow-up evidence, with limited ham coverage. Representative modern ham, reliable source/date annotations and new final data remain necessary for further development. Deployment also requires measurements of latency, memory, privacy behavior and false-positive cost; sparse features alone do not establish on-device suitability.</w:t>
+        <w:t>The IMC sample has no legitimate messages. Sections 11 and 12 add two-class evidence, with narrow or shared-source coverage. Those completed studies do not establish performance on a representative modern inbox. Neither operational deployment nor on-device suitability was evaluated.</w:t>
       </w:r>
     </w:p>
     <w:p>
@@ -5654,7 +5654,7 @@
     </w:p>
     <w:p>
       <w:r>
-        <w:t>We refit six LinearSVC pipelines: word 1–2 grams, character 3–5 grams and their union, each with C=0.5 or 1. Class totals are equally weighted, then sources and campaigns within each class. Validation maximizes mean source recall subject to FPR &lt;=1% separately on historical and financial ham. It selects word plus character features, C=1 and threshold 0.64907808395485. No refit or tuning follows test inspection.</w:t>
+        <w:t>We refit six LinearSVC pipelines: word 1–2 grams, character 3–5 grams and their union, each with C=0.5 or 1. Class totals are equally weighted, then sources and campaigns within each class. Validation maximizes mean source recall subject to FPR &lt;=1% separately on historical and financial ham. It selects word plus character features, C=1 and threshold 0.64907808395485. This candidate and its reported results remain frozen. The SMS-history holdout is independent for this comparison; section 12 explicitly reuses it for development.</w:t>
       </w:r>
     </w:p>
     <w:p>
@@ -6664,7 +6664,7 @@
         <w:pStyle w:val="Heading1"/>
       </w:pPr>
       <w:r>
-        <w:t>12 Expanding ordinary SMS to reduce false positives</w:t>
+        <w:t>12 Ordinary SMS expansion study</w:t>
       </w:r>
     </w:p>
     <w:p>
@@ -7699,12 +7699,12 @@
     </w:p>
     <w:p>
       <w:r>
-        <w:t>Separate verification scripts reconstruct external scores and independently check adaptation thresholds, metrics and paired intervals without fitting. The first adaptation records 18,204 validation and 1,664 test scores. The ham expansion records 59,101 validation and 33,148 test scores, including the threshold-only control and three 5,000-draw comparisons. The source audits, frozen rules and reproduction commands are documented in docs/MODERN_ADAPTATION.md and docs/HAM_EXPANSION.md.</w:t>
+        <w:t>Separate verification scripts reconstruct external scores and independently check adaptation thresholds, metrics and paired intervals without fitting. Source audits, frozen selection rules, complete ledgers and reproduction commands are retained in docs/EXTERNAL_EVALUATION.md, docs/MODERN_ADAPTATION.md and docs/HAM_EXPANSION.md. The notebook reads these saved reports without training.</w:t>
       </w:r>
     </w:p>
     <w:p>
       <w:r>
-        <w:t>The word model has high historical F1 but limited source transfer. Broader training improves spam recall; the latest FPR decrease remains statistically uncertain and FPR exceeds the chosen limit. Neither adaptation replaces the default. Further evaluation needs dated ordinary SMS from an unseen provider, with consent context and a new untouched test. Inspected holdouts cannot support another independent claim after tuning.</w:t>
+        <w:t>The original word model remains the default: it has high historical F1 but limited source transfer. Both adaptations improve spam recall in their reported comparisons and fail the criteria for replacing it. The latest FPR decrease remains statistically uncertain, and the candidate's FPR exceeds the chosen limit. The project retains these completed studies as evidence of the model's limits, with all reported results frozen. Inspected holdouts cannot support another independent claim after tuning on them.</w:t>
       </w:r>
     </w:p>
     <w:p>

</xml_diff>